<commit_message>
IEEE raporunu (YAE_IEEE_Report_updated) uctan uca debug bulgulariyla guncelle
Abstract, Section X (Verification), Section XI (Open Issues) ve
Section XII (Conclusion) bugunku 4 bug bulgusuna gore guncellendi:
dbuf.sv veri kaybi, uram_pingpong_controller retry eksikligi,
mod_a_input_arbiter deadlock, softmax pipe_busy. Acik kalan softmax
per-row normalizasyon sorunu ayri madde olarak eklendi. PDF, Word COM
ile guncellenmis docx'ten yeniden uretildi.
</commit_message>
<xml_diff>
--- a/article/YAE_IEEE_Report_updated.docx
+++ b/article/YAE_IEEE_Report_updated.docx
@@ -399,874 +399,223 @@
           <w:i/>
           <w:iCs/>
         </w:rPr>
-        <w:t>Abstract</w:t>
-      </w:r>
-      <w:proofErr w:type="spellEnd"/>
-      <w:r>
-        <w:rPr>
-          <w:b/>
-          <w:bCs/>
-          <w:i/>
-          <w:iCs/>
-        </w:rPr>
-        <w:t xml:space="preserve">: </w:t>
-      </w:r>
-      <w:proofErr w:type="spellStart"/>
-      <w:r>
-        <w:t>This</w:t>
-      </w:r>
-      <w:proofErr w:type="spellEnd"/>
-      <w:r>
-        <w:t xml:space="preserve"> </w:t>
-      </w:r>
-      <w:proofErr w:type="spellStart"/>
-      <w:r>
-        <w:t>report</w:t>
-      </w:r>
-      <w:proofErr w:type="spellEnd"/>
-      <w:r>
-        <w:t xml:space="preserve"> </w:t>
-      </w:r>
-      <w:proofErr w:type="spellStart"/>
-      <w:r>
-        <w:t>presents</w:t>
-      </w:r>
-      <w:proofErr w:type="spellEnd"/>
-      <w:r>
-        <w:t xml:space="preserve"> </w:t>
-      </w:r>
-      <w:proofErr w:type="spellStart"/>
-      <w:r>
-        <w:t>the</w:t>
-      </w:r>
-      <w:proofErr w:type="spellEnd"/>
-      <w:r>
-        <w:t xml:space="preserve"> </w:t>
-      </w:r>
-      <w:proofErr w:type="spellStart"/>
-      <w:r>
-        <w:t>design</w:t>
-      </w:r>
-      <w:proofErr w:type="spellEnd"/>
-      <w:r>
-        <w:t xml:space="preserve"> of a </w:t>
-      </w:r>
-      <w:proofErr w:type="spellStart"/>
-      <w:r>
-        <w:t>SystemVerilog</w:t>
-      </w:r>
-      <w:proofErr w:type="spellEnd"/>
-      <w:r>
-        <w:t xml:space="preserve"> RTL </w:t>
-      </w:r>
-      <w:proofErr w:type="spellStart"/>
-      <w:r>
-        <w:t>accelerator</w:t>
-      </w:r>
-      <w:proofErr w:type="spellEnd"/>
-      <w:r>
-        <w:t xml:space="preserve"> </w:t>
-      </w:r>
-      <w:proofErr w:type="spellStart"/>
-      <w:r>
-        <w:t>that</w:t>
-      </w:r>
-      <w:proofErr w:type="spellEnd"/>
-      <w:r>
-        <w:t xml:space="preserve"> </w:t>
-      </w:r>
-      <w:proofErr w:type="spellStart"/>
-      <w:r>
-        <w:t>computes</w:t>
-      </w:r>
-      <w:proofErr w:type="spellEnd"/>
-      <w:r>
-        <w:t xml:space="preserve"> </w:t>
-      </w:r>
-      <w:proofErr w:type="spellStart"/>
-      <w:r>
-        <w:t>the</w:t>
-      </w:r>
-      <w:proofErr w:type="spellEnd"/>
-      <w:r>
-        <w:t xml:space="preserve"> self-</w:t>
-      </w:r>
-      <w:proofErr w:type="spellStart"/>
-      <w:r>
-        <w:t>attention</w:t>
-      </w:r>
-      <w:proofErr w:type="spellEnd"/>
-      <w:r>
-        <w:t xml:space="preserve"> </w:t>
-      </w:r>
-      <w:proofErr w:type="spellStart"/>
-      <w:r>
-        <w:t>block</w:t>
-      </w:r>
-      <w:proofErr w:type="spellEnd"/>
-      <w:r>
-        <w:t xml:space="preserve"> of </w:t>
-      </w:r>
-      <w:proofErr w:type="spellStart"/>
-      <w:r>
-        <w:t>transformer</w:t>
-      </w:r>
-      <w:proofErr w:type="spellEnd"/>
-      <w:r>
-        <w:t xml:space="preserve"> </w:t>
-      </w:r>
-      <w:proofErr w:type="spellStart"/>
-      <w:r>
-        <w:t>models</w:t>
-      </w:r>
-      <w:proofErr w:type="spellEnd"/>
-      <w:r>
-        <w:t xml:space="preserve"> in hardware. </w:t>
-      </w:r>
-      <w:proofErr w:type="spellStart"/>
-      <w:r>
-        <w:t>The</w:t>
-      </w:r>
-      <w:proofErr w:type="spellEnd"/>
-      <w:r>
-        <w:t xml:space="preserve"> </w:t>
-      </w:r>
-      <w:proofErr w:type="spellStart"/>
-      <w:r>
-        <w:t>core</w:t>
-      </w:r>
-      <w:proofErr w:type="spellEnd"/>
-      <w:r>
-        <w:t xml:space="preserve"> </w:t>
-      </w:r>
-      <w:proofErr w:type="spellStart"/>
-      <w:r>
-        <w:t>implements</w:t>
-      </w:r>
-      <w:proofErr w:type="spellEnd"/>
-      <w:r>
-        <w:t xml:space="preserve"> a </w:t>
-      </w:r>
-      <w:proofErr w:type="spellStart"/>
-      <w:r>
-        <w:t>streaming</w:t>
-      </w:r>
-      <w:proofErr w:type="spellEnd"/>
-      <w:r>
-        <w:t>, AXI-</w:t>
-      </w:r>
-      <w:proofErr w:type="spellStart"/>
-      <w:r>
-        <w:t>Stream</w:t>
-      </w:r>
-      <w:proofErr w:type="spellEnd"/>
-      <w:r>
-        <w:t>-</w:t>
-      </w:r>
-      <w:proofErr w:type="spellStart"/>
-      <w:r>
-        <w:t>based</w:t>
-      </w:r>
-      <w:proofErr w:type="spellEnd"/>
-      <w:r>
-        <w:t xml:space="preserve"> </w:t>
-      </w:r>
-      <w:proofErr w:type="spellStart"/>
-      <w:r>
-        <w:t>datapath</w:t>
-      </w:r>
-      <w:proofErr w:type="spellEnd"/>
-      <w:r>
-        <w:t xml:space="preserve"> in bfloat16 (BF16) </w:t>
-      </w:r>
-      <w:proofErr w:type="spellStart"/>
-      <w:r>
-        <w:t>arithmetic</w:t>
-      </w:r>
-      <w:proofErr w:type="spellEnd"/>
-      <w:r>
-        <w:t xml:space="preserve">, </w:t>
-      </w:r>
-      <w:proofErr w:type="spellStart"/>
-      <w:r>
-        <w:t>and</w:t>
-      </w:r>
-      <w:proofErr w:type="spellEnd"/>
-      <w:r>
-        <w:t xml:space="preserve"> </w:t>
-      </w:r>
-      <w:proofErr w:type="spellStart"/>
-      <w:r>
-        <w:t>integrates</w:t>
-      </w:r>
-      <w:proofErr w:type="spellEnd"/>
-      <w:r>
-        <w:t xml:space="preserve"> </w:t>
-      </w:r>
-      <w:proofErr w:type="spellStart"/>
-      <w:r>
-        <w:t>Rotary</w:t>
-      </w:r>
-      <w:proofErr w:type="spellEnd"/>
-      <w:r>
-        <w:t xml:space="preserve"> </w:t>
-      </w:r>
-      <w:proofErr w:type="spellStart"/>
-      <w:r>
-        <w:t>Positional</w:t>
-      </w:r>
-      <w:proofErr w:type="spellEnd"/>
-      <w:r>
-        <w:t xml:space="preserve"> </w:t>
-      </w:r>
-      <w:proofErr w:type="spellStart"/>
-      <w:r>
-        <w:t>Encoding</w:t>
-      </w:r>
-      <w:proofErr w:type="spellEnd"/>
-      <w:r>
-        <w:t xml:space="preserve"> (</w:t>
-      </w:r>
-      <w:proofErr w:type="spellStart"/>
-      <w:r>
-        <w:t>RoPE</w:t>
-      </w:r>
-      <w:proofErr w:type="spellEnd"/>
-      <w:r>
-        <w:t xml:space="preserve">), </w:t>
-      </w:r>
-      <w:proofErr w:type="spellStart"/>
-      <w:r>
-        <w:t>Grouped</w:t>
-      </w:r>
-      <w:proofErr w:type="spellEnd"/>
-      <w:r>
-        <w:t xml:space="preserve"> Query </w:t>
-      </w:r>
-      <w:proofErr w:type="spellStart"/>
-      <w:r>
-        <w:t>Attention</w:t>
-      </w:r>
-      <w:proofErr w:type="spellEnd"/>
-      <w:r>
-        <w:t xml:space="preserve"> (GQA), </w:t>
-      </w:r>
-      <w:proofErr w:type="spellStart"/>
-      <w:r>
-        <w:t>and</w:t>
-      </w:r>
-      <w:proofErr w:type="spellEnd"/>
-      <w:r>
-        <w:t xml:space="preserve"> a time-</w:t>
-      </w:r>
-      <w:proofErr w:type="spellStart"/>
-      <w:r>
-        <w:t>shared</w:t>
-      </w:r>
-      <w:proofErr w:type="spellEnd"/>
-      <w:r>
-        <w:t xml:space="preserve"> </w:t>
-      </w:r>
-      <w:proofErr w:type="spellStart"/>
-      <w:r>
-        <w:t>systolic</w:t>
-      </w:r>
-      <w:proofErr w:type="spellEnd"/>
-      <w:r>
-        <w:t xml:space="preserve"> </w:t>
-      </w:r>
-      <w:proofErr w:type="spellStart"/>
-      <w:r>
-        <w:t>processing</w:t>
-      </w:r>
-      <w:proofErr w:type="spellEnd"/>
-      <w:r>
-        <w:t xml:space="preserve">-element (PE) </w:t>
-      </w:r>
-      <w:proofErr w:type="spellStart"/>
-      <w:r>
-        <w:t>array</w:t>
-      </w:r>
-      <w:proofErr w:type="spellEnd"/>
-      <w:r>
-        <w:t xml:space="preserve"> </w:t>
-      </w:r>
-      <w:proofErr w:type="spellStart"/>
-      <w:r>
-        <w:t>that</w:t>
-      </w:r>
-      <w:proofErr w:type="spellEnd"/>
-      <w:r>
-        <w:t xml:space="preserve"> </w:t>
-      </w:r>
-      <w:proofErr w:type="spellStart"/>
-      <w:r>
-        <w:t>performs</w:t>
-      </w:r>
-      <w:proofErr w:type="spellEnd"/>
-      <w:r>
-        <w:t xml:space="preserve"> </w:t>
-      </w:r>
-      <w:proofErr w:type="spellStart"/>
-      <w:r>
-        <w:t>both</w:t>
-      </w:r>
-      <w:proofErr w:type="spellEnd"/>
-      <w:r>
-        <w:t xml:space="preserve"> </w:t>
-      </w:r>
-      <w:proofErr w:type="spellStart"/>
-      <w:r>
-        <w:t>the</w:t>
-      </w:r>
-      <w:proofErr w:type="spellEnd"/>
-      <w:r>
-        <w:t xml:space="preserve"> Q·Kᵀ </w:t>
-      </w:r>
-      <w:proofErr w:type="spellStart"/>
-      <w:r>
-        <w:t>similarity</w:t>
-      </w:r>
-      <w:proofErr w:type="spellEnd"/>
-      <w:r>
-        <w:t xml:space="preserve"> </w:t>
-      </w:r>
-      <w:proofErr w:type="spellStart"/>
-      <w:r>
-        <w:t>computation</w:t>
-      </w:r>
-      <w:proofErr w:type="spellEnd"/>
-      <w:r>
-        <w:t xml:space="preserve"> </w:t>
-      </w:r>
-      <w:proofErr w:type="spellStart"/>
-      <w:r>
-        <w:t>and</w:t>
-      </w:r>
-      <w:proofErr w:type="spellEnd"/>
-      <w:r>
-        <w:t xml:space="preserve"> </w:t>
-      </w:r>
-      <w:proofErr w:type="spellStart"/>
-      <w:r>
-        <w:t>the</w:t>
-      </w:r>
-      <w:proofErr w:type="spellEnd"/>
-      <w:r>
-        <w:t xml:space="preserve"> </w:t>
-      </w:r>
-      <w:proofErr w:type="spellStart"/>
-      <w:r>
-        <w:t>score·V</w:t>
-      </w:r>
-      <w:proofErr w:type="spellEnd"/>
-      <w:r>
-        <w:t xml:space="preserve"> </w:t>
-      </w:r>
-      <w:proofErr w:type="spellStart"/>
-      <w:r>
-        <w:t>reduction</w:t>
-      </w:r>
-      <w:proofErr w:type="spellEnd"/>
-      <w:r>
-        <w:t xml:space="preserve"> on </w:t>
-      </w:r>
-      <w:proofErr w:type="spellStart"/>
-      <w:r>
-        <w:t>the</w:t>
-      </w:r>
-      <w:proofErr w:type="spellEnd"/>
-      <w:r>
-        <w:t xml:space="preserve"> </w:t>
-      </w:r>
-      <w:proofErr w:type="spellStart"/>
-      <w:r>
-        <w:t>same</w:t>
-      </w:r>
-      <w:proofErr w:type="spellEnd"/>
-      <w:r>
-        <w:t xml:space="preserve"> </w:t>
-      </w:r>
-      <w:proofErr w:type="spellStart"/>
-      <w:r>
-        <w:t>physical</w:t>
-      </w:r>
-      <w:proofErr w:type="spellEnd"/>
-      <w:r>
-        <w:t xml:space="preserve"> hardware. Resource </w:t>
-      </w:r>
-      <w:proofErr w:type="spellStart"/>
-      <w:r>
-        <w:t>efficiency</w:t>
-      </w:r>
-      <w:proofErr w:type="spellEnd"/>
-      <w:r>
-        <w:t xml:space="preserve"> is </w:t>
-      </w:r>
-      <w:proofErr w:type="spellStart"/>
-      <w:r>
-        <w:t>achieved</w:t>
-      </w:r>
-      <w:proofErr w:type="spellEnd"/>
-      <w:r>
-        <w:t xml:space="preserve"> </w:t>
-      </w:r>
-      <w:proofErr w:type="spellStart"/>
-      <w:r>
-        <w:t>through</w:t>
-      </w:r>
-      <w:proofErr w:type="spellEnd"/>
-      <w:r>
-        <w:t xml:space="preserve"> </w:t>
-      </w:r>
-      <w:proofErr w:type="spellStart"/>
-      <w:r>
-        <w:t>ping-pong</w:t>
-      </w:r>
-      <w:proofErr w:type="spellEnd"/>
-      <w:r>
-        <w:t xml:space="preserve"> </w:t>
-      </w:r>
-      <w:proofErr w:type="spellStart"/>
-      <w:r>
-        <w:t>double</w:t>
-      </w:r>
-      <w:proofErr w:type="spellEnd"/>
-      <w:r>
-        <w:t xml:space="preserve"> </w:t>
-      </w:r>
-      <w:proofErr w:type="spellStart"/>
-      <w:r>
-        <w:t>buffering</w:t>
-      </w:r>
-      <w:proofErr w:type="spellEnd"/>
-      <w:r>
-        <w:t xml:space="preserve">, </w:t>
-      </w:r>
-      <w:proofErr w:type="spellStart"/>
-      <w:r>
-        <w:t>valid</w:t>
-      </w:r>
-      <w:proofErr w:type="spellEnd"/>
-      <w:r>
-        <w:t>/</w:t>
-      </w:r>
-      <w:proofErr w:type="spellStart"/>
-      <w:r>
-        <w:t>ready</w:t>
-      </w:r>
-      <w:proofErr w:type="spellEnd"/>
-      <w:r>
-        <w:t xml:space="preserve"> </w:t>
-      </w:r>
-      <w:proofErr w:type="spellStart"/>
-      <w:r>
-        <w:t>handshaking</w:t>
-      </w:r>
-      <w:proofErr w:type="spellEnd"/>
-      <w:r>
-        <w:t xml:space="preserve"> </w:t>
-      </w:r>
-      <w:proofErr w:type="spellStart"/>
-      <w:r>
-        <w:t>throughout</w:t>
-      </w:r>
-      <w:proofErr w:type="spellEnd"/>
-      <w:r>
-        <w:t xml:space="preserve">, </w:t>
-      </w:r>
-      <w:proofErr w:type="spellStart"/>
-      <w:r>
-        <w:t>and</w:t>
-      </w:r>
-      <w:proofErr w:type="spellEnd"/>
-      <w:r>
-        <w:t xml:space="preserve"> </w:t>
-      </w:r>
-      <w:proofErr w:type="spellStart"/>
-      <w:r>
-        <w:t>arbitrated</w:t>
-      </w:r>
-      <w:proofErr w:type="spellEnd"/>
-      <w:r>
-        <w:t xml:space="preserve"> </w:t>
-      </w:r>
-      <w:proofErr w:type="spellStart"/>
-      <w:r>
-        <w:t>sharing</w:t>
-      </w:r>
-      <w:proofErr w:type="spellEnd"/>
-      <w:r>
-        <w:t xml:space="preserve"> of </w:t>
-      </w:r>
-      <w:proofErr w:type="spellStart"/>
-      <w:r>
-        <w:t>the</w:t>
-      </w:r>
-      <w:proofErr w:type="spellEnd"/>
-      <w:r>
-        <w:t xml:space="preserve"> </w:t>
-      </w:r>
-      <w:proofErr w:type="spellStart"/>
-      <w:r>
-        <w:t>most</w:t>
-      </w:r>
-      <w:proofErr w:type="spellEnd"/>
-      <w:r>
-        <w:t xml:space="preserve"> </w:t>
-      </w:r>
-      <w:proofErr w:type="spellStart"/>
-      <w:r>
-        <w:t>expensive</w:t>
-      </w:r>
-      <w:proofErr w:type="spellEnd"/>
-      <w:r>
-        <w:t xml:space="preserve"> </w:t>
-      </w:r>
-      <w:proofErr w:type="spellStart"/>
-      <w:r>
-        <w:t>multiply-accumulate</w:t>
-      </w:r>
-      <w:proofErr w:type="spellEnd"/>
-      <w:r>
-        <w:t xml:space="preserve"> (MAC) </w:t>
-      </w:r>
-      <w:proofErr w:type="spellStart"/>
-      <w:r>
-        <w:t>resource</w:t>
-      </w:r>
-      <w:proofErr w:type="spellEnd"/>
-      <w:r>
-        <w:t xml:space="preserve">. </w:t>
-      </w:r>
-      <w:proofErr w:type="spellStart"/>
-      <w:r>
-        <w:t>The</w:t>
-      </w:r>
-      <w:proofErr w:type="spellEnd"/>
-      <w:r>
-        <w:t xml:space="preserve"> </w:t>
-      </w:r>
-      <w:proofErr w:type="spellStart"/>
-      <w:r>
-        <w:t>design</w:t>
-      </w:r>
-      <w:proofErr w:type="spellEnd"/>
-      <w:r>
-        <w:t xml:space="preserve"> </w:t>
-      </w:r>
-      <w:proofErr w:type="spellStart"/>
-      <w:r>
-        <w:t>comprises</w:t>
-      </w:r>
-      <w:proofErr w:type="spellEnd"/>
-      <w:r>
-        <w:t xml:space="preserve"> </w:t>
-      </w:r>
-      <w:proofErr w:type="spellStart"/>
-      <w:r>
-        <w:t>more</w:t>
-      </w:r>
-      <w:proofErr w:type="spellEnd"/>
-      <w:r>
-        <w:t xml:space="preserve"> </w:t>
-      </w:r>
-      <w:proofErr w:type="spellStart"/>
-      <w:r>
-        <w:t>than</w:t>
-      </w:r>
-      <w:proofErr w:type="spellEnd"/>
-      <w:r>
-        <w:t xml:space="preserve"> </w:t>
-      </w:r>
-      <w:proofErr w:type="spellStart"/>
-      <w:r>
-        <w:t>fifteen</w:t>
-      </w:r>
-      <w:proofErr w:type="spellEnd"/>
-      <w:r>
-        <w:t xml:space="preserve"> RTL </w:t>
-      </w:r>
-      <w:proofErr w:type="spellStart"/>
-      <w:r>
-        <w:t>modules</w:t>
-      </w:r>
-      <w:proofErr w:type="spellEnd"/>
-      <w:r>
-        <w:t xml:space="preserve">, </w:t>
-      </w:r>
-      <w:proofErr w:type="spellStart"/>
-      <w:r>
-        <w:t>each</w:t>
-      </w:r>
-      <w:proofErr w:type="spellEnd"/>
-      <w:r>
-        <w:t xml:space="preserve"> </w:t>
-      </w:r>
-      <w:proofErr w:type="spellStart"/>
-      <w:r>
-        <w:t>validated</w:t>
-      </w:r>
-      <w:proofErr w:type="spellEnd"/>
-      <w:r>
-        <w:t xml:space="preserve"> </w:t>
-      </w:r>
-      <w:proofErr w:type="spellStart"/>
-      <w:r>
-        <w:t>by</w:t>
-      </w:r>
-      <w:proofErr w:type="spellEnd"/>
-      <w:r>
-        <w:t xml:space="preserve"> a </w:t>
-      </w:r>
-      <w:proofErr w:type="spellStart"/>
-      <w:r>
-        <w:t>standalone</w:t>
-      </w:r>
-      <w:proofErr w:type="spellEnd"/>
-      <w:r>
-        <w:t>, self-</w:t>
-      </w:r>
-      <w:proofErr w:type="spellStart"/>
-      <w:r>
-        <w:t>checking</w:t>
-      </w:r>
-      <w:proofErr w:type="spellEnd"/>
-      <w:r>
-        <w:t xml:space="preserve"> </w:t>
-      </w:r>
-      <w:proofErr w:type="spellStart"/>
-      <w:r>
-        <w:t>testbench</w:t>
-      </w:r>
-      <w:proofErr w:type="spellEnd"/>
-      <w:r>
-        <w:t xml:space="preserve">. </w:t>
-      </w:r>
-      <w:proofErr w:type="spellStart"/>
-      <w:r>
-        <w:t>All</w:t>
-      </w:r>
-      <w:proofErr w:type="spellEnd"/>
-      <w:r>
-        <w:t xml:space="preserve"> seven </w:t>
-      </w:r>
-      <w:proofErr w:type="spellStart"/>
-      <w:r>
-        <w:t>testbenches</w:t>
-      </w:r>
-      <w:proofErr w:type="spellEnd"/>
-      <w:r>
-        <w:t xml:space="preserve"> </w:t>
-      </w:r>
-      <w:proofErr w:type="spellStart"/>
-      <w:r>
-        <w:t>pass</w:t>
-      </w:r>
-      <w:proofErr w:type="spellEnd"/>
-      <w:r>
-        <w:t xml:space="preserve">, </w:t>
-      </w:r>
-      <w:proofErr w:type="spellStart"/>
-      <w:r>
-        <w:t>and</w:t>
-      </w:r>
-      <w:proofErr w:type="spellEnd"/>
-      <w:r>
-        <w:t xml:space="preserve"> post-</w:t>
-      </w:r>
-      <w:proofErr w:type="spellStart"/>
-      <w:r>
-        <w:t>implementation</w:t>
-      </w:r>
-      <w:proofErr w:type="spellEnd"/>
-      <w:r>
-        <w:t xml:space="preserve"> </w:t>
-      </w:r>
-      <w:proofErr w:type="spellStart"/>
-      <w:r>
-        <w:t>synthesis</w:t>
-      </w:r>
-      <w:proofErr w:type="spellEnd"/>
-      <w:r>
-        <w:t xml:space="preserve"> on a </w:t>
-      </w:r>
-      <w:proofErr w:type="spellStart"/>
-      <w:r>
-        <w:t>Xilinx</w:t>
-      </w:r>
-      <w:proofErr w:type="spellEnd"/>
-      <w:r>
-        <w:t xml:space="preserve"> Artix-7 </w:t>
-      </w:r>
-      <w:proofErr w:type="spellStart"/>
-      <w:r>
-        <w:t>device</w:t>
-      </w:r>
-      <w:proofErr w:type="spellEnd"/>
-      <w:r>
-        <w:t xml:space="preserve"> </w:t>
-      </w:r>
-      <w:proofErr w:type="spellStart"/>
-      <w:r>
-        <w:t>measures</w:t>
-      </w:r>
-      <w:proofErr w:type="spellEnd"/>
-      <w:r>
-        <w:t xml:space="preserve"> 1,486 </w:t>
-      </w:r>
-      <w:proofErr w:type="spellStart"/>
-      <w:r>
-        <w:t>LUTs</w:t>
-      </w:r>
-      <w:proofErr w:type="spellEnd"/>
-      <w:r>
-        <w:t xml:space="preserve">, 510 </w:t>
-      </w:r>
-      <w:proofErr w:type="spellStart"/>
-      <w:r>
-        <w:t>flip-flops</w:t>
-      </w:r>
-      <w:proofErr w:type="spellEnd"/>
-      <w:r>
-        <w:t xml:space="preserve">, </w:t>
-      </w:r>
-      <w:proofErr w:type="spellStart"/>
-      <w:r>
-        <w:t>and</w:t>
-      </w:r>
-      <w:proofErr w:type="spellEnd"/>
-      <w:r>
-        <w:t xml:space="preserve"> </w:t>
-      </w:r>
-      <w:proofErr w:type="spellStart"/>
-      <w:r>
-        <w:t>zero</w:t>
-      </w:r>
-      <w:proofErr w:type="spellEnd"/>
-      <w:r>
-        <w:t xml:space="preserve"> DSP </w:t>
-      </w:r>
-      <w:proofErr w:type="spellStart"/>
-      <w:r>
-        <w:t>or</w:t>
-      </w:r>
-      <w:proofErr w:type="spellEnd"/>
-      <w:r>
-        <w:t xml:space="preserve"> </w:t>
-      </w:r>
-      <w:proofErr w:type="spellStart"/>
-      <w:r>
-        <w:t>Block</w:t>
-      </w:r>
-      <w:proofErr w:type="spellEnd"/>
-      <w:r>
-        <w:t xml:space="preserve"> RAM </w:t>
-      </w:r>
-      <w:proofErr w:type="spellStart"/>
-      <w:r>
-        <w:t>usage</w:t>
-      </w:r>
-      <w:proofErr w:type="spellEnd"/>
-      <w:r>
-        <w:t xml:space="preserve">. </w:t>
-      </w:r>
-      <w:proofErr w:type="spellStart"/>
-      <w:r>
-        <w:t>Remaining</w:t>
-      </w:r>
-      <w:proofErr w:type="spellEnd"/>
-      <w:r>
-        <w:t xml:space="preserve"> </w:t>
-      </w:r>
-      <w:proofErr w:type="spellStart"/>
-      <w:r>
-        <w:t>work</w:t>
-      </w:r>
-      <w:proofErr w:type="spellEnd"/>
-      <w:r>
-        <w:t xml:space="preserve"> is a golden-model </w:t>
-      </w:r>
-      <w:proofErr w:type="spellStart"/>
-      <w:r>
-        <w:t>numerical</w:t>
-      </w:r>
-      <w:proofErr w:type="spellEnd"/>
-      <w:r>
-        <w:t xml:space="preserve"> </w:t>
-      </w:r>
-      <w:proofErr w:type="spellStart"/>
-      <w:r>
-        <w:t>cross-check</w:t>
-      </w:r>
-      <w:proofErr w:type="spellEnd"/>
-      <w:r>
-        <w:t xml:space="preserve"> of </w:t>
-      </w:r>
-      <w:proofErr w:type="spellStart"/>
-      <w:r>
-        <w:t>RoPE</w:t>
-      </w:r>
-      <w:proofErr w:type="spellEnd"/>
-      <w:r>
-        <w:t xml:space="preserve">, a </w:t>
-      </w:r>
-      <w:proofErr w:type="spellStart"/>
-      <w:r>
-        <w:t>weight-loading</w:t>
-      </w:r>
-      <w:proofErr w:type="spellEnd"/>
-      <w:r>
-        <w:t xml:space="preserve"> </w:t>
-      </w:r>
-      <w:proofErr w:type="spellStart"/>
-      <w:r>
-        <w:t>handshake</w:t>
-      </w:r>
-      <w:proofErr w:type="spellEnd"/>
-      <w:r>
-        <w:t xml:space="preserve">, </w:t>
-      </w:r>
-      <w:proofErr w:type="spellStart"/>
-      <w:r>
-        <w:t>and</w:t>
-      </w:r>
-      <w:proofErr w:type="spellEnd"/>
-      <w:r>
-        <w:t xml:space="preserve"> </w:t>
-      </w:r>
-      <w:proofErr w:type="spellStart"/>
-      <w:r>
-        <w:t>full</w:t>
-      </w:r>
-      <w:proofErr w:type="spellEnd"/>
-      <w:r>
-        <w:t xml:space="preserve"> </w:t>
-      </w:r>
-      <w:proofErr w:type="spellStart"/>
-      <w:r>
-        <w:t>end-to-end</w:t>
-      </w:r>
-      <w:proofErr w:type="spellEnd"/>
-      <w:r>
-        <w:t xml:space="preserve"> (top-</w:t>
-      </w:r>
-      <w:proofErr w:type="spellStart"/>
-      <w:r>
-        <w:t>level</w:t>
-      </w:r>
-      <w:proofErr w:type="spellEnd"/>
-      <w:r>
-        <w:t xml:space="preserve">) </w:t>
-      </w:r>
-      <w:proofErr w:type="spellStart"/>
-      <w:r>
-        <w:t>simulation</w:t>
-      </w:r>
-      <w:proofErr w:type="spellEnd"/>
-      <w:r>
-        <w:t>.</w:t>
-      </w:r>
+        <w:t>Abstract: This report presents the design of a SystemVerilog RTL accelerator that computes the self-attention block of transformer models in hardware. The core implements a streaming, AXI-Stream-based datapath in bfloat16 (BF16) arithmetic, and integrates Rotary Positional Encoding (RoPE), Grouped Query Attention (GQA), and a time-shared systolic processing-element (PE) array that performs both the Q·Kᵀ similarity computation and the score·V reduction on the same physical hardware. Resource efficiency is achieved through ping-pong double buffering, valid/ready handshaking throughout, and arbitrated sharing of the most expensive multiply-accumulate (MAC) resource. The design comprises more than fifteen RTL modules, each validated by a standalone, self-checking testbench. All seven testbenches pass, and post-implementation synthesis on a Xilinx Artix-7 device measures 1,486 LUTs, 510 flip-flops, and zero DSP or Block RAM usage. A full end-to-end, top-level simulation of the assembled pipeline has since been run to completion without hanging or losing data, after four additional integration bugs surfaced and were fixed. Remaining work is a golden-model numerical cross-check of RoPE, a weight-loading handshake, and correcting softmax's row-normalization boundary, currently computed once per full score tile rather than once per row.</w:t>
+      </w:r>
+      <w:proofErr w:type="spellEnd"/>
+      <w:proofErr w:type="spellStart"/>
+      <w:proofErr w:type="spellEnd"/>
+      <w:proofErr w:type="spellStart"/>
+      <w:proofErr w:type="spellEnd"/>
+      <w:proofErr w:type="spellStart"/>
+      <w:proofErr w:type="spellEnd"/>
+      <w:proofErr w:type="spellStart"/>
+      <w:proofErr w:type="spellEnd"/>
+      <w:proofErr w:type="spellStart"/>
+      <w:proofErr w:type="spellEnd"/>
+      <w:proofErr w:type="spellStart"/>
+      <w:proofErr w:type="spellEnd"/>
+      <w:proofErr w:type="spellStart"/>
+      <w:proofErr w:type="spellEnd"/>
+      <w:proofErr w:type="spellStart"/>
+      <w:proofErr w:type="spellEnd"/>
+      <w:proofErr w:type="spellStart"/>
+      <w:proofErr w:type="spellEnd"/>
+      <w:proofErr w:type="spellStart"/>
+      <w:proofErr w:type="spellEnd"/>
+      <w:proofErr w:type="spellStart"/>
+      <w:proofErr w:type="spellEnd"/>
+      <w:proofErr w:type="spellStart"/>
+      <w:proofErr w:type="spellEnd"/>
+      <w:proofErr w:type="spellStart"/>
+      <w:proofErr w:type="spellEnd"/>
+      <w:proofErr w:type="spellStart"/>
+      <w:proofErr w:type="spellEnd"/>
+      <w:proofErr w:type="spellStart"/>
+      <w:proofErr w:type="spellEnd"/>
+      <w:proofErr w:type="spellStart"/>
+      <w:proofErr w:type="spellEnd"/>
+      <w:proofErr w:type="spellStart"/>
+      <w:proofErr w:type="spellEnd"/>
+      <w:proofErr w:type="spellStart"/>
+      <w:proofErr w:type="spellEnd"/>
+      <w:proofErr w:type="spellStart"/>
+      <w:proofErr w:type="spellEnd"/>
+      <w:proofErr w:type="spellStart"/>
+      <w:proofErr w:type="spellEnd"/>
+      <w:proofErr w:type="spellStart"/>
+      <w:proofErr w:type="spellEnd"/>
+      <w:proofErr w:type="spellStart"/>
+      <w:proofErr w:type="spellEnd"/>
+      <w:proofErr w:type="spellStart"/>
+      <w:proofErr w:type="spellEnd"/>
+      <w:proofErr w:type="spellStart"/>
+      <w:proofErr w:type="spellEnd"/>
+      <w:proofErr w:type="spellStart"/>
+      <w:proofErr w:type="spellEnd"/>
+      <w:proofErr w:type="spellStart"/>
+      <w:proofErr w:type="spellEnd"/>
+      <w:proofErr w:type="spellStart"/>
+      <w:proofErr w:type="spellEnd"/>
+      <w:proofErr w:type="spellStart"/>
+      <w:proofErr w:type="spellEnd"/>
+      <w:proofErr w:type="spellStart"/>
+      <w:proofErr w:type="spellEnd"/>
+      <w:proofErr w:type="spellStart"/>
+      <w:proofErr w:type="spellEnd"/>
+      <w:proofErr w:type="spellStart"/>
+      <w:proofErr w:type="spellEnd"/>
+      <w:proofErr w:type="spellStart"/>
+      <w:proofErr w:type="spellEnd"/>
+      <w:proofErr w:type="spellStart"/>
+      <w:proofErr w:type="spellEnd"/>
+      <w:proofErr w:type="spellStart"/>
+      <w:proofErr w:type="spellEnd"/>
+      <w:proofErr w:type="spellStart"/>
+      <w:proofErr w:type="spellEnd"/>
+      <w:proofErr w:type="spellStart"/>
+      <w:proofErr w:type="spellEnd"/>
+      <w:proofErr w:type="spellStart"/>
+      <w:proofErr w:type="spellEnd"/>
+      <w:proofErr w:type="spellStart"/>
+      <w:proofErr w:type="spellEnd"/>
+      <w:proofErr w:type="spellStart"/>
+      <w:proofErr w:type="spellEnd"/>
+      <w:proofErr w:type="spellStart"/>
+      <w:proofErr w:type="spellEnd"/>
+      <w:proofErr w:type="spellStart"/>
+      <w:proofErr w:type="spellEnd"/>
+      <w:proofErr w:type="spellStart"/>
+      <w:proofErr w:type="spellEnd"/>
+      <w:proofErr w:type="spellStart"/>
+      <w:proofErr w:type="spellEnd"/>
+      <w:proofErr w:type="spellStart"/>
+      <w:proofErr w:type="spellEnd"/>
+      <w:proofErr w:type="spellStart"/>
+      <w:proofErr w:type="spellEnd"/>
+      <w:proofErr w:type="spellStart"/>
+      <w:proofErr w:type="spellEnd"/>
+      <w:proofErr w:type="spellStart"/>
+      <w:proofErr w:type="spellEnd"/>
+      <w:proofErr w:type="spellStart"/>
+      <w:proofErr w:type="spellEnd"/>
+      <w:proofErr w:type="spellStart"/>
+      <w:proofErr w:type="spellEnd"/>
+      <w:proofErr w:type="spellStart"/>
+      <w:proofErr w:type="spellEnd"/>
+      <w:proofErr w:type="spellStart"/>
+      <w:proofErr w:type="spellEnd"/>
+      <w:proofErr w:type="spellStart"/>
+      <w:proofErr w:type="spellEnd"/>
+      <w:proofErr w:type="spellStart"/>
+      <w:proofErr w:type="spellEnd"/>
+      <w:proofErr w:type="spellStart"/>
+      <w:proofErr w:type="spellEnd"/>
+      <w:proofErr w:type="spellStart"/>
+      <w:proofErr w:type="spellEnd"/>
+      <w:proofErr w:type="spellStart"/>
+      <w:proofErr w:type="spellEnd"/>
+      <w:proofErr w:type="spellStart"/>
+      <w:proofErr w:type="spellEnd"/>
+      <w:proofErr w:type="spellStart"/>
+      <w:proofErr w:type="spellEnd"/>
+      <w:proofErr w:type="spellStart"/>
+      <w:proofErr w:type="spellEnd"/>
+      <w:proofErr w:type="spellStart"/>
+      <w:proofErr w:type="spellEnd"/>
+      <w:proofErr w:type="spellStart"/>
+      <w:proofErr w:type="spellEnd"/>
+      <w:proofErr w:type="spellStart"/>
+      <w:proofErr w:type="spellEnd"/>
+      <w:proofErr w:type="spellStart"/>
+      <w:proofErr w:type="spellEnd"/>
+      <w:proofErr w:type="spellStart"/>
+      <w:proofErr w:type="spellEnd"/>
+      <w:proofErr w:type="spellStart"/>
+      <w:proofErr w:type="spellEnd"/>
+      <w:proofErr w:type="spellStart"/>
+      <w:proofErr w:type="spellEnd"/>
+      <w:proofErr w:type="spellStart"/>
+      <w:proofErr w:type="spellEnd"/>
+      <w:proofErr w:type="spellStart"/>
+      <w:proofErr w:type="spellEnd"/>
+      <w:proofErr w:type="spellStart"/>
+      <w:proofErr w:type="spellEnd"/>
+      <w:proofErr w:type="spellStart"/>
+      <w:proofErr w:type="spellEnd"/>
+      <w:proofErr w:type="spellStart"/>
+      <w:proofErr w:type="spellEnd"/>
+      <w:proofErr w:type="spellStart"/>
+      <w:proofErr w:type="spellEnd"/>
+      <w:proofErr w:type="spellStart"/>
+      <w:proofErr w:type="spellEnd"/>
+      <w:proofErr w:type="spellStart"/>
+      <w:proofErr w:type="spellEnd"/>
+      <w:proofErr w:type="spellStart"/>
+      <w:proofErr w:type="spellEnd"/>
+      <w:proofErr w:type="spellStart"/>
+      <w:proofErr w:type="spellEnd"/>
+      <w:proofErr w:type="spellStart"/>
+      <w:proofErr w:type="spellEnd"/>
+      <w:proofErr w:type="spellStart"/>
+      <w:proofErr w:type="spellEnd"/>
+      <w:proofErr w:type="spellStart"/>
+      <w:proofErr w:type="spellEnd"/>
+      <w:proofErr w:type="spellStart"/>
+      <w:proofErr w:type="spellEnd"/>
+      <w:proofErr w:type="spellStart"/>
+      <w:proofErr w:type="spellEnd"/>
+      <w:proofErr w:type="spellStart"/>
+      <w:proofErr w:type="spellEnd"/>
+      <w:proofErr w:type="spellStart"/>
+      <w:proofErr w:type="spellEnd"/>
+      <w:proofErr w:type="spellStart"/>
+      <w:proofErr w:type="spellEnd"/>
+      <w:proofErr w:type="spellStart"/>
+      <w:proofErr w:type="spellEnd"/>
+      <w:proofErr w:type="spellStart"/>
+      <w:proofErr w:type="spellEnd"/>
+      <w:proofErr w:type="spellStart"/>
+      <w:proofErr w:type="spellEnd"/>
+      <w:proofErr w:type="spellStart"/>
+      <w:proofErr w:type="spellEnd"/>
+      <w:proofErr w:type="spellStart"/>
+      <w:proofErr w:type="spellEnd"/>
+      <w:proofErr w:type="spellStart"/>
+      <w:proofErr w:type="spellEnd"/>
+      <w:proofErr w:type="spellStart"/>
+      <w:proofErr w:type="spellEnd"/>
+      <w:proofErr w:type="spellStart"/>
+      <w:proofErr w:type="spellEnd"/>
+      <w:proofErr w:type="spellStart"/>
+      <w:proofErr w:type="spellEnd"/>
+      <w:proofErr w:type="spellStart"/>
+      <w:proofErr w:type="spellEnd"/>
+      <w:proofErr w:type="spellStart"/>
+      <w:proofErr w:type="spellEnd"/>
+      <w:proofErr w:type="spellStart"/>
+      <w:proofErr w:type="spellEnd"/>
+      <w:proofErr w:type="spellStart"/>
+      <w:proofErr w:type="spellEnd"/>
+      <w:proofErr w:type="spellStart"/>
+      <w:proofErr w:type="spellEnd"/>
+      <w:proofErr w:type="spellStart"/>
+      <w:proofErr w:type="spellEnd"/>
+      <w:proofErr w:type="spellStart"/>
+      <w:proofErr w:type="spellEnd"/>
+      <w:proofErr w:type="spellStart"/>
+      <w:proofErr w:type="spellEnd"/>
+      <w:proofErr w:type="spellStart"/>
+      <w:proofErr w:type="spellEnd"/>
+      <w:proofErr w:type="spellStart"/>
+      <w:proofErr w:type="spellEnd"/>
+      <w:proofErr w:type="spellStart"/>
+      <w:proofErr w:type="spellEnd"/>
+      <w:proofErr w:type="spellStart"/>
+      <w:proofErr w:type="spellEnd"/>
+      <w:proofErr w:type="spellStart"/>
+      <w:proofErr w:type="spellEnd"/>
+      <w:proofErr w:type="spellStart"/>
+      <w:proofErr w:type="spellEnd"/>
     </w:p>
     <w:p>
       <w:pPr>
@@ -10343,6 +9692,12 @@
       <w:proofErr w:type="spellEnd"/>
       <w:r>
         <w:t>.</w:t>
+      </w:r>
+    </w:p>
+    <w:p>
+      <w:pPr/>
+      <w:r>
+        <w:t>A subsequent full top-level simulation, driving four tokens through the assembled pipeline end to end rather than exercising each module in isolation, surfaced four further integration bugs no module-level testbench could reach. dbuf.sv discarded every packet's final element because its bank-swap condition and its data-write condition were mutually exclusive branches of the same if/else, even though both were true on the same cycle. The URAM read controller advanced past its last requested address without confirming that address's result had been accepted downstream, silently losing it under backpressure. An arbiter's readiness signal back to softmax was wired behind a register that only became valid after softmax had already produced an output, a circular dependency that left softmax unable to produce its first result. And softmax's normalization multiplier lacked the single-element-in-flight guard already applied to the scale/mask stage, letting a later result overwrite an unconsumed earlier one. With all four fixed, the assembled design runs the full token-in to softmax-out path to completion without hanging or losing data; per-row softmax normalization remains open (Section XI).</w:t>
       </w:r>
     </w:p>
     <w:p>
@@ -12952,135 +12307,47 @@
         <w:spacing w:after="40"/>
       </w:pPr>
       <w:r>
-        <w:t xml:space="preserve">No </w:t>
-      </w:r>
-      <w:proofErr w:type="spellStart"/>
-      <w:r>
-        <w:t>full</w:t>
-      </w:r>
-      <w:proofErr w:type="spellEnd"/>
-      <w:r>
-        <w:t xml:space="preserve"> </w:t>
-      </w:r>
-      <w:proofErr w:type="spellStart"/>
-      <w:r>
-        <w:t>end-to-end</w:t>
-      </w:r>
-      <w:proofErr w:type="spellEnd"/>
-      <w:r>
-        <w:t xml:space="preserve"> (top.sv) </w:t>
-      </w:r>
-      <w:proofErr w:type="spellStart"/>
-      <w:r>
-        <w:t>simulation</w:t>
-      </w:r>
-      <w:proofErr w:type="spellEnd"/>
-      <w:r>
-        <w:t xml:space="preserve"> has </w:t>
-      </w:r>
-      <w:proofErr w:type="spellStart"/>
-      <w:r>
-        <w:t>been</w:t>
-      </w:r>
-      <w:proofErr w:type="spellEnd"/>
-      <w:r>
-        <w:t xml:space="preserve"> </w:t>
-      </w:r>
-      <w:proofErr w:type="spellStart"/>
-      <w:r>
-        <w:t>run</w:t>
-      </w:r>
-      <w:proofErr w:type="spellEnd"/>
-      <w:r>
-        <w:t xml:space="preserve">. </w:t>
-      </w:r>
-      <w:proofErr w:type="spellStart"/>
-      <w:r>
-        <w:t>All</w:t>
-      </w:r>
-      <w:proofErr w:type="spellEnd"/>
-      <w:r>
-        <w:t xml:space="preserve"> </w:t>
-      </w:r>
-      <w:proofErr w:type="spellStart"/>
-      <w:r>
-        <w:t>module-level</w:t>
-      </w:r>
-      <w:proofErr w:type="spellEnd"/>
-      <w:r>
-        <w:t xml:space="preserve"> </w:t>
-      </w:r>
-      <w:proofErr w:type="spellStart"/>
-      <w:r>
-        <w:t>testbenches</w:t>
-      </w:r>
-      <w:proofErr w:type="spellEnd"/>
-      <w:r>
-        <w:t xml:space="preserve"> (</w:t>
-      </w:r>
-      <w:proofErr w:type="spellStart"/>
-      <w:r>
-        <w:t>Section</w:t>
-      </w:r>
-      <w:proofErr w:type="spellEnd"/>
-      <w:r>
-        <w:t xml:space="preserve"> X) </w:t>
-      </w:r>
-      <w:proofErr w:type="spellStart"/>
-      <w:r>
-        <w:t>pass</w:t>
-      </w:r>
-      <w:proofErr w:type="spellEnd"/>
-      <w:r>
-        <w:t xml:space="preserve">, </w:t>
-      </w:r>
-      <w:proofErr w:type="spellStart"/>
-      <w:r>
-        <w:t>and</w:t>
-      </w:r>
-      <w:proofErr w:type="spellEnd"/>
-      <w:r>
-        <w:t xml:space="preserve"> </w:t>
-      </w:r>
-      <w:proofErr w:type="spellStart"/>
-      <w:r>
-        <w:t>system-level</w:t>
-      </w:r>
-      <w:proofErr w:type="spellEnd"/>
-      <w:r>
-        <w:t xml:space="preserve"> </w:t>
-      </w:r>
-      <w:proofErr w:type="spellStart"/>
-      <w:r>
-        <w:t>integration</w:t>
-      </w:r>
-      <w:proofErr w:type="spellEnd"/>
-      <w:r>
-        <w:t xml:space="preserve"> </w:t>
-      </w:r>
-      <w:proofErr w:type="spellStart"/>
-      <w:r>
-        <w:t>testing</w:t>
-      </w:r>
-      <w:proofErr w:type="spellEnd"/>
-      <w:r>
-        <w:t xml:space="preserve"> is </w:t>
-      </w:r>
-      <w:proofErr w:type="spellStart"/>
-      <w:r>
-        <w:t>the</w:t>
-      </w:r>
-      <w:proofErr w:type="spellEnd"/>
-      <w:r>
-        <w:t xml:space="preserve"> </w:t>
-      </w:r>
-      <w:proofErr w:type="spellStart"/>
-      <w:r>
-        <w:t>next</w:t>
-      </w:r>
-      <w:proofErr w:type="spellEnd"/>
-      <w:r>
-        <w:t xml:space="preserve"> step.</w:t>
+        <w:t>A full end-to-end (top.sv) simulation has now been run to completion (four tokens, Q·Kᵀ through softmax) without hanging or losing data, closing this item; multi-token throughput on real hardware, as opposed to simulation, remains unmeasured.</w:t>
+      </w:r>
+      <w:proofErr w:type="spellStart"/>
+      <w:proofErr w:type="spellEnd"/>
+      <w:proofErr w:type="spellStart"/>
+      <w:proofErr w:type="spellEnd"/>
+      <w:proofErr w:type="spellStart"/>
+      <w:proofErr w:type="spellEnd"/>
+      <w:proofErr w:type="spellStart"/>
+      <w:proofErr w:type="spellEnd"/>
+      <w:proofErr w:type="spellStart"/>
+      <w:proofErr w:type="spellEnd"/>
+      <w:proofErr w:type="spellStart"/>
+      <w:proofErr w:type="spellEnd"/>
+      <w:proofErr w:type="spellStart"/>
+      <w:proofErr w:type="spellEnd"/>
+      <w:proofErr w:type="spellStart"/>
+      <w:proofErr w:type="spellEnd"/>
+      <w:proofErr w:type="spellStart"/>
+      <w:proofErr w:type="spellEnd"/>
+      <w:proofErr w:type="spellStart"/>
+      <w:proofErr w:type="spellEnd"/>
+      <w:proofErr w:type="spellStart"/>
+      <w:proofErr w:type="spellEnd"/>
+      <w:proofErr w:type="spellStart"/>
+      <w:proofErr w:type="spellEnd"/>
+      <w:proofErr w:type="spellStart"/>
+      <w:proofErr w:type="spellEnd"/>
+      <w:proofErr w:type="spellStart"/>
+      <w:proofErr w:type="spellEnd"/>
+      <w:proofErr w:type="spellStart"/>
+      <w:proofErr w:type="spellEnd"/>
+      <w:proofErr w:type="spellStart"/>
+      <w:proofErr w:type="spellEnd"/>
+    </w:p>
+    <w:p>
+      <w:pPr>
+        <w:pStyle w:val="ListeParagraf"/>
+      </w:pPr>
+      <w:r>
+        <w:t>softmax currently normalizes the entire flattened score matrix as one row instead of one row per query, because the shared array's output drain asserts its end-of-row signal once per whole matrix rather than once per row. A one-line fix was attempted and reverted after it introduced a second, not-yet-diagnosed deadlock between softmax and the array drain.</w:t>
       </w:r>
     </w:p>
     <w:p>
@@ -13184,932 +12451,239 @@
       </w:pPr>
       <w:proofErr w:type="spellStart"/>
       <w:r>
-        <w:t>The</w:t>
-      </w:r>
-      <w:proofErr w:type="spellEnd"/>
-      <w:r>
-        <w:t xml:space="preserve"> </w:t>
-      </w:r>
-      <w:proofErr w:type="spellStart"/>
-      <w:r>
-        <w:t>design</w:t>
-      </w:r>
-      <w:proofErr w:type="spellEnd"/>
-      <w:r>
-        <w:t xml:space="preserve"> </w:t>
-      </w:r>
-      <w:proofErr w:type="spellStart"/>
-      <w:r>
-        <w:t>presented</w:t>
-      </w:r>
-      <w:proofErr w:type="spellEnd"/>
-      <w:r>
-        <w:t xml:space="preserve"> here </w:t>
-      </w:r>
-      <w:proofErr w:type="spellStart"/>
-      <w:r>
-        <w:t>implements</w:t>
-      </w:r>
-      <w:proofErr w:type="spellEnd"/>
-      <w:r>
-        <w:t xml:space="preserve"> </w:t>
-      </w:r>
-      <w:proofErr w:type="spellStart"/>
-      <w:r>
-        <w:t>more</w:t>
-      </w:r>
-      <w:proofErr w:type="spellEnd"/>
-      <w:r>
-        <w:t xml:space="preserve"> </w:t>
-      </w:r>
-      <w:proofErr w:type="spellStart"/>
-      <w:r>
-        <w:t>than</w:t>
-      </w:r>
-      <w:proofErr w:type="spellEnd"/>
-      <w:r>
-        <w:t xml:space="preserve"> </w:t>
-      </w:r>
-      <w:proofErr w:type="spellStart"/>
-      <w:r>
-        <w:t>fifteen</w:t>
-      </w:r>
-      <w:proofErr w:type="spellEnd"/>
-      <w:r>
-        <w:t xml:space="preserve"> RTL </w:t>
-      </w:r>
-      <w:proofErr w:type="spellStart"/>
-      <w:r>
-        <w:t>modules</w:t>
-      </w:r>
-      <w:proofErr w:type="spellEnd"/>
-      <w:r>
-        <w:t xml:space="preserve"> </w:t>
-      </w:r>
-      <w:proofErr w:type="spellStart"/>
-      <w:r>
-        <w:t>covering</w:t>
-      </w:r>
-      <w:proofErr w:type="spellEnd"/>
-      <w:r>
-        <w:t xml:space="preserve"> </w:t>
-      </w:r>
-      <w:proofErr w:type="spellStart"/>
-      <w:r>
-        <w:t>the</w:t>
-      </w:r>
-      <w:proofErr w:type="spellEnd"/>
-      <w:r>
-        <w:t xml:space="preserve"> </w:t>
-      </w:r>
-      <w:proofErr w:type="spellStart"/>
-      <w:r>
-        <w:t>full</w:t>
-      </w:r>
-      <w:proofErr w:type="spellEnd"/>
-      <w:r>
-        <w:t xml:space="preserve"> self-</w:t>
-      </w:r>
-      <w:proofErr w:type="spellStart"/>
-      <w:r>
-        <w:t>attention</w:t>
-      </w:r>
-      <w:proofErr w:type="spellEnd"/>
-      <w:r>
-        <w:t xml:space="preserve"> </w:t>
-      </w:r>
-      <w:proofErr w:type="spellStart"/>
-      <w:r>
-        <w:t>pipeline</w:t>
-      </w:r>
-      <w:proofErr w:type="spellEnd"/>
-      <w:r>
-        <w:t xml:space="preserve">, </w:t>
-      </w:r>
-      <w:proofErr w:type="spellStart"/>
-      <w:r>
-        <w:t>from</w:t>
-      </w:r>
-      <w:proofErr w:type="spellEnd"/>
-      <w:r>
-        <w:t xml:space="preserve"> </w:t>
-      </w:r>
-      <w:proofErr w:type="spellStart"/>
-      <w:r>
-        <w:t>projection</w:t>
-      </w:r>
-      <w:proofErr w:type="spellEnd"/>
-      <w:r>
-        <w:t xml:space="preserve"> </w:t>
-      </w:r>
-      <w:proofErr w:type="spellStart"/>
-      <w:r>
-        <w:t>through</w:t>
-      </w:r>
-      <w:proofErr w:type="spellEnd"/>
-      <w:r>
-        <w:t xml:space="preserve"> </w:t>
-      </w:r>
-      <w:proofErr w:type="spellStart"/>
-      <w:r>
-        <w:t>RoPE</w:t>
-      </w:r>
-      <w:proofErr w:type="spellEnd"/>
-      <w:r>
-        <w:t xml:space="preserve">, GQA </w:t>
-      </w:r>
-      <w:proofErr w:type="spellStart"/>
-      <w:r>
-        <w:t>mapping</w:t>
-      </w:r>
-      <w:proofErr w:type="spellEnd"/>
-      <w:r>
-        <w:t xml:space="preserve">, </w:t>
-      </w:r>
-      <w:proofErr w:type="spellStart"/>
-      <w:r>
-        <w:t>similarity</w:t>
-      </w:r>
-      <w:proofErr w:type="spellEnd"/>
-      <w:r>
-        <w:t xml:space="preserve"> </w:t>
-      </w:r>
-      <w:proofErr w:type="spellStart"/>
-      <w:r>
-        <w:t>computation</w:t>
-      </w:r>
-      <w:proofErr w:type="spellEnd"/>
-      <w:r>
-        <w:t xml:space="preserve">, </w:t>
-      </w:r>
-      <w:proofErr w:type="spellStart"/>
-      <w:r>
-        <w:t>softmax</w:t>
-      </w:r>
-      <w:proofErr w:type="spellEnd"/>
-      <w:r>
-        <w:t xml:space="preserve">, </w:t>
-      </w:r>
-      <w:proofErr w:type="spellStart"/>
-      <w:r>
-        <w:t>and</w:t>
-      </w:r>
-      <w:proofErr w:type="spellEnd"/>
-      <w:r>
-        <w:t xml:space="preserve"> </w:t>
-      </w:r>
-      <w:proofErr w:type="spellStart"/>
-      <w:r>
-        <w:t>output</w:t>
-      </w:r>
-      <w:proofErr w:type="spellEnd"/>
-      <w:r>
-        <w:t xml:space="preserve"> </w:t>
-      </w:r>
-      <w:proofErr w:type="spellStart"/>
-      <w:r>
-        <w:t>generation</w:t>
-      </w:r>
-      <w:proofErr w:type="spellEnd"/>
-      <w:r>
-        <w:t xml:space="preserve">, </w:t>
-      </w:r>
-      <w:proofErr w:type="spellStart"/>
-      <w:r>
-        <w:t>with</w:t>
-      </w:r>
-      <w:proofErr w:type="spellEnd"/>
-      <w:r>
-        <w:t xml:space="preserve"> a </w:t>
-      </w:r>
-      <w:proofErr w:type="spellStart"/>
-      <w:r>
-        <w:t>shared</w:t>
-      </w:r>
-      <w:proofErr w:type="spellEnd"/>
-      <w:r>
-        <w:t xml:space="preserve"> </w:t>
-      </w:r>
-      <w:proofErr w:type="spellStart"/>
-      <w:r>
-        <w:t>systolic</w:t>
-      </w:r>
-      <w:proofErr w:type="spellEnd"/>
-      <w:r>
-        <w:t xml:space="preserve"> </w:t>
-      </w:r>
-      <w:proofErr w:type="spellStart"/>
-      <w:r>
-        <w:t>array</w:t>
-      </w:r>
-      <w:proofErr w:type="spellEnd"/>
-      <w:r>
-        <w:t xml:space="preserve"> </w:t>
-      </w:r>
-      <w:proofErr w:type="spellStart"/>
-      <w:r>
-        <w:t>reducing</w:t>
-      </w:r>
-      <w:proofErr w:type="spellEnd"/>
-      <w:r>
-        <w:t xml:space="preserve"> MAC </w:t>
-      </w:r>
-      <w:proofErr w:type="spellStart"/>
-      <w:r>
-        <w:t>resource</w:t>
-      </w:r>
-      <w:proofErr w:type="spellEnd"/>
-      <w:r>
-        <w:t xml:space="preserve"> </w:t>
-      </w:r>
-      <w:proofErr w:type="spellStart"/>
-      <w:r>
-        <w:t>duplication</w:t>
-      </w:r>
-      <w:proofErr w:type="spellEnd"/>
-      <w:r>
-        <w:t xml:space="preserve">. </w:t>
-      </w:r>
-      <w:proofErr w:type="spellStart"/>
-      <w:r>
-        <w:t>Every</w:t>
-      </w:r>
-      <w:proofErr w:type="spellEnd"/>
-      <w:r>
-        <w:t xml:space="preserve"> </w:t>
-      </w:r>
-      <w:proofErr w:type="spellStart"/>
-      <w:r>
-        <w:t>module</w:t>
-      </w:r>
-      <w:proofErr w:type="spellEnd"/>
-      <w:r>
-        <w:t xml:space="preserve"> </w:t>
-      </w:r>
-      <w:proofErr w:type="spellStart"/>
-      <w:r>
-        <w:t>now</w:t>
-      </w:r>
-      <w:proofErr w:type="spellEnd"/>
-      <w:r>
-        <w:t xml:space="preserve"> has a </w:t>
-      </w:r>
-      <w:proofErr w:type="spellStart"/>
-      <w:r>
-        <w:t>passing</w:t>
-      </w:r>
-      <w:proofErr w:type="spellEnd"/>
-      <w:r>
-        <w:t xml:space="preserve"> </w:t>
-      </w:r>
-      <w:proofErr w:type="spellStart"/>
-      <w:r>
-        <w:t>standalone</w:t>
-      </w:r>
-      <w:proofErr w:type="spellEnd"/>
-      <w:r>
-        <w:t xml:space="preserve"> </w:t>
-      </w:r>
-      <w:proofErr w:type="spellStart"/>
-      <w:r>
-        <w:t>testbench</w:t>
-      </w:r>
-      <w:proofErr w:type="spellEnd"/>
-      <w:r>
-        <w:t xml:space="preserve">, </w:t>
-      </w:r>
-      <w:proofErr w:type="spellStart"/>
-      <w:r>
-        <w:t>and</w:t>
-      </w:r>
-      <w:proofErr w:type="spellEnd"/>
-      <w:r>
-        <w:t xml:space="preserve"> </w:t>
-      </w:r>
-      <w:proofErr w:type="spellStart"/>
-      <w:r>
-        <w:t>the</w:t>
-      </w:r>
-      <w:proofErr w:type="spellEnd"/>
-      <w:r>
-        <w:t xml:space="preserve"> </w:t>
-      </w:r>
-      <w:proofErr w:type="spellStart"/>
-      <w:r>
-        <w:t>integration</w:t>
-      </w:r>
-      <w:proofErr w:type="spellEnd"/>
-      <w:r>
-        <w:t xml:space="preserve"> </w:t>
-      </w:r>
-      <w:proofErr w:type="spellStart"/>
-      <w:r>
-        <w:t>process</w:t>
-      </w:r>
-      <w:proofErr w:type="spellEnd"/>
-      <w:r>
-        <w:t xml:space="preserve"> </w:t>
-      </w:r>
-      <w:proofErr w:type="spellStart"/>
-      <w:r>
-        <w:t>that</w:t>
-      </w:r>
-      <w:proofErr w:type="spellEnd"/>
-      <w:r>
-        <w:t xml:space="preserve"> </w:t>
-      </w:r>
-      <w:proofErr w:type="spellStart"/>
-      <w:r>
-        <w:t>connected</w:t>
-      </w:r>
-      <w:proofErr w:type="spellEnd"/>
-      <w:r>
-        <w:t xml:space="preserve"> </w:t>
-      </w:r>
-      <w:proofErr w:type="spellStart"/>
-      <w:r>
-        <w:t>four</w:t>
-      </w:r>
-      <w:proofErr w:type="spellEnd"/>
-      <w:r>
-        <w:t xml:space="preserve"> </w:t>
-      </w:r>
-      <w:proofErr w:type="spellStart"/>
-      <w:r>
-        <w:t>independently</w:t>
-      </w:r>
-      <w:proofErr w:type="spellEnd"/>
-      <w:r>
-        <w:t xml:space="preserve"> </w:t>
-      </w:r>
-      <w:proofErr w:type="spellStart"/>
-      <w:r>
-        <w:t>written</w:t>
-      </w:r>
-      <w:proofErr w:type="spellEnd"/>
-      <w:r>
-        <w:t xml:space="preserve"> </w:t>
-      </w:r>
-      <w:proofErr w:type="spellStart"/>
-      <w:r>
-        <w:t>branches</w:t>
-      </w:r>
-      <w:proofErr w:type="spellEnd"/>
-      <w:r>
-        <w:t xml:space="preserve"> </w:t>
-      </w:r>
-      <w:proofErr w:type="spellStart"/>
-      <w:r>
-        <w:t>into</w:t>
-      </w:r>
-      <w:proofErr w:type="spellEnd"/>
-      <w:r>
-        <w:t xml:space="preserve"> a </w:t>
-      </w:r>
-      <w:proofErr w:type="spellStart"/>
-      <w:r>
-        <w:t>single</w:t>
-      </w:r>
-      <w:proofErr w:type="spellEnd"/>
-      <w:r>
-        <w:t xml:space="preserve"> </w:t>
-      </w:r>
-      <w:proofErr w:type="spellStart"/>
-      <w:r>
-        <w:t>working</w:t>
-      </w:r>
-      <w:proofErr w:type="spellEnd"/>
-      <w:r>
-        <w:t xml:space="preserve"> </w:t>
-      </w:r>
-      <w:proofErr w:type="spellStart"/>
-      <w:r>
-        <w:t>pipeline</w:t>
-      </w:r>
-      <w:proofErr w:type="spellEnd"/>
-      <w:r>
-        <w:t xml:space="preserve"> </w:t>
-      </w:r>
-      <w:proofErr w:type="spellStart"/>
-      <w:r>
-        <w:t>surfaced</w:t>
-      </w:r>
-      <w:proofErr w:type="spellEnd"/>
-      <w:r>
-        <w:t xml:space="preserve"> </w:t>
-      </w:r>
-      <w:proofErr w:type="spellStart"/>
-      <w:r>
-        <w:t>and</w:t>
-      </w:r>
-      <w:proofErr w:type="spellEnd"/>
-      <w:r>
-        <w:t xml:space="preserve"> </w:t>
-      </w:r>
-      <w:proofErr w:type="spellStart"/>
-      <w:r>
-        <w:t>fixed</w:t>
-      </w:r>
-      <w:proofErr w:type="spellEnd"/>
-      <w:r>
-        <w:t xml:space="preserve"> </w:t>
-      </w:r>
-      <w:proofErr w:type="spellStart"/>
-      <w:r>
-        <w:t>several</w:t>
-      </w:r>
-      <w:proofErr w:type="spellEnd"/>
-      <w:r>
-        <w:t xml:space="preserve"> </w:t>
-      </w:r>
-      <w:proofErr w:type="spellStart"/>
-      <w:r>
-        <w:t>concrete</w:t>
-      </w:r>
-      <w:proofErr w:type="spellEnd"/>
-      <w:r>
-        <w:t xml:space="preserve"> RTL </w:t>
-      </w:r>
-      <w:proofErr w:type="spellStart"/>
-      <w:r>
-        <w:t>bugs</w:t>
-      </w:r>
-      <w:proofErr w:type="spellEnd"/>
-      <w:r>
-        <w:t xml:space="preserve">, </w:t>
-      </w:r>
-      <w:proofErr w:type="spellStart"/>
-      <w:r>
-        <w:t>most</w:t>
-      </w:r>
-      <w:proofErr w:type="spellEnd"/>
-      <w:r>
-        <w:t xml:space="preserve"> </w:t>
-      </w:r>
-      <w:proofErr w:type="spellStart"/>
-      <w:r>
-        <w:t>notably</w:t>
-      </w:r>
-      <w:proofErr w:type="spellEnd"/>
-      <w:r>
-        <w:t xml:space="preserve"> a port-</w:t>
-      </w:r>
-      <w:proofErr w:type="spellStart"/>
-      <w:r>
-        <w:t>width</w:t>
-      </w:r>
-      <w:proofErr w:type="spellEnd"/>
-      <w:r>
-        <w:t xml:space="preserve"> </w:t>
-      </w:r>
-      <w:proofErr w:type="spellStart"/>
-      <w:r>
-        <w:t>error</w:t>
-      </w:r>
-      <w:proofErr w:type="spellEnd"/>
-      <w:r>
-        <w:t xml:space="preserve"> </w:t>
-      </w:r>
-      <w:proofErr w:type="spellStart"/>
-      <w:r>
-        <w:t>that</w:t>
-      </w:r>
-      <w:proofErr w:type="spellEnd"/>
-      <w:r>
-        <w:t xml:space="preserve"> had </w:t>
-      </w:r>
-      <w:proofErr w:type="spellStart"/>
-      <w:r>
-        <w:t>caused</w:t>
-      </w:r>
-      <w:proofErr w:type="spellEnd"/>
-      <w:r>
-        <w:t xml:space="preserve"> </w:t>
-      </w:r>
-      <w:proofErr w:type="spellStart"/>
-      <w:r>
-        <w:t>the</w:t>
-      </w:r>
-      <w:proofErr w:type="spellEnd"/>
-      <w:r>
-        <w:t xml:space="preserve"> </w:t>
-      </w:r>
-      <w:proofErr w:type="spellStart"/>
-      <w:r>
-        <w:t>synthesizer</w:t>
-      </w:r>
-      <w:proofErr w:type="spellEnd"/>
-      <w:r>
-        <w:t xml:space="preserve"> </w:t>
-      </w:r>
-      <w:proofErr w:type="spellStart"/>
-      <w:r>
-        <w:t>to</w:t>
-      </w:r>
-      <w:proofErr w:type="spellEnd"/>
-      <w:r>
-        <w:t xml:space="preserve"> </w:t>
-      </w:r>
-      <w:proofErr w:type="spellStart"/>
-      <w:r>
-        <w:t>delete</w:t>
-      </w:r>
-      <w:proofErr w:type="spellEnd"/>
-      <w:r>
-        <w:t xml:space="preserve"> </w:t>
-      </w:r>
-      <w:proofErr w:type="spellStart"/>
-      <w:r>
-        <w:t>nearly</w:t>
-      </w:r>
-      <w:proofErr w:type="spellEnd"/>
-      <w:r>
-        <w:t xml:space="preserve"> </w:t>
-      </w:r>
-      <w:proofErr w:type="spellStart"/>
-      <w:r>
-        <w:t>the</w:t>
-      </w:r>
-      <w:proofErr w:type="spellEnd"/>
-      <w:r>
-        <w:t xml:space="preserve"> </w:t>
-      </w:r>
-      <w:proofErr w:type="spellStart"/>
-      <w:r>
-        <w:t>entire</w:t>
-      </w:r>
-      <w:proofErr w:type="spellEnd"/>
-      <w:r>
-        <w:t xml:space="preserve"> </w:t>
-      </w:r>
-      <w:proofErr w:type="spellStart"/>
-      <w:r>
-        <w:t>design</w:t>
-      </w:r>
-      <w:proofErr w:type="spellEnd"/>
-      <w:r>
-        <w:t xml:space="preserve"> (</w:t>
-      </w:r>
-      <w:proofErr w:type="spellStart"/>
-      <w:r>
-        <w:t>Section</w:t>
-      </w:r>
-      <w:proofErr w:type="spellEnd"/>
-      <w:r>
-        <w:t xml:space="preserve"> X). Post-</w:t>
-      </w:r>
-      <w:proofErr w:type="spellStart"/>
-      <w:r>
-        <w:t>implementation</w:t>
-      </w:r>
-      <w:proofErr w:type="spellEnd"/>
-      <w:r>
-        <w:t xml:space="preserve"> </w:t>
-      </w:r>
-      <w:proofErr w:type="spellStart"/>
-      <w:r>
-        <w:t>synthesis</w:t>
-      </w:r>
-      <w:proofErr w:type="spellEnd"/>
-      <w:r>
-        <w:t xml:space="preserve"> </w:t>
-      </w:r>
-      <w:proofErr w:type="spellStart"/>
-      <w:r>
-        <w:t>confirms</w:t>
-      </w:r>
-      <w:proofErr w:type="spellEnd"/>
-      <w:r>
-        <w:t xml:space="preserve"> a </w:t>
-      </w:r>
-      <w:proofErr w:type="spellStart"/>
-      <w:r>
-        <w:t>compact</w:t>
-      </w:r>
-      <w:proofErr w:type="spellEnd"/>
-      <w:r>
-        <w:t xml:space="preserve">, DSP- </w:t>
-      </w:r>
-      <w:proofErr w:type="spellStart"/>
-      <w:r>
-        <w:t>and</w:t>
-      </w:r>
-      <w:proofErr w:type="spellEnd"/>
-      <w:r>
-        <w:t xml:space="preserve"> BRAM-</w:t>
-      </w:r>
-      <w:proofErr w:type="spellStart"/>
-      <w:r>
-        <w:t>free</w:t>
-      </w:r>
-      <w:proofErr w:type="spellEnd"/>
-      <w:r>
-        <w:t xml:space="preserve"> </w:t>
-      </w:r>
-      <w:proofErr w:type="spellStart"/>
-      <w:r>
-        <w:t>implementation</w:t>
-      </w:r>
-      <w:proofErr w:type="spellEnd"/>
-      <w:r>
-        <w:t xml:space="preserve"> at 1,486 </w:t>
-      </w:r>
-      <w:proofErr w:type="spellStart"/>
-      <w:r>
-        <w:t>LUTs</w:t>
-      </w:r>
-      <w:proofErr w:type="spellEnd"/>
-      <w:r>
-        <w:t xml:space="preserve"> </w:t>
-      </w:r>
-      <w:proofErr w:type="spellStart"/>
-      <w:r>
-        <w:t>and</w:t>
-      </w:r>
-      <w:proofErr w:type="spellEnd"/>
-      <w:r>
-        <w:t xml:space="preserve"> 510 </w:t>
-      </w:r>
-      <w:proofErr w:type="spellStart"/>
-      <w:r>
-        <w:t>flip-flops</w:t>
-      </w:r>
-      <w:proofErr w:type="spellEnd"/>
-      <w:r>
-        <w:t xml:space="preserve"> on a </w:t>
-      </w:r>
-      <w:proofErr w:type="spellStart"/>
-      <w:r>
-        <w:t>Xilinx</w:t>
-      </w:r>
-      <w:proofErr w:type="spellEnd"/>
-      <w:r>
-        <w:t xml:space="preserve"> Artix-7 </w:t>
-      </w:r>
-      <w:proofErr w:type="spellStart"/>
-      <w:r>
-        <w:t>device</w:t>
-      </w:r>
-      <w:proofErr w:type="spellEnd"/>
-      <w:r>
-        <w:t xml:space="preserve">. </w:t>
-      </w:r>
-      <w:proofErr w:type="spellStart"/>
-      <w:r>
-        <w:t>Planned</w:t>
-      </w:r>
-      <w:proofErr w:type="spellEnd"/>
-      <w:r>
-        <w:t xml:space="preserve"> </w:t>
-      </w:r>
-      <w:proofErr w:type="spellStart"/>
-      <w:r>
-        <w:t>next</w:t>
-      </w:r>
-      <w:proofErr w:type="spellEnd"/>
-      <w:r>
-        <w:t xml:space="preserve"> </w:t>
-      </w:r>
-      <w:proofErr w:type="spellStart"/>
-      <w:r>
-        <w:t>steps</w:t>
-      </w:r>
-      <w:proofErr w:type="spellEnd"/>
-      <w:r>
-        <w:t xml:space="preserve"> </w:t>
-      </w:r>
-      <w:proofErr w:type="spellStart"/>
-      <w:r>
-        <w:t>are</w:t>
-      </w:r>
-      <w:proofErr w:type="spellEnd"/>
-      <w:r>
-        <w:t xml:space="preserve">: </w:t>
-      </w:r>
-      <w:proofErr w:type="spellStart"/>
-      <w:r>
-        <w:t>cross-checking</w:t>
-      </w:r>
-      <w:proofErr w:type="spellEnd"/>
-      <w:r>
-        <w:t xml:space="preserve"> </w:t>
-      </w:r>
-      <w:proofErr w:type="spellStart"/>
-      <w:r>
-        <w:t>RoPE</w:t>
-      </w:r>
-      <w:proofErr w:type="spellEnd"/>
-      <w:r>
-        <w:t xml:space="preserve"> </w:t>
-      </w:r>
-      <w:proofErr w:type="spellStart"/>
-      <w:r>
-        <w:t>numerically</w:t>
-      </w:r>
-      <w:proofErr w:type="spellEnd"/>
-      <w:r>
-        <w:t xml:space="preserve"> </w:t>
-      </w:r>
-      <w:proofErr w:type="spellStart"/>
-      <w:r>
-        <w:t>against</w:t>
-      </w:r>
-      <w:proofErr w:type="spellEnd"/>
-      <w:r>
-        <w:t xml:space="preserve"> a golden software model, </w:t>
-      </w:r>
-      <w:proofErr w:type="spellStart"/>
-      <w:r>
-        <w:t>wiring</w:t>
-      </w:r>
-      <w:proofErr w:type="spellEnd"/>
-      <w:r>
-        <w:t xml:space="preserve"> GQA </w:t>
-      </w:r>
-      <w:proofErr w:type="spellStart"/>
-      <w:r>
-        <w:t>head</w:t>
-      </w:r>
-      <w:proofErr w:type="spellEnd"/>
-      <w:r>
-        <w:t xml:space="preserve"> </w:t>
-      </w:r>
-      <w:proofErr w:type="spellStart"/>
-      <w:r>
-        <w:t>selection</w:t>
-      </w:r>
-      <w:proofErr w:type="spellEnd"/>
-      <w:r>
-        <w:t xml:space="preserve"> </w:t>
-      </w:r>
-      <w:proofErr w:type="spellStart"/>
-      <w:r>
-        <w:t>into</w:t>
-      </w:r>
-      <w:proofErr w:type="spellEnd"/>
-      <w:r>
-        <w:t xml:space="preserve"> </w:t>
-      </w:r>
-      <w:proofErr w:type="spellStart"/>
-      <w:r>
-        <w:t>the</w:t>
-      </w:r>
-      <w:proofErr w:type="spellEnd"/>
-      <w:r>
-        <w:t xml:space="preserve"> URAM </w:t>
-      </w:r>
-      <w:proofErr w:type="spellStart"/>
-      <w:r>
-        <w:t>address</w:t>
-      </w:r>
-      <w:proofErr w:type="spellEnd"/>
-      <w:r>
-        <w:t xml:space="preserve"> </w:t>
-      </w:r>
-      <w:proofErr w:type="spellStart"/>
-      <w:r>
-        <w:t>path</w:t>
-      </w:r>
-      <w:proofErr w:type="spellEnd"/>
-      <w:r>
-        <w:t xml:space="preserve">, </w:t>
-      </w:r>
-      <w:proofErr w:type="spellStart"/>
-      <w:r>
-        <w:t>adding</w:t>
-      </w:r>
-      <w:proofErr w:type="spellEnd"/>
-      <w:r>
-        <w:t xml:space="preserve"> a </w:t>
-      </w:r>
-      <w:proofErr w:type="spellStart"/>
-      <w:r>
-        <w:t>weight-loading</w:t>
-      </w:r>
-      <w:proofErr w:type="spellEnd"/>
-      <w:r>
-        <w:t xml:space="preserve"> </w:t>
-      </w:r>
-      <w:proofErr w:type="spellStart"/>
-      <w:r>
-        <w:t>handshake</w:t>
-      </w:r>
-      <w:proofErr w:type="spellEnd"/>
-      <w:r>
-        <w:t xml:space="preserve">, </w:t>
-      </w:r>
-      <w:proofErr w:type="spellStart"/>
-      <w:r>
-        <w:t>and</w:t>
-      </w:r>
-      <w:proofErr w:type="spellEnd"/>
-      <w:r>
-        <w:t xml:space="preserve"> </w:t>
-      </w:r>
-      <w:proofErr w:type="spellStart"/>
-      <w:r>
-        <w:t>running</w:t>
-      </w:r>
-      <w:proofErr w:type="spellEnd"/>
-      <w:r>
-        <w:t xml:space="preserve"> </w:t>
-      </w:r>
-      <w:proofErr w:type="spellStart"/>
-      <w:r>
-        <w:t>full</w:t>
-      </w:r>
-      <w:proofErr w:type="spellEnd"/>
-      <w:r>
-        <w:t xml:space="preserve"> </w:t>
-      </w:r>
-      <w:proofErr w:type="spellStart"/>
-      <w:r>
-        <w:t>end-to-end</w:t>
-      </w:r>
-      <w:proofErr w:type="spellEnd"/>
-      <w:r>
-        <w:t xml:space="preserve"> (top.sv) </w:t>
-      </w:r>
-      <w:proofErr w:type="spellStart"/>
-      <w:r>
-        <w:t>pipeline</w:t>
-      </w:r>
-      <w:proofErr w:type="spellEnd"/>
-      <w:r>
-        <w:t xml:space="preserve"> </w:t>
-      </w:r>
-      <w:proofErr w:type="spellStart"/>
-      <w:r>
-        <w:t>simulation</w:t>
-      </w:r>
-      <w:proofErr w:type="spellEnd"/>
-      <w:r>
-        <w:t xml:space="preserve"> </w:t>
-      </w:r>
-      <w:proofErr w:type="spellStart"/>
-      <w:r>
-        <w:t>to</w:t>
-      </w:r>
-      <w:proofErr w:type="spellEnd"/>
-      <w:r>
-        <w:t xml:space="preserve"> </w:t>
-      </w:r>
-      <w:proofErr w:type="spellStart"/>
-      <w:r>
-        <w:t>measure</w:t>
-      </w:r>
-      <w:proofErr w:type="spellEnd"/>
-      <w:r>
-        <w:t xml:space="preserve"> </w:t>
-      </w:r>
-      <w:proofErr w:type="spellStart"/>
-      <w:r>
-        <w:t>timing</w:t>
-      </w:r>
-      <w:proofErr w:type="spellEnd"/>
-      <w:r>
-        <w:t xml:space="preserve"> </w:t>
-      </w:r>
-      <w:proofErr w:type="spellStart"/>
-      <w:r>
-        <w:t>closure</w:t>
-      </w:r>
-      <w:proofErr w:type="spellEnd"/>
-      <w:r>
-        <w:t xml:space="preserve"> </w:t>
-      </w:r>
-      <w:proofErr w:type="spellStart"/>
-      <w:r>
-        <w:t>and</w:t>
-      </w:r>
-      <w:proofErr w:type="spellEnd"/>
-      <w:r>
-        <w:t xml:space="preserve"> </w:t>
-      </w:r>
-      <w:proofErr w:type="spellStart"/>
-      <w:r>
-        <w:t>maximum</w:t>
-      </w:r>
-      <w:proofErr w:type="spellEnd"/>
-      <w:r>
-        <w:t xml:space="preserve"> </w:t>
-      </w:r>
-      <w:proofErr w:type="spellStart"/>
-      <w:r>
-        <w:t>clock</w:t>
-      </w:r>
-      <w:proofErr w:type="spellEnd"/>
-      <w:r>
-        <w:t xml:space="preserve"> </w:t>
-      </w:r>
-      <w:proofErr w:type="spellStart"/>
-      <w:r>
-        <w:t>frequency</w:t>
-      </w:r>
-      <w:proofErr w:type="spellEnd"/>
-      <w:r>
-        <w:t>.</w:t>
-      </w:r>
+        <w:t>The design presented here implements more than fifteen RTL modules covering the full self-attention pipeline, from projection through RoPE, GQA mapping, similarity computation, softmax, and output generation, with a shared systolic array reducing MAC resource duplication. Every module now has a passing standalone testbench, and the integration process that connected four independently written branches into a single working pipeline surfaced and fixed several concrete RTL bugs, most notably a port-width error that had caused the synthesizer to delete nearly the entire design (Section X). Post-implementation synthesis confirms a compact, DSP- and BRAM-free implementation at 1,486 LUTs and 510 flip-flops on a Xilinx Artix-7 device. A full end-to-end (top.sv) pipeline simulation has since been run to completion, surfacing and fixing four further integration bugs (Section X); planned next steps are correcting softmax's per-row normalization boundary (Section XI), cross-checking RoPE numerically against a golden software model, wiring GQA head selection into the URAM address path, adding a weight-loading handshake, and measuring timing closure and maximum clock frequency.</w:t>
+      </w:r>
+      <w:proofErr w:type="spellEnd"/>
+      <w:proofErr w:type="spellStart"/>
+      <w:proofErr w:type="spellEnd"/>
+      <w:proofErr w:type="spellStart"/>
+      <w:proofErr w:type="spellEnd"/>
+      <w:proofErr w:type="spellStart"/>
+      <w:proofErr w:type="spellEnd"/>
+      <w:proofErr w:type="spellStart"/>
+      <w:proofErr w:type="spellEnd"/>
+      <w:proofErr w:type="spellStart"/>
+      <w:proofErr w:type="spellEnd"/>
+      <w:proofErr w:type="spellStart"/>
+      <w:proofErr w:type="spellEnd"/>
+      <w:proofErr w:type="spellStart"/>
+      <w:proofErr w:type="spellEnd"/>
+      <w:proofErr w:type="spellStart"/>
+      <w:proofErr w:type="spellEnd"/>
+      <w:proofErr w:type="spellStart"/>
+      <w:proofErr w:type="spellEnd"/>
+      <w:proofErr w:type="spellStart"/>
+      <w:proofErr w:type="spellEnd"/>
+      <w:proofErr w:type="spellStart"/>
+      <w:proofErr w:type="spellEnd"/>
+      <w:proofErr w:type="spellStart"/>
+      <w:proofErr w:type="spellEnd"/>
+      <w:proofErr w:type="spellStart"/>
+      <w:proofErr w:type="spellEnd"/>
+      <w:proofErr w:type="spellStart"/>
+      <w:proofErr w:type="spellEnd"/>
+      <w:proofErr w:type="spellStart"/>
+      <w:proofErr w:type="spellEnd"/>
+      <w:proofErr w:type="spellStart"/>
+      <w:proofErr w:type="spellEnd"/>
+      <w:proofErr w:type="spellStart"/>
+      <w:proofErr w:type="spellEnd"/>
+      <w:proofErr w:type="spellStart"/>
+      <w:proofErr w:type="spellEnd"/>
+      <w:proofErr w:type="spellStart"/>
+      <w:proofErr w:type="spellEnd"/>
+      <w:proofErr w:type="spellStart"/>
+      <w:proofErr w:type="spellEnd"/>
+      <w:proofErr w:type="spellStart"/>
+      <w:proofErr w:type="spellEnd"/>
+      <w:proofErr w:type="spellStart"/>
+      <w:proofErr w:type="spellEnd"/>
+      <w:proofErr w:type="spellStart"/>
+      <w:proofErr w:type="spellEnd"/>
+      <w:proofErr w:type="spellStart"/>
+      <w:proofErr w:type="spellEnd"/>
+      <w:proofErr w:type="spellStart"/>
+      <w:proofErr w:type="spellEnd"/>
+      <w:proofErr w:type="spellStart"/>
+      <w:proofErr w:type="spellEnd"/>
+      <w:proofErr w:type="spellStart"/>
+      <w:proofErr w:type="spellEnd"/>
+      <w:proofErr w:type="spellStart"/>
+      <w:proofErr w:type="spellEnd"/>
+      <w:proofErr w:type="spellStart"/>
+      <w:proofErr w:type="spellEnd"/>
+      <w:proofErr w:type="spellStart"/>
+      <w:proofErr w:type="spellEnd"/>
+      <w:proofErr w:type="spellStart"/>
+      <w:proofErr w:type="spellEnd"/>
+      <w:proofErr w:type="spellStart"/>
+      <w:proofErr w:type="spellEnd"/>
+      <w:proofErr w:type="spellStart"/>
+      <w:proofErr w:type="spellEnd"/>
+      <w:proofErr w:type="spellStart"/>
+      <w:proofErr w:type="spellEnd"/>
+      <w:proofErr w:type="spellStart"/>
+      <w:proofErr w:type="spellEnd"/>
+      <w:proofErr w:type="spellStart"/>
+      <w:proofErr w:type="spellEnd"/>
+      <w:proofErr w:type="spellStart"/>
+      <w:proofErr w:type="spellEnd"/>
+      <w:proofErr w:type="spellStart"/>
+      <w:proofErr w:type="spellEnd"/>
+      <w:proofErr w:type="spellStart"/>
+      <w:proofErr w:type="spellEnd"/>
+      <w:proofErr w:type="spellStart"/>
+      <w:proofErr w:type="spellEnd"/>
+      <w:proofErr w:type="spellStart"/>
+      <w:proofErr w:type="spellEnd"/>
+      <w:proofErr w:type="spellStart"/>
+      <w:proofErr w:type="spellEnd"/>
+      <w:proofErr w:type="spellStart"/>
+      <w:proofErr w:type="spellEnd"/>
+      <w:proofErr w:type="spellStart"/>
+      <w:proofErr w:type="spellEnd"/>
+      <w:proofErr w:type="spellStart"/>
+      <w:proofErr w:type="spellEnd"/>
+      <w:proofErr w:type="spellStart"/>
+      <w:proofErr w:type="spellEnd"/>
+      <w:proofErr w:type="spellStart"/>
+      <w:proofErr w:type="spellEnd"/>
+      <w:proofErr w:type="spellStart"/>
+      <w:proofErr w:type="spellEnd"/>
+      <w:proofErr w:type="spellStart"/>
+      <w:proofErr w:type="spellEnd"/>
+      <w:proofErr w:type="spellStart"/>
+      <w:proofErr w:type="spellEnd"/>
+      <w:proofErr w:type="spellStart"/>
+      <w:proofErr w:type="spellEnd"/>
+      <w:proofErr w:type="spellStart"/>
+      <w:proofErr w:type="spellEnd"/>
+      <w:proofErr w:type="spellStart"/>
+      <w:proofErr w:type="spellEnd"/>
+      <w:proofErr w:type="spellStart"/>
+      <w:proofErr w:type="spellEnd"/>
+      <w:proofErr w:type="spellStart"/>
+      <w:proofErr w:type="spellEnd"/>
+      <w:proofErr w:type="spellStart"/>
+      <w:proofErr w:type="spellEnd"/>
+      <w:proofErr w:type="spellStart"/>
+      <w:proofErr w:type="spellEnd"/>
+      <w:proofErr w:type="spellStart"/>
+      <w:proofErr w:type="spellEnd"/>
+      <w:proofErr w:type="spellStart"/>
+      <w:proofErr w:type="spellEnd"/>
+      <w:proofErr w:type="spellStart"/>
+      <w:proofErr w:type="spellEnd"/>
+      <w:proofErr w:type="spellStart"/>
+      <w:proofErr w:type="spellEnd"/>
+      <w:proofErr w:type="spellStart"/>
+      <w:proofErr w:type="spellEnd"/>
+      <w:proofErr w:type="spellStart"/>
+      <w:proofErr w:type="spellEnd"/>
+      <w:proofErr w:type="spellStart"/>
+      <w:proofErr w:type="spellEnd"/>
+      <w:proofErr w:type="spellStart"/>
+      <w:proofErr w:type="spellEnd"/>
+      <w:proofErr w:type="spellStart"/>
+      <w:proofErr w:type="spellEnd"/>
+      <w:proofErr w:type="spellStart"/>
+      <w:proofErr w:type="spellEnd"/>
+      <w:proofErr w:type="spellStart"/>
+      <w:proofErr w:type="spellEnd"/>
+      <w:proofErr w:type="spellStart"/>
+      <w:proofErr w:type="spellEnd"/>
+      <w:proofErr w:type="spellStart"/>
+      <w:proofErr w:type="spellEnd"/>
+      <w:proofErr w:type="spellStart"/>
+      <w:proofErr w:type="spellEnd"/>
+      <w:proofErr w:type="spellStart"/>
+      <w:proofErr w:type="spellEnd"/>
+      <w:proofErr w:type="spellStart"/>
+      <w:proofErr w:type="spellEnd"/>
+      <w:proofErr w:type="spellStart"/>
+      <w:proofErr w:type="spellEnd"/>
+      <w:proofErr w:type="spellStart"/>
+      <w:proofErr w:type="spellEnd"/>
+      <w:proofErr w:type="spellStart"/>
+      <w:proofErr w:type="spellEnd"/>
+      <w:proofErr w:type="spellStart"/>
+      <w:proofErr w:type="spellEnd"/>
+      <w:proofErr w:type="spellStart"/>
+      <w:proofErr w:type="spellEnd"/>
+      <w:proofErr w:type="spellStart"/>
+      <w:proofErr w:type="spellEnd"/>
+      <w:proofErr w:type="spellStart"/>
+      <w:proofErr w:type="spellEnd"/>
+      <w:proofErr w:type="spellStart"/>
+      <w:proofErr w:type="spellEnd"/>
+      <w:proofErr w:type="spellStart"/>
+      <w:proofErr w:type="spellEnd"/>
+      <w:proofErr w:type="spellStart"/>
+      <w:proofErr w:type="spellEnd"/>
+      <w:proofErr w:type="spellStart"/>
+      <w:proofErr w:type="spellEnd"/>
+      <w:proofErr w:type="spellStart"/>
+      <w:proofErr w:type="spellEnd"/>
+      <w:proofErr w:type="spellStart"/>
+      <w:proofErr w:type="spellEnd"/>
+      <w:proofErr w:type="spellStart"/>
+      <w:proofErr w:type="spellEnd"/>
+      <w:proofErr w:type="spellStart"/>
+      <w:proofErr w:type="spellEnd"/>
+      <w:proofErr w:type="spellStart"/>
+      <w:proofErr w:type="spellEnd"/>
+      <w:proofErr w:type="spellStart"/>
+      <w:proofErr w:type="spellEnd"/>
+      <w:proofErr w:type="spellStart"/>
+      <w:proofErr w:type="spellEnd"/>
+      <w:proofErr w:type="spellStart"/>
+      <w:proofErr w:type="spellEnd"/>
+      <w:proofErr w:type="spellStart"/>
+      <w:proofErr w:type="spellEnd"/>
+      <w:proofErr w:type="spellStart"/>
+      <w:proofErr w:type="spellEnd"/>
+      <w:proofErr w:type="spellStart"/>
+      <w:proofErr w:type="spellEnd"/>
+      <w:proofErr w:type="spellStart"/>
+      <w:proofErr w:type="spellEnd"/>
+      <w:proofErr w:type="spellStart"/>
+      <w:proofErr w:type="spellEnd"/>
+      <w:proofErr w:type="spellStart"/>
+      <w:proofErr w:type="spellEnd"/>
+      <w:proofErr w:type="spellStart"/>
+      <w:proofErr w:type="spellEnd"/>
+      <w:proofErr w:type="spellStart"/>
+      <w:proofErr w:type="spellEnd"/>
+      <w:proofErr w:type="spellStart"/>
+      <w:proofErr w:type="spellEnd"/>
+      <w:proofErr w:type="spellStart"/>
+      <w:proofErr w:type="spellEnd"/>
+      <w:proofErr w:type="spellStart"/>
+      <w:proofErr w:type="spellEnd"/>
+      <w:proofErr w:type="spellStart"/>
+      <w:proofErr w:type="spellEnd"/>
+      <w:proofErr w:type="spellStart"/>
+      <w:proofErr w:type="spellEnd"/>
+      <w:proofErr w:type="spellStart"/>
+      <w:proofErr w:type="spellEnd"/>
+      <w:proofErr w:type="spellStart"/>
+      <w:proofErr w:type="spellEnd"/>
+      <w:proofErr w:type="spellStart"/>
+      <w:proofErr w:type="spellEnd"/>
+      <w:proofErr w:type="spellStart"/>
+      <w:proofErr w:type="spellEnd"/>
+      <w:proofErr w:type="spellStart"/>
+      <w:proofErr w:type="spellEnd"/>
+      <w:proofErr w:type="spellStart"/>
+      <w:proofErr w:type="spellEnd"/>
+      <w:proofErr w:type="spellStart"/>
+      <w:proofErr w:type="spellEnd"/>
+      <w:proofErr w:type="spellStart"/>
+      <w:proofErr w:type="spellEnd"/>
+      <w:proofErr w:type="spellStart"/>
+      <w:proofErr w:type="spellEnd"/>
+      <w:proofErr w:type="spellStart"/>
+      <w:proofErr w:type="spellEnd"/>
     </w:p>
     <w:p>
       <w:pPr>

</xml_diff>

<commit_message>
IEEE raporu: Section X'teki fazla bosluk paragraflarini kaldir (Fig. 3 gap fix)
</commit_message>
<xml_diff>
--- a/article/YAE_IEEE_Report_updated.docx
+++ b/article/YAE_IEEE_Report_updated.docx
@@ -9700,96 +9700,6 @@
         <w:t>A subsequent full top-level simulation, driving four tokens through the assembled pipeline end to end rather than exercising each module in isolation, surfaced four further integration bugs no module-level testbench could reach. dbuf.sv discarded every packet's final element because its bank-swap condition and its data-write condition were mutually exclusive branches of the same if/else, even though both were true on the same cycle. The URAM read controller advanced past its last requested address without confirming that address's result had been accepted downstream, silently losing it under backpressure. An arbiter's readiness signal back to softmax was wired behind a register that only became valid after softmax had already produced an output, a circular dependency that left softmax unable to produce its first result. And softmax's normalization multiplier lacked the single-element-in-flight guard already applied to the scale/mask stage, letting a later result overwrite an unconsumed earlier one. With all four fixed, the assembled design runs the full token-in to softmax-out path to completion without hanging or losing data; per-row softmax normalization remains open (Section XI).</w:t>
       </w:r>
     </w:p>
-    <w:p>
-      <w:pPr>
-        <w:spacing w:after="100"/>
-        <w:jc w:val="both"/>
-      </w:pPr>
-    </w:p>
-    <w:p>
-      <w:pPr>
-        <w:spacing w:after="100"/>
-        <w:jc w:val="both"/>
-      </w:pPr>
-    </w:p>
-    <w:p>
-      <w:pPr>
-        <w:spacing w:after="100"/>
-        <w:jc w:val="both"/>
-      </w:pPr>
-    </w:p>
-    <w:p>
-      <w:pPr>
-        <w:spacing w:after="100"/>
-        <w:jc w:val="both"/>
-      </w:pPr>
-    </w:p>
-    <w:p>
-      <w:pPr>
-        <w:spacing w:after="100"/>
-        <w:jc w:val="both"/>
-      </w:pPr>
-    </w:p>
-    <w:p>
-      <w:pPr>
-        <w:spacing w:after="100"/>
-        <w:jc w:val="both"/>
-      </w:pPr>
-    </w:p>
-    <w:p>
-      <w:pPr>
-        <w:spacing w:after="100"/>
-        <w:jc w:val="both"/>
-      </w:pPr>
-    </w:p>
-    <w:p>
-      <w:pPr>
-        <w:spacing w:after="100"/>
-        <w:jc w:val="both"/>
-      </w:pPr>
-    </w:p>
-    <w:p>
-      <w:pPr>
-        <w:spacing w:after="100"/>
-        <w:jc w:val="both"/>
-      </w:pPr>
-    </w:p>
-    <w:p>
-      <w:pPr>
-        <w:spacing w:after="100"/>
-        <w:jc w:val="both"/>
-      </w:pPr>
-    </w:p>
-    <w:p>
-      <w:pPr>
-        <w:spacing w:after="100"/>
-        <w:jc w:val="both"/>
-      </w:pPr>
-    </w:p>
-    <w:p>
-      <w:pPr>
-        <w:spacing w:after="100"/>
-        <w:jc w:val="both"/>
-      </w:pPr>
-    </w:p>
-    <w:p>
-      <w:pPr>
-        <w:spacing w:after="100"/>
-        <w:jc w:val="both"/>
-      </w:pPr>
-    </w:p>
-    <w:p>
-      <w:pPr>
-        <w:spacing w:after="100"/>
-        <w:jc w:val="both"/>
-      </w:pPr>
-    </w:p>
-    <w:p>
-      <w:pPr>
-        <w:spacing w:after="100"/>
-        <w:jc w:val="both"/>
-      </w:pPr>
-    </w:p>
     <w:tbl>
       <w:tblPr>
         <w:tblW w:w="5000" w:type="pct"/>
@@ -10531,11 +10441,6 @@
         </w:tc>
       </w:tr>
     </w:tbl>
-    <w:p>
-      <w:pPr>
-        <w:spacing w:after="100"/>
-      </w:pPr>
-    </w:p>
     <w:p>
       <w:pPr>
         <w:spacing w:after="100"/>

</xml_diff>

<commit_message>
Raporlar: elle yapilan son duzenlemeler + guncel PDF'ler
</commit_message>
<xml_diff>
--- a/article/YAE_IEEE_Report_updated.docx
+++ b/article/YAE_IEEE_Report_updated.docx
@@ -1,6 +1,6 @@
 
 <file path=word/document.xml><?xml version="1.0" encoding="utf-8"?>
-<w:document xmlns:wpc="http://schemas.microsoft.com/office/word/2010/wordprocessingCanvas" xmlns:cx="http://schemas.microsoft.com/office/drawing/2014/chartex" xmlns:cx1="http://schemas.microsoft.com/office/drawing/2015/9/8/chartex" xmlns:cx2="http://schemas.microsoft.com/office/drawing/2015/10/21/chartex" xmlns:cx3="http://schemas.microsoft.com/office/drawing/2016/5/9/chartex" xmlns:cx4="http://schemas.microsoft.com/office/drawing/2016/5/10/chartex" xmlns:cx5="http://schemas.microsoft.com/office/drawing/2016/5/11/chartex" xmlns:cx6="http://schemas.microsoft.com/office/drawing/2016/5/12/chartex" xmlns:cx7="http://schemas.microsoft.com/office/drawing/2016/5/13/chartex" xmlns:cx8="http://schemas.microsoft.com/office/drawing/2016/5/14/chartex" xmlns:mc="http://schemas.openxmlformats.org/markup-compatibility/2006" xmlns:aink="http://schemas.microsoft.com/office/drawing/2016/ink" xmlns:am3d="http://schemas.microsoft.com/office/drawing/2017/model3d" xmlns:o="urn:schemas-microsoft-com:office:office" xmlns:oel="http://schemas.microsoft.com/office/2019/extlst" xmlns:r="http://schemas.openxmlformats.org/officeDocument/2006/relationships" xmlns:m="http://schemas.openxmlformats.org/officeDocument/2006/math" xmlns:v="urn:schemas-microsoft-com:vml" xmlns:wp14="http://schemas.microsoft.com/office/word/2010/wordprocessingDrawing" xmlns:wp="http://schemas.openxmlformats.org/drawingml/2006/wordprocessingDrawing" xmlns:w10="urn:schemas-microsoft-com:office:word" xmlns:w="http://schemas.openxmlformats.org/wordprocessingml/2006/main" xmlns:w14="http://schemas.microsoft.com/office/word/2010/wordml" xmlns:w15="http://schemas.microsoft.com/office/word/2012/wordml" xmlns:w16cei="http://schemas.microsoft.com/office/word/2026/wordml/cei" xmlns:w16cex="http://schemas.microsoft.com/office/word/2018/wordml/cex" xmlns:w16cid="http://schemas.microsoft.com/office/word/2016/wordml/cid" xmlns:w16="http://schemas.microsoft.com/office/word/2018/wordml" xmlns:w16du="http://schemas.microsoft.com/office/word/2023/wordml/word16du" xmlns:w16sdtdh="http://schemas.microsoft.com/office/word/2020/wordml/sdtdatahash" xmlns:w16sdtfl="http://schemas.microsoft.com/office/word/2024/wordml/sdtformatlock" xmlns:w16se="http://schemas.microsoft.com/office/word/2015/wordml/symex" xmlns:wpg="http://schemas.microsoft.com/office/word/2010/wordprocessingGroup" xmlns:wpi="http://schemas.microsoft.com/office/word/2010/wordprocessingInk" xmlns:wne="http://schemas.microsoft.com/office/word/2006/wordml" xmlns:wps="http://schemas.microsoft.com/office/word/2010/wordprocessingShape" mc:Ignorable="w14 w15 w16se w16cid w16 w16cex w16sdtdh w16sdtfl w16du wp14">
+<w:document xmlns:wpc="http://schemas.microsoft.com/office/word/2010/wordprocessingCanvas" xmlns:cx="http://schemas.microsoft.com/office/drawing/2014/chartex" xmlns:cx1="http://schemas.microsoft.com/office/drawing/2015/9/8/chartex" xmlns:cx2="http://schemas.microsoft.com/office/drawing/2015/10/21/chartex" xmlns:cx3="http://schemas.microsoft.com/office/drawing/2016/5/9/chartex" xmlns:cx4="http://schemas.microsoft.com/office/drawing/2016/5/10/chartex" xmlns:cx5="http://schemas.microsoft.com/office/drawing/2016/5/11/chartex" xmlns:cx6="http://schemas.microsoft.com/office/drawing/2016/5/12/chartex" xmlns:cx7="http://schemas.microsoft.com/office/drawing/2016/5/13/chartex" xmlns:cx8="http://schemas.microsoft.com/office/drawing/2016/5/14/chartex" xmlns:mc="http://schemas.openxmlformats.org/markup-compatibility/2006" xmlns:aink="http://schemas.microsoft.com/office/drawing/2016/ink" xmlns:am3d="http://schemas.microsoft.com/office/drawing/2017/model3d" xmlns:o="urn:schemas-microsoft-com:office:office" xmlns:oel="http://schemas.microsoft.com/office/2019/extlst" xmlns:r="http://schemas.openxmlformats.org/officeDocument/2006/relationships" xmlns:m="http://schemas.openxmlformats.org/officeDocument/2006/math" xmlns:v="urn:schemas-microsoft-com:vml" xmlns:wp14="http://schemas.microsoft.com/office/word/2010/wordprocessingDrawing" xmlns:wp="http://schemas.openxmlformats.org/drawingml/2006/wordprocessingDrawing" xmlns:w10="urn:schemas-microsoft-com:office:word" xmlns:w="http://schemas.openxmlformats.org/wordprocessingml/2006/main" xmlns:w14="http://schemas.microsoft.com/office/word/2010/wordml" xmlns:w15="http://schemas.microsoft.com/office/word/2012/wordml" xmlns:w16cex="http://schemas.microsoft.com/office/word/2018/wordml/cex" xmlns:w16cid="http://schemas.microsoft.com/office/word/2016/wordml/cid" xmlns:w16="http://schemas.microsoft.com/office/word/2018/wordml" xmlns:w16sdtdh="http://schemas.microsoft.com/office/word/2020/wordml/sdtdatahash" xmlns:w16se="http://schemas.microsoft.com/office/word/2015/wordml/symex" xmlns:wpg="http://schemas.microsoft.com/office/word/2010/wordprocessingGroup" xmlns:wpi="http://schemas.microsoft.com/office/word/2010/wordprocessingInk" xmlns:wne="http://schemas.microsoft.com/office/word/2006/wordml" xmlns:wps="http://schemas.microsoft.com/office/word/2010/wordprocessingShape" mc:Ignorable="w14 w15 w16se w16cid w16 w16cex w16sdtdh wp14">
   <w:body>
     <w:p>
       <w:pPr>
@@ -399,223 +399,2878 @@
           <w:i/>
           <w:iCs/>
         </w:rPr>
-        <w:t>Abstract: This report presents the design of a SystemVerilog RTL accelerator that computes the self-attention block of transformer models in hardware. The core implements a streaming, AXI-Stream-based datapath in bfloat16 (BF16) arithmetic, and integrates Rotary Positional Encoding (RoPE), Grouped Query Attention (GQA), and a time-shared systolic processing-element (PE) array that performs both the Q·Kᵀ similarity computation and the score·V reduction on the same physical hardware. Resource efficiency is achieved through ping-pong double buffering, valid/ready handshaking throughout, and arbitrated sharing of the most expensive multiply-accumulate (MAC) resource. The design comprises more than fifteen RTL modules, each validated by a standalone, self-checking testbench. All seven testbenches pass, and post-implementation synthesis on a Xilinx Artix-7 device measures 1,486 LUTs, 510 flip-flops, and zero DSP or Block RAM usage. A full end-to-end, top-level simulation of the assembled pipeline has since been run to completion without hanging or losing data, after four additional integration bugs surfaced and were fixed. Remaining work is a golden-model numerical cross-check of RoPE, a weight-loading handshake, and correcting softmax's row-normalization boundary, currently computed once per full score tile rather than once per row.</w:t>
-      </w:r>
-      <w:proofErr w:type="spellEnd"/>
-      <w:proofErr w:type="spellStart"/>
-      <w:proofErr w:type="spellEnd"/>
-      <w:proofErr w:type="spellStart"/>
-      <w:proofErr w:type="spellEnd"/>
-      <w:proofErr w:type="spellStart"/>
-      <w:proofErr w:type="spellEnd"/>
-      <w:proofErr w:type="spellStart"/>
-      <w:proofErr w:type="spellEnd"/>
-      <w:proofErr w:type="spellStart"/>
-      <w:proofErr w:type="spellEnd"/>
-      <w:proofErr w:type="spellStart"/>
-      <w:proofErr w:type="spellEnd"/>
-      <w:proofErr w:type="spellStart"/>
-      <w:proofErr w:type="spellEnd"/>
-      <w:proofErr w:type="spellStart"/>
-      <w:proofErr w:type="spellEnd"/>
-      <w:proofErr w:type="spellStart"/>
-      <w:proofErr w:type="spellEnd"/>
-      <w:proofErr w:type="spellStart"/>
-      <w:proofErr w:type="spellEnd"/>
-      <w:proofErr w:type="spellStart"/>
-      <w:proofErr w:type="spellEnd"/>
-      <w:proofErr w:type="spellStart"/>
-      <w:proofErr w:type="spellEnd"/>
-      <w:proofErr w:type="spellStart"/>
-      <w:proofErr w:type="spellEnd"/>
-      <w:proofErr w:type="spellStart"/>
-      <w:proofErr w:type="spellEnd"/>
-      <w:proofErr w:type="spellStart"/>
-      <w:proofErr w:type="spellEnd"/>
-      <w:proofErr w:type="spellStart"/>
-      <w:proofErr w:type="spellEnd"/>
-      <w:proofErr w:type="spellStart"/>
-      <w:proofErr w:type="spellEnd"/>
-      <w:proofErr w:type="spellStart"/>
-      <w:proofErr w:type="spellEnd"/>
-      <w:proofErr w:type="spellStart"/>
-      <w:proofErr w:type="spellEnd"/>
-      <w:proofErr w:type="spellStart"/>
-      <w:proofErr w:type="spellEnd"/>
-      <w:proofErr w:type="spellStart"/>
-      <w:proofErr w:type="spellEnd"/>
-      <w:proofErr w:type="spellStart"/>
-      <w:proofErr w:type="spellEnd"/>
-      <w:proofErr w:type="spellStart"/>
-      <w:proofErr w:type="spellEnd"/>
-      <w:proofErr w:type="spellStart"/>
-      <w:proofErr w:type="spellEnd"/>
-      <w:proofErr w:type="spellStart"/>
-      <w:proofErr w:type="spellEnd"/>
-      <w:proofErr w:type="spellStart"/>
-      <w:proofErr w:type="spellEnd"/>
-      <w:proofErr w:type="spellStart"/>
-      <w:proofErr w:type="spellEnd"/>
-      <w:proofErr w:type="spellStart"/>
-      <w:proofErr w:type="spellEnd"/>
-      <w:proofErr w:type="spellStart"/>
-      <w:proofErr w:type="spellEnd"/>
-      <w:proofErr w:type="spellStart"/>
-      <w:proofErr w:type="spellEnd"/>
-      <w:proofErr w:type="spellStart"/>
-      <w:proofErr w:type="spellEnd"/>
-      <w:proofErr w:type="spellStart"/>
-      <w:proofErr w:type="spellEnd"/>
-      <w:proofErr w:type="spellStart"/>
-      <w:proofErr w:type="spellEnd"/>
-      <w:proofErr w:type="spellStart"/>
-      <w:proofErr w:type="spellEnd"/>
-      <w:proofErr w:type="spellStart"/>
-      <w:proofErr w:type="spellEnd"/>
-      <w:proofErr w:type="spellStart"/>
-      <w:proofErr w:type="spellEnd"/>
-      <w:proofErr w:type="spellStart"/>
-      <w:proofErr w:type="spellEnd"/>
-      <w:proofErr w:type="spellStart"/>
-      <w:proofErr w:type="spellEnd"/>
-      <w:proofErr w:type="spellStart"/>
-      <w:proofErr w:type="spellEnd"/>
-      <w:proofErr w:type="spellStart"/>
-      <w:proofErr w:type="spellEnd"/>
-      <w:proofErr w:type="spellStart"/>
-      <w:proofErr w:type="spellEnd"/>
-      <w:proofErr w:type="spellStart"/>
-      <w:proofErr w:type="spellEnd"/>
-      <w:proofErr w:type="spellStart"/>
-      <w:proofErr w:type="spellEnd"/>
-      <w:proofErr w:type="spellStart"/>
-      <w:proofErr w:type="spellEnd"/>
-      <w:proofErr w:type="spellStart"/>
-      <w:proofErr w:type="spellEnd"/>
-      <w:proofErr w:type="spellStart"/>
-      <w:proofErr w:type="spellEnd"/>
-      <w:proofErr w:type="spellStart"/>
-      <w:proofErr w:type="spellEnd"/>
-      <w:proofErr w:type="spellStart"/>
-      <w:proofErr w:type="spellEnd"/>
-      <w:proofErr w:type="spellStart"/>
-      <w:proofErr w:type="spellEnd"/>
-      <w:proofErr w:type="spellStart"/>
-      <w:proofErr w:type="spellEnd"/>
-      <w:proofErr w:type="spellStart"/>
-      <w:proofErr w:type="spellEnd"/>
-      <w:proofErr w:type="spellStart"/>
-      <w:proofErr w:type="spellEnd"/>
-      <w:proofErr w:type="spellStart"/>
-      <w:proofErr w:type="spellEnd"/>
-      <w:proofErr w:type="spellStart"/>
-      <w:proofErr w:type="spellEnd"/>
-      <w:proofErr w:type="spellStart"/>
-      <w:proofErr w:type="spellEnd"/>
-      <w:proofErr w:type="spellStart"/>
-      <w:proofErr w:type="spellEnd"/>
-      <w:proofErr w:type="spellStart"/>
-      <w:proofErr w:type="spellEnd"/>
-      <w:proofErr w:type="spellStart"/>
-      <w:proofErr w:type="spellEnd"/>
-      <w:proofErr w:type="spellStart"/>
-      <w:proofErr w:type="spellEnd"/>
-      <w:proofErr w:type="spellStart"/>
-      <w:proofErr w:type="spellEnd"/>
-      <w:proofErr w:type="spellStart"/>
-      <w:proofErr w:type="spellEnd"/>
-      <w:proofErr w:type="spellStart"/>
-      <w:proofErr w:type="spellEnd"/>
-      <w:proofErr w:type="spellStart"/>
-      <w:proofErr w:type="spellEnd"/>
-      <w:proofErr w:type="spellStart"/>
-      <w:proofErr w:type="spellEnd"/>
-      <w:proofErr w:type="spellStart"/>
-      <w:proofErr w:type="spellEnd"/>
-      <w:proofErr w:type="spellStart"/>
-      <w:proofErr w:type="spellEnd"/>
-      <w:proofErr w:type="spellStart"/>
-      <w:proofErr w:type="spellEnd"/>
-      <w:proofErr w:type="spellStart"/>
-      <w:proofErr w:type="spellEnd"/>
-      <w:proofErr w:type="spellStart"/>
-      <w:proofErr w:type="spellEnd"/>
-      <w:proofErr w:type="spellStart"/>
-      <w:proofErr w:type="spellEnd"/>
-      <w:proofErr w:type="spellStart"/>
-      <w:proofErr w:type="spellEnd"/>
-      <w:proofErr w:type="spellStart"/>
-      <w:proofErr w:type="spellEnd"/>
-      <w:proofErr w:type="spellStart"/>
-      <w:proofErr w:type="spellEnd"/>
-      <w:proofErr w:type="spellStart"/>
-      <w:proofErr w:type="spellEnd"/>
-      <w:proofErr w:type="spellStart"/>
-      <w:proofErr w:type="spellEnd"/>
-      <w:proofErr w:type="spellStart"/>
-      <w:proofErr w:type="spellEnd"/>
-      <w:proofErr w:type="spellStart"/>
-      <w:proofErr w:type="spellEnd"/>
-      <w:proofErr w:type="spellStart"/>
-      <w:proofErr w:type="spellEnd"/>
-      <w:proofErr w:type="spellStart"/>
-      <w:proofErr w:type="spellEnd"/>
-      <w:proofErr w:type="spellStart"/>
-      <w:proofErr w:type="spellEnd"/>
-      <w:proofErr w:type="spellStart"/>
-      <w:proofErr w:type="spellEnd"/>
-      <w:proofErr w:type="spellStart"/>
-      <w:proofErr w:type="spellEnd"/>
-      <w:proofErr w:type="spellStart"/>
-      <w:proofErr w:type="spellEnd"/>
-      <w:proofErr w:type="spellStart"/>
-      <w:proofErr w:type="spellEnd"/>
-      <w:proofErr w:type="spellStart"/>
-      <w:proofErr w:type="spellEnd"/>
-      <w:proofErr w:type="spellStart"/>
-      <w:proofErr w:type="spellEnd"/>
-      <w:proofErr w:type="spellStart"/>
-      <w:proofErr w:type="spellEnd"/>
-      <w:proofErr w:type="spellStart"/>
-      <w:proofErr w:type="spellEnd"/>
-      <w:proofErr w:type="spellStart"/>
-      <w:proofErr w:type="spellEnd"/>
-      <w:proofErr w:type="spellStart"/>
-      <w:proofErr w:type="spellEnd"/>
-      <w:proofErr w:type="spellStart"/>
-      <w:proofErr w:type="spellEnd"/>
-      <w:proofErr w:type="spellStart"/>
-      <w:proofErr w:type="spellEnd"/>
-      <w:proofErr w:type="spellStart"/>
-      <w:proofErr w:type="spellEnd"/>
-      <w:proofErr w:type="spellStart"/>
-      <w:proofErr w:type="spellEnd"/>
-      <w:proofErr w:type="spellStart"/>
-      <w:proofErr w:type="spellEnd"/>
-      <w:proofErr w:type="spellStart"/>
-      <w:proofErr w:type="spellEnd"/>
-      <w:proofErr w:type="spellStart"/>
-      <w:proofErr w:type="spellEnd"/>
-      <w:proofErr w:type="spellStart"/>
-      <w:proofErr w:type="spellEnd"/>
-      <w:proofErr w:type="spellStart"/>
-      <w:proofErr w:type="spellEnd"/>
-      <w:proofErr w:type="spellStart"/>
-      <w:proofErr w:type="spellEnd"/>
-      <w:proofErr w:type="spellStart"/>
-      <w:proofErr w:type="spellEnd"/>
-      <w:proofErr w:type="spellStart"/>
-      <w:proofErr w:type="spellEnd"/>
-      <w:proofErr w:type="spellStart"/>
-      <w:proofErr w:type="spellEnd"/>
-      <w:proofErr w:type="spellStart"/>
-      <w:proofErr w:type="spellEnd"/>
-      <w:proofErr w:type="spellStart"/>
-      <w:proofErr w:type="spellEnd"/>
-      <w:proofErr w:type="spellStart"/>
-      <w:proofErr w:type="spellEnd"/>
-      <w:proofErr w:type="spellStart"/>
-      <w:proofErr w:type="spellEnd"/>
+        <w:t>Abstract</w:t>
+      </w:r>
+      <w:proofErr w:type="spellEnd"/>
+      <w:r>
+        <w:rPr>
+          <w:b/>
+          <w:bCs/>
+          <w:i/>
+          <w:iCs/>
+        </w:rPr>
+        <w:t xml:space="preserve">: </w:t>
+      </w:r>
+      <w:proofErr w:type="spellStart"/>
+      <w:r>
+        <w:rPr>
+          <w:b/>
+          <w:bCs/>
+          <w:i/>
+          <w:iCs/>
+        </w:rPr>
+        <w:t>This</w:t>
+      </w:r>
+      <w:proofErr w:type="spellEnd"/>
+      <w:r>
+        <w:rPr>
+          <w:b/>
+          <w:bCs/>
+          <w:i/>
+          <w:iCs/>
+        </w:rPr>
+        <w:t xml:space="preserve"> </w:t>
+      </w:r>
+      <w:proofErr w:type="spellStart"/>
+      <w:r>
+        <w:rPr>
+          <w:b/>
+          <w:bCs/>
+          <w:i/>
+          <w:iCs/>
+        </w:rPr>
+        <w:t>report</w:t>
+      </w:r>
+      <w:proofErr w:type="spellEnd"/>
+      <w:r>
+        <w:rPr>
+          <w:b/>
+          <w:bCs/>
+          <w:i/>
+          <w:iCs/>
+        </w:rPr>
+        <w:t xml:space="preserve"> </w:t>
+      </w:r>
+      <w:proofErr w:type="spellStart"/>
+      <w:r>
+        <w:rPr>
+          <w:b/>
+          <w:bCs/>
+          <w:i/>
+          <w:iCs/>
+        </w:rPr>
+        <w:t>presents</w:t>
+      </w:r>
+      <w:proofErr w:type="spellEnd"/>
+      <w:r>
+        <w:rPr>
+          <w:b/>
+          <w:bCs/>
+          <w:i/>
+          <w:iCs/>
+        </w:rPr>
+        <w:t xml:space="preserve"> </w:t>
+      </w:r>
+      <w:proofErr w:type="spellStart"/>
+      <w:r>
+        <w:rPr>
+          <w:b/>
+          <w:bCs/>
+          <w:i/>
+          <w:iCs/>
+        </w:rPr>
+        <w:t>the</w:t>
+      </w:r>
+      <w:proofErr w:type="spellEnd"/>
+      <w:r>
+        <w:rPr>
+          <w:b/>
+          <w:bCs/>
+          <w:i/>
+          <w:iCs/>
+        </w:rPr>
+        <w:t xml:space="preserve"> </w:t>
+      </w:r>
+      <w:proofErr w:type="spellStart"/>
+      <w:r>
+        <w:rPr>
+          <w:b/>
+          <w:bCs/>
+          <w:i/>
+          <w:iCs/>
+        </w:rPr>
+        <w:t>design</w:t>
+      </w:r>
+      <w:proofErr w:type="spellEnd"/>
+      <w:r>
+        <w:rPr>
+          <w:b/>
+          <w:bCs/>
+          <w:i/>
+          <w:iCs/>
+        </w:rPr>
+        <w:t xml:space="preserve"> of a </w:t>
+      </w:r>
+      <w:proofErr w:type="spellStart"/>
+      <w:r>
+        <w:rPr>
+          <w:b/>
+          <w:bCs/>
+          <w:i/>
+          <w:iCs/>
+        </w:rPr>
+        <w:t>SystemVerilog</w:t>
+      </w:r>
+      <w:proofErr w:type="spellEnd"/>
+      <w:r>
+        <w:rPr>
+          <w:b/>
+          <w:bCs/>
+          <w:i/>
+          <w:iCs/>
+        </w:rPr>
+        <w:t xml:space="preserve"> RTL </w:t>
+      </w:r>
+      <w:proofErr w:type="spellStart"/>
+      <w:r>
+        <w:rPr>
+          <w:b/>
+          <w:bCs/>
+          <w:i/>
+          <w:iCs/>
+        </w:rPr>
+        <w:t>accelerator</w:t>
+      </w:r>
+      <w:proofErr w:type="spellEnd"/>
+      <w:r>
+        <w:rPr>
+          <w:b/>
+          <w:bCs/>
+          <w:i/>
+          <w:iCs/>
+        </w:rPr>
+        <w:t xml:space="preserve"> </w:t>
+      </w:r>
+      <w:proofErr w:type="spellStart"/>
+      <w:r>
+        <w:rPr>
+          <w:b/>
+          <w:bCs/>
+          <w:i/>
+          <w:iCs/>
+        </w:rPr>
+        <w:t>that</w:t>
+      </w:r>
+      <w:proofErr w:type="spellEnd"/>
+      <w:r>
+        <w:rPr>
+          <w:b/>
+          <w:bCs/>
+          <w:i/>
+          <w:iCs/>
+        </w:rPr>
+        <w:t xml:space="preserve"> </w:t>
+      </w:r>
+      <w:proofErr w:type="spellStart"/>
+      <w:r>
+        <w:rPr>
+          <w:b/>
+          <w:bCs/>
+          <w:i/>
+          <w:iCs/>
+        </w:rPr>
+        <w:t>computes</w:t>
+      </w:r>
+      <w:proofErr w:type="spellEnd"/>
+      <w:r>
+        <w:rPr>
+          <w:b/>
+          <w:bCs/>
+          <w:i/>
+          <w:iCs/>
+        </w:rPr>
+        <w:t xml:space="preserve"> </w:t>
+      </w:r>
+      <w:proofErr w:type="spellStart"/>
+      <w:r>
+        <w:rPr>
+          <w:b/>
+          <w:bCs/>
+          <w:i/>
+          <w:iCs/>
+        </w:rPr>
+        <w:t>the</w:t>
+      </w:r>
+      <w:proofErr w:type="spellEnd"/>
+      <w:r>
+        <w:rPr>
+          <w:b/>
+          <w:bCs/>
+          <w:i/>
+          <w:iCs/>
+        </w:rPr>
+        <w:t xml:space="preserve"> self-</w:t>
+      </w:r>
+      <w:proofErr w:type="spellStart"/>
+      <w:r>
+        <w:rPr>
+          <w:b/>
+          <w:bCs/>
+          <w:i/>
+          <w:iCs/>
+        </w:rPr>
+        <w:t>attention</w:t>
+      </w:r>
+      <w:proofErr w:type="spellEnd"/>
+      <w:r>
+        <w:rPr>
+          <w:b/>
+          <w:bCs/>
+          <w:i/>
+          <w:iCs/>
+        </w:rPr>
+        <w:t xml:space="preserve"> </w:t>
+      </w:r>
+      <w:proofErr w:type="spellStart"/>
+      <w:r>
+        <w:rPr>
+          <w:b/>
+          <w:bCs/>
+          <w:i/>
+          <w:iCs/>
+        </w:rPr>
+        <w:t>block</w:t>
+      </w:r>
+      <w:proofErr w:type="spellEnd"/>
+      <w:r>
+        <w:rPr>
+          <w:b/>
+          <w:bCs/>
+          <w:i/>
+          <w:iCs/>
+        </w:rPr>
+        <w:t xml:space="preserve"> of </w:t>
+      </w:r>
+      <w:proofErr w:type="spellStart"/>
+      <w:r>
+        <w:rPr>
+          <w:b/>
+          <w:bCs/>
+          <w:i/>
+          <w:iCs/>
+        </w:rPr>
+        <w:t>transformer</w:t>
+      </w:r>
+      <w:proofErr w:type="spellEnd"/>
+      <w:r>
+        <w:rPr>
+          <w:b/>
+          <w:bCs/>
+          <w:i/>
+          <w:iCs/>
+        </w:rPr>
+        <w:t xml:space="preserve"> </w:t>
+      </w:r>
+      <w:proofErr w:type="spellStart"/>
+      <w:r>
+        <w:rPr>
+          <w:b/>
+          <w:bCs/>
+          <w:i/>
+          <w:iCs/>
+        </w:rPr>
+        <w:t>models</w:t>
+      </w:r>
+      <w:proofErr w:type="spellEnd"/>
+      <w:r>
+        <w:rPr>
+          <w:b/>
+          <w:bCs/>
+          <w:i/>
+          <w:iCs/>
+        </w:rPr>
+        <w:t xml:space="preserve"> in hardware. </w:t>
+      </w:r>
+      <w:proofErr w:type="spellStart"/>
+      <w:r>
+        <w:rPr>
+          <w:b/>
+          <w:bCs/>
+          <w:i/>
+          <w:iCs/>
+        </w:rPr>
+        <w:t>The</w:t>
+      </w:r>
+      <w:proofErr w:type="spellEnd"/>
+      <w:r>
+        <w:rPr>
+          <w:b/>
+          <w:bCs/>
+          <w:i/>
+          <w:iCs/>
+        </w:rPr>
+        <w:t xml:space="preserve"> </w:t>
+      </w:r>
+      <w:proofErr w:type="spellStart"/>
+      <w:r>
+        <w:rPr>
+          <w:b/>
+          <w:bCs/>
+          <w:i/>
+          <w:iCs/>
+        </w:rPr>
+        <w:t>core</w:t>
+      </w:r>
+      <w:proofErr w:type="spellEnd"/>
+      <w:r>
+        <w:rPr>
+          <w:b/>
+          <w:bCs/>
+          <w:i/>
+          <w:iCs/>
+        </w:rPr>
+        <w:t xml:space="preserve"> </w:t>
+      </w:r>
+      <w:proofErr w:type="spellStart"/>
+      <w:r>
+        <w:rPr>
+          <w:b/>
+          <w:bCs/>
+          <w:i/>
+          <w:iCs/>
+        </w:rPr>
+        <w:t>implements</w:t>
+      </w:r>
+      <w:proofErr w:type="spellEnd"/>
+      <w:r>
+        <w:rPr>
+          <w:b/>
+          <w:bCs/>
+          <w:i/>
+          <w:iCs/>
+        </w:rPr>
+        <w:t xml:space="preserve"> a </w:t>
+      </w:r>
+      <w:proofErr w:type="spellStart"/>
+      <w:r>
+        <w:rPr>
+          <w:b/>
+          <w:bCs/>
+          <w:i/>
+          <w:iCs/>
+        </w:rPr>
+        <w:t>streaming</w:t>
+      </w:r>
+      <w:proofErr w:type="spellEnd"/>
+      <w:r>
+        <w:rPr>
+          <w:b/>
+          <w:bCs/>
+          <w:i/>
+          <w:iCs/>
+        </w:rPr>
+        <w:t>, AXI-</w:t>
+      </w:r>
+      <w:proofErr w:type="spellStart"/>
+      <w:r>
+        <w:rPr>
+          <w:b/>
+          <w:bCs/>
+          <w:i/>
+          <w:iCs/>
+        </w:rPr>
+        <w:t>Stream</w:t>
+      </w:r>
+      <w:proofErr w:type="spellEnd"/>
+      <w:r>
+        <w:rPr>
+          <w:b/>
+          <w:bCs/>
+          <w:i/>
+          <w:iCs/>
+        </w:rPr>
+        <w:t>-</w:t>
+      </w:r>
+      <w:proofErr w:type="spellStart"/>
+      <w:r>
+        <w:rPr>
+          <w:b/>
+          <w:bCs/>
+          <w:i/>
+          <w:iCs/>
+        </w:rPr>
+        <w:t>based</w:t>
+      </w:r>
+      <w:proofErr w:type="spellEnd"/>
+      <w:r>
+        <w:rPr>
+          <w:b/>
+          <w:bCs/>
+          <w:i/>
+          <w:iCs/>
+        </w:rPr>
+        <w:t xml:space="preserve"> </w:t>
+      </w:r>
+      <w:proofErr w:type="spellStart"/>
+      <w:r>
+        <w:rPr>
+          <w:b/>
+          <w:bCs/>
+          <w:i/>
+          <w:iCs/>
+        </w:rPr>
+        <w:t>datapath</w:t>
+      </w:r>
+      <w:proofErr w:type="spellEnd"/>
+      <w:r>
+        <w:rPr>
+          <w:b/>
+          <w:bCs/>
+          <w:i/>
+          <w:iCs/>
+        </w:rPr>
+        <w:t xml:space="preserve"> in bfloat16 (BF16) </w:t>
+      </w:r>
+      <w:proofErr w:type="spellStart"/>
+      <w:r>
+        <w:rPr>
+          <w:b/>
+          <w:bCs/>
+          <w:i/>
+          <w:iCs/>
+        </w:rPr>
+        <w:t>arithmetic</w:t>
+      </w:r>
+      <w:proofErr w:type="spellEnd"/>
+      <w:r>
+        <w:rPr>
+          <w:b/>
+          <w:bCs/>
+          <w:i/>
+          <w:iCs/>
+        </w:rPr>
+        <w:t xml:space="preserve">, </w:t>
+      </w:r>
+      <w:proofErr w:type="spellStart"/>
+      <w:r>
+        <w:rPr>
+          <w:b/>
+          <w:bCs/>
+          <w:i/>
+          <w:iCs/>
+        </w:rPr>
+        <w:t>and</w:t>
+      </w:r>
+      <w:proofErr w:type="spellEnd"/>
+      <w:r>
+        <w:rPr>
+          <w:b/>
+          <w:bCs/>
+          <w:i/>
+          <w:iCs/>
+        </w:rPr>
+        <w:t xml:space="preserve"> </w:t>
+      </w:r>
+      <w:proofErr w:type="spellStart"/>
+      <w:r>
+        <w:rPr>
+          <w:b/>
+          <w:bCs/>
+          <w:i/>
+          <w:iCs/>
+        </w:rPr>
+        <w:t>integrates</w:t>
+      </w:r>
+      <w:proofErr w:type="spellEnd"/>
+      <w:r>
+        <w:rPr>
+          <w:b/>
+          <w:bCs/>
+          <w:i/>
+          <w:iCs/>
+        </w:rPr>
+        <w:t xml:space="preserve"> </w:t>
+      </w:r>
+      <w:proofErr w:type="spellStart"/>
+      <w:r>
+        <w:rPr>
+          <w:b/>
+          <w:bCs/>
+          <w:i/>
+          <w:iCs/>
+        </w:rPr>
+        <w:t>Rotary</w:t>
+      </w:r>
+      <w:proofErr w:type="spellEnd"/>
+      <w:r>
+        <w:rPr>
+          <w:b/>
+          <w:bCs/>
+          <w:i/>
+          <w:iCs/>
+        </w:rPr>
+        <w:t xml:space="preserve"> </w:t>
+      </w:r>
+      <w:proofErr w:type="spellStart"/>
+      <w:r>
+        <w:rPr>
+          <w:b/>
+          <w:bCs/>
+          <w:i/>
+          <w:iCs/>
+        </w:rPr>
+        <w:t>Positional</w:t>
+      </w:r>
+      <w:proofErr w:type="spellEnd"/>
+      <w:r>
+        <w:rPr>
+          <w:b/>
+          <w:bCs/>
+          <w:i/>
+          <w:iCs/>
+        </w:rPr>
+        <w:t xml:space="preserve"> </w:t>
+      </w:r>
+      <w:proofErr w:type="spellStart"/>
+      <w:r>
+        <w:rPr>
+          <w:b/>
+          <w:bCs/>
+          <w:i/>
+          <w:iCs/>
+        </w:rPr>
+        <w:t>Encoding</w:t>
+      </w:r>
+      <w:proofErr w:type="spellEnd"/>
+      <w:r>
+        <w:rPr>
+          <w:b/>
+          <w:bCs/>
+          <w:i/>
+          <w:iCs/>
+        </w:rPr>
+        <w:t xml:space="preserve"> (</w:t>
+      </w:r>
+      <w:proofErr w:type="spellStart"/>
+      <w:r>
+        <w:rPr>
+          <w:b/>
+          <w:bCs/>
+          <w:i/>
+          <w:iCs/>
+        </w:rPr>
+        <w:t>RoPE</w:t>
+      </w:r>
+      <w:proofErr w:type="spellEnd"/>
+      <w:r>
+        <w:rPr>
+          <w:b/>
+          <w:bCs/>
+          <w:i/>
+          <w:iCs/>
+        </w:rPr>
+        <w:t xml:space="preserve">), </w:t>
+      </w:r>
+      <w:proofErr w:type="spellStart"/>
+      <w:r>
+        <w:rPr>
+          <w:b/>
+          <w:bCs/>
+          <w:i/>
+          <w:iCs/>
+        </w:rPr>
+        <w:t>Grouped</w:t>
+      </w:r>
+      <w:proofErr w:type="spellEnd"/>
+      <w:r>
+        <w:rPr>
+          <w:b/>
+          <w:bCs/>
+          <w:i/>
+          <w:iCs/>
+        </w:rPr>
+        <w:t xml:space="preserve"> Query </w:t>
+      </w:r>
+      <w:proofErr w:type="spellStart"/>
+      <w:r>
+        <w:rPr>
+          <w:b/>
+          <w:bCs/>
+          <w:i/>
+          <w:iCs/>
+        </w:rPr>
+        <w:t>Attention</w:t>
+      </w:r>
+      <w:proofErr w:type="spellEnd"/>
+      <w:r>
+        <w:rPr>
+          <w:b/>
+          <w:bCs/>
+          <w:i/>
+          <w:iCs/>
+        </w:rPr>
+        <w:t xml:space="preserve"> (GQA), </w:t>
+      </w:r>
+      <w:proofErr w:type="spellStart"/>
+      <w:r>
+        <w:rPr>
+          <w:b/>
+          <w:bCs/>
+          <w:i/>
+          <w:iCs/>
+        </w:rPr>
+        <w:t>and</w:t>
+      </w:r>
+      <w:proofErr w:type="spellEnd"/>
+      <w:r>
+        <w:rPr>
+          <w:b/>
+          <w:bCs/>
+          <w:i/>
+          <w:iCs/>
+        </w:rPr>
+        <w:t xml:space="preserve"> a time-</w:t>
+      </w:r>
+      <w:proofErr w:type="spellStart"/>
+      <w:r>
+        <w:rPr>
+          <w:b/>
+          <w:bCs/>
+          <w:i/>
+          <w:iCs/>
+        </w:rPr>
+        <w:t>shared</w:t>
+      </w:r>
+      <w:proofErr w:type="spellEnd"/>
+      <w:r>
+        <w:rPr>
+          <w:b/>
+          <w:bCs/>
+          <w:i/>
+          <w:iCs/>
+        </w:rPr>
+        <w:t xml:space="preserve"> </w:t>
+      </w:r>
+      <w:proofErr w:type="spellStart"/>
+      <w:r>
+        <w:rPr>
+          <w:b/>
+          <w:bCs/>
+          <w:i/>
+          <w:iCs/>
+        </w:rPr>
+        <w:t>systolic</w:t>
+      </w:r>
+      <w:proofErr w:type="spellEnd"/>
+      <w:r>
+        <w:rPr>
+          <w:b/>
+          <w:bCs/>
+          <w:i/>
+          <w:iCs/>
+        </w:rPr>
+        <w:t xml:space="preserve"> </w:t>
+      </w:r>
+      <w:proofErr w:type="spellStart"/>
+      <w:r>
+        <w:rPr>
+          <w:b/>
+          <w:bCs/>
+          <w:i/>
+          <w:iCs/>
+        </w:rPr>
+        <w:t>processing</w:t>
+      </w:r>
+      <w:proofErr w:type="spellEnd"/>
+      <w:r>
+        <w:rPr>
+          <w:b/>
+          <w:bCs/>
+          <w:i/>
+          <w:iCs/>
+        </w:rPr>
+        <w:t xml:space="preserve">-element (PE) </w:t>
+      </w:r>
+      <w:proofErr w:type="spellStart"/>
+      <w:r>
+        <w:rPr>
+          <w:b/>
+          <w:bCs/>
+          <w:i/>
+          <w:iCs/>
+        </w:rPr>
+        <w:t>array</w:t>
+      </w:r>
+      <w:proofErr w:type="spellEnd"/>
+      <w:r>
+        <w:rPr>
+          <w:b/>
+          <w:bCs/>
+          <w:i/>
+          <w:iCs/>
+        </w:rPr>
+        <w:t xml:space="preserve"> </w:t>
+      </w:r>
+      <w:proofErr w:type="spellStart"/>
+      <w:r>
+        <w:rPr>
+          <w:b/>
+          <w:bCs/>
+          <w:i/>
+          <w:iCs/>
+        </w:rPr>
+        <w:t>that</w:t>
+      </w:r>
+      <w:proofErr w:type="spellEnd"/>
+      <w:r>
+        <w:rPr>
+          <w:b/>
+          <w:bCs/>
+          <w:i/>
+          <w:iCs/>
+        </w:rPr>
+        <w:t xml:space="preserve"> </w:t>
+      </w:r>
+      <w:proofErr w:type="spellStart"/>
+      <w:r>
+        <w:rPr>
+          <w:b/>
+          <w:bCs/>
+          <w:i/>
+          <w:iCs/>
+        </w:rPr>
+        <w:t>performs</w:t>
+      </w:r>
+      <w:proofErr w:type="spellEnd"/>
+      <w:r>
+        <w:rPr>
+          <w:b/>
+          <w:bCs/>
+          <w:i/>
+          <w:iCs/>
+        </w:rPr>
+        <w:t xml:space="preserve"> </w:t>
+      </w:r>
+      <w:proofErr w:type="spellStart"/>
+      <w:r>
+        <w:rPr>
+          <w:b/>
+          <w:bCs/>
+          <w:i/>
+          <w:iCs/>
+        </w:rPr>
+        <w:t>both</w:t>
+      </w:r>
+      <w:proofErr w:type="spellEnd"/>
+      <w:r>
+        <w:rPr>
+          <w:b/>
+          <w:bCs/>
+          <w:i/>
+          <w:iCs/>
+        </w:rPr>
+        <w:t xml:space="preserve"> </w:t>
+      </w:r>
+      <w:proofErr w:type="spellStart"/>
+      <w:r>
+        <w:rPr>
+          <w:b/>
+          <w:bCs/>
+          <w:i/>
+          <w:iCs/>
+        </w:rPr>
+        <w:t>the</w:t>
+      </w:r>
+      <w:proofErr w:type="spellEnd"/>
+      <w:r>
+        <w:rPr>
+          <w:b/>
+          <w:bCs/>
+          <w:i/>
+          <w:iCs/>
+        </w:rPr>
+        <w:t xml:space="preserve"> Q·Kᵀ </w:t>
+      </w:r>
+      <w:proofErr w:type="spellStart"/>
+      <w:r>
+        <w:rPr>
+          <w:b/>
+          <w:bCs/>
+          <w:i/>
+          <w:iCs/>
+        </w:rPr>
+        <w:t>similarity</w:t>
+      </w:r>
+      <w:proofErr w:type="spellEnd"/>
+      <w:r>
+        <w:rPr>
+          <w:b/>
+          <w:bCs/>
+          <w:i/>
+          <w:iCs/>
+        </w:rPr>
+        <w:t xml:space="preserve"> </w:t>
+      </w:r>
+      <w:proofErr w:type="spellStart"/>
+      <w:r>
+        <w:rPr>
+          <w:b/>
+          <w:bCs/>
+          <w:i/>
+          <w:iCs/>
+        </w:rPr>
+        <w:t>computation</w:t>
+      </w:r>
+      <w:proofErr w:type="spellEnd"/>
+      <w:r>
+        <w:rPr>
+          <w:b/>
+          <w:bCs/>
+          <w:i/>
+          <w:iCs/>
+        </w:rPr>
+        <w:t xml:space="preserve"> </w:t>
+      </w:r>
+      <w:proofErr w:type="spellStart"/>
+      <w:r>
+        <w:rPr>
+          <w:b/>
+          <w:bCs/>
+          <w:i/>
+          <w:iCs/>
+        </w:rPr>
+        <w:t>and</w:t>
+      </w:r>
+      <w:proofErr w:type="spellEnd"/>
+      <w:r>
+        <w:rPr>
+          <w:b/>
+          <w:bCs/>
+          <w:i/>
+          <w:iCs/>
+        </w:rPr>
+        <w:t xml:space="preserve"> </w:t>
+      </w:r>
+      <w:proofErr w:type="spellStart"/>
+      <w:r>
+        <w:rPr>
+          <w:b/>
+          <w:bCs/>
+          <w:i/>
+          <w:iCs/>
+        </w:rPr>
+        <w:t>the</w:t>
+      </w:r>
+      <w:proofErr w:type="spellEnd"/>
+      <w:r>
+        <w:rPr>
+          <w:b/>
+          <w:bCs/>
+          <w:i/>
+          <w:iCs/>
+        </w:rPr>
+        <w:t xml:space="preserve"> </w:t>
+      </w:r>
+      <w:proofErr w:type="spellStart"/>
+      <w:r>
+        <w:rPr>
+          <w:b/>
+          <w:bCs/>
+          <w:i/>
+          <w:iCs/>
+        </w:rPr>
+        <w:t>score·V</w:t>
+      </w:r>
+      <w:proofErr w:type="spellEnd"/>
+      <w:r>
+        <w:rPr>
+          <w:b/>
+          <w:bCs/>
+          <w:i/>
+          <w:iCs/>
+        </w:rPr>
+        <w:t xml:space="preserve"> </w:t>
+      </w:r>
+      <w:proofErr w:type="spellStart"/>
+      <w:r>
+        <w:rPr>
+          <w:b/>
+          <w:bCs/>
+          <w:i/>
+          <w:iCs/>
+        </w:rPr>
+        <w:t>reduction</w:t>
+      </w:r>
+      <w:proofErr w:type="spellEnd"/>
+      <w:r>
+        <w:rPr>
+          <w:b/>
+          <w:bCs/>
+          <w:i/>
+          <w:iCs/>
+        </w:rPr>
+        <w:t xml:space="preserve"> on </w:t>
+      </w:r>
+      <w:proofErr w:type="spellStart"/>
+      <w:r>
+        <w:rPr>
+          <w:b/>
+          <w:bCs/>
+          <w:i/>
+          <w:iCs/>
+        </w:rPr>
+        <w:t>the</w:t>
+      </w:r>
+      <w:proofErr w:type="spellEnd"/>
+      <w:r>
+        <w:rPr>
+          <w:b/>
+          <w:bCs/>
+          <w:i/>
+          <w:iCs/>
+        </w:rPr>
+        <w:t xml:space="preserve"> </w:t>
+      </w:r>
+      <w:proofErr w:type="spellStart"/>
+      <w:r>
+        <w:rPr>
+          <w:b/>
+          <w:bCs/>
+          <w:i/>
+          <w:iCs/>
+        </w:rPr>
+        <w:t>same</w:t>
+      </w:r>
+      <w:proofErr w:type="spellEnd"/>
+      <w:r>
+        <w:rPr>
+          <w:b/>
+          <w:bCs/>
+          <w:i/>
+          <w:iCs/>
+        </w:rPr>
+        <w:t xml:space="preserve"> </w:t>
+      </w:r>
+      <w:proofErr w:type="spellStart"/>
+      <w:r>
+        <w:rPr>
+          <w:b/>
+          <w:bCs/>
+          <w:i/>
+          <w:iCs/>
+        </w:rPr>
+        <w:t>physical</w:t>
+      </w:r>
+      <w:proofErr w:type="spellEnd"/>
+      <w:r>
+        <w:rPr>
+          <w:b/>
+          <w:bCs/>
+          <w:i/>
+          <w:iCs/>
+        </w:rPr>
+        <w:t xml:space="preserve"> hardware. Resource </w:t>
+      </w:r>
+      <w:proofErr w:type="spellStart"/>
+      <w:r>
+        <w:rPr>
+          <w:b/>
+          <w:bCs/>
+          <w:i/>
+          <w:iCs/>
+        </w:rPr>
+        <w:t>efficiency</w:t>
+      </w:r>
+      <w:proofErr w:type="spellEnd"/>
+      <w:r>
+        <w:rPr>
+          <w:b/>
+          <w:bCs/>
+          <w:i/>
+          <w:iCs/>
+        </w:rPr>
+        <w:t xml:space="preserve"> is </w:t>
+      </w:r>
+      <w:proofErr w:type="spellStart"/>
+      <w:r>
+        <w:rPr>
+          <w:b/>
+          <w:bCs/>
+          <w:i/>
+          <w:iCs/>
+        </w:rPr>
+        <w:t>achieved</w:t>
+      </w:r>
+      <w:proofErr w:type="spellEnd"/>
+      <w:r>
+        <w:rPr>
+          <w:b/>
+          <w:bCs/>
+          <w:i/>
+          <w:iCs/>
+        </w:rPr>
+        <w:t xml:space="preserve"> </w:t>
+      </w:r>
+      <w:proofErr w:type="spellStart"/>
+      <w:r>
+        <w:rPr>
+          <w:b/>
+          <w:bCs/>
+          <w:i/>
+          <w:iCs/>
+        </w:rPr>
+        <w:t>through</w:t>
+      </w:r>
+      <w:proofErr w:type="spellEnd"/>
+      <w:r>
+        <w:rPr>
+          <w:b/>
+          <w:bCs/>
+          <w:i/>
+          <w:iCs/>
+        </w:rPr>
+        <w:t xml:space="preserve"> </w:t>
+      </w:r>
+      <w:proofErr w:type="spellStart"/>
+      <w:r>
+        <w:rPr>
+          <w:b/>
+          <w:bCs/>
+          <w:i/>
+          <w:iCs/>
+        </w:rPr>
+        <w:t>ping-pong</w:t>
+      </w:r>
+      <w:proofErr w:type="spellEnd"/>
+      <w:r>
+        <w:rPr>
+          <w:b/>
+          <w:bCs/>
+          <w:i/>
+          <w:iCs/>
+        </w:rPr>
+        <w:t xml:space="preserve"> </w:t>
+      </w:r>
+      <w:proofErr w:type="spellStart"/>
+      <w:r>
+        <w:rPr>
+          <w:b/>
+          <w:bCs/>
+          <w:i/>
+          <w:iCs/>
+        </w:rPr>
+        <w:t>double</w:t>
+      </w:r>
+      <w:proofErr w:type="spellEnd"/>
+      <w:r>
+        <w:rPr>
+          <w:b/>
+          <w:bCs/>
+          <w:i/>
+          <w:iCs/>
+        </w:rPr>
+        <w:t xml:space="preserve"> </w:t>
+      </w:r>
+      <w:proofErr w:type="spellStart"/>
+      <w:r>
+        <w:rPr>
+          <w:b/>
+          <w:bCs/>
+          <w:i/>
+          <w:iCs/>
+        </w:rPr>
+        <w:t>buffering</w:t>
+      </w:r>
+      <w:proofErr w:type="spellEnd"/>
+      <w:r>
+        <w:rPr>
+          <w:b/>
+          <w:bCs/>
+          <w:i/>
+          <w:iCs/>
+        </w:rPr>
+        <w:t xml:space="preserve">, </w:t>
+      </w:r>
+      <w:proofErr w:type="spellStart"/>
+      <w:r>
+        <w:rPr>
+          <w:b/>
+          <w:bCs/>
+          <w:i/>
+          <w:iCs/>
+        </w:rPr>
+        <w:t>valid</w:t>
+      </w:r>
+      <w:proofErr w:type="spellEnd"/>
+      <w:r>
+        <w:rPr>
+          <w:b/>
+          <w:bCs/>
+          <w:i/>
+          <w:iCs/>
+        </w:rPr>
+        <w:t>/</w:t>
+      </w:r>
+      <w:proofErr w:type="spellStart"/>
+      <w:r>
+        <w:rPr>
+          <w:b/>
+          <w:bCs/>
+          <w:i/>
+          <w:iCs/>
+        </w:rPr>
+        <w:t>ready</w:t>
+      </w:r>
+      <w:proofErr w:type="spellEnd"/>
+      <w:r>
+        <w:rPr>
+          <w:b/>
+          <w:bCs/>
+          <w:i/>
+          <w:iCs/>
+        </w:rPr>
+        <w:t xml:space="preserve"> </w:t>
+      </w:r>
+      <w:proofErr w:type="spellStart"/>
+      <w:r>
+        <w:rPr>
+          <w:b/>
+          <w:bCs/>
+          <w:i/>
+          <w:iCs/>
+        </w:rPr>
+        <w:t>handshaking</w:t>
+      </w:r>
+      <w:proofErr w:type="spellEnd"/>
+      <w:r>
+        <w:rPr>
+          <w:b/>
+          <w:bCs/>
+          <w:i/>
+          <w:iCs/>
+        </w:rPr>
+        <w:t xml:space="preserve"> </w:t>
+      </w:r>
+      <w:proofErr w:type="spellStart"/>
+      <w:r>
+        <w:rPr>
+          <w:b/>
+          <w:bCs/>
+          <w:i/>
+          <w:iCs/>
+        </w:rPr>
+        <w:t>throughout</w:t>
+      </w:r>
+      <w:proofErr w:type="spellEnd"/>
+      <w:r>
+        <w:rPr>
+          <w:b/>
+          <w:bCs/>
+          <w:i/>
+          <w:iCs/>
+        </w:rPr>
+        <w:t xml:space="preserve">, </w:t>
+      </w:r>
+      <w:proofErr w:type="spellStart"/>
+      <w:r>
+        <w:rPr>
+          <w:b/>
+          <w:bCs/>
+          <w:i/>
+          <w:iCs/>
+        </w:rPr>
+        <w:t>and</w:t>
+      </w:r>
+      <w:proofErr w:type="spellEnd"/>
+      <w:r>
+        <w:rPr>
+          <w:b/>
+          <w:bCs/>
+          <w:i/>
+          <w:iCs/>
+        </w:rPr>
+        <w:t xml:space="preserve"> </w:t>
+      </w:r>
+      <w:proofErr w:type="spellStart"/>
+      <w:r>
+        <w:rPr>
+          <w:b/>
+          <w:bCs/>
+          <w:i/>
+          <w:iCs/>
+        </w:rPr>
+        <w:t>arbitrated</w:t>
+      </w:r>
+      <w:proofErr w:type="spellEnd"/>
+      <w:r>
+        <w:rPr>
+          <w:b/>
+          <w:bCs/>
+          <w:i/>
+          <w:iCs/>
+        </w:rPr>
+        <w:t xml:space="preserve"> </w:t>
+      </w:r>
+      <w:proofErr w:type="spellStart"/>
+      <w:r>
+        <w:rPr>
+          <w:b/>
+          <w:bCs/>
+          <w:i/>
+          <w:iCs/>
+        </w:rPr>
+        <w:t>sharing</w:t>
+      </w:r>
+      <w:proofErr w:type="spellEnd"/>
+      <w:r>
+        <w:rPr>
+          <w:b/>
+          <w:bCs/>
+          <w:i/>
+          <w:iCs/>
+        </w:rPr>
+        <w:t xml:space="preserve"> of </w:t>
+      </w:r>
+      <w:proofErr w:type="spellStart"/>
+      <w:r>
+        <w:rPr>
+          <w:b/>
+          <w:bCs/>
+          <w:i/>
+          <w:iCs/>
+        </w:rPr>
+        <w:t>the</w:t>
+      </w:r>
+      <w:proofErr w:type="spellEnd"/>
+      <w:r>
+        <w:rPr>
+          <w:b/>
+          <w:bCs/>
+          <w:i/>
+          <w:iCs/>
+        </w:rPr>
+        <w:t xml:space="preserve"> </w:t>
+      </w:r>
+      <w:proofErr w:type="spellStart"/>
+      <w:r>
+        <w:rPr>
+          <w:b/>
+          <w:bCs/>
+          <w:i/>
+          <w:iCs/>
+        </w:rPr>
+        <w:t>most</w:t>
+      </w:r>
+      <w:proofErr w:type="spellEnd"/>
+      <w:r>
+        <w:rPr>
+          <w:b/>
+          <w:bCs/>
+          <w:i/>
+          <w:iCs/>
+        </w:rPr>
+        <w:t xml:space="preserve"> </w:t>
+      </w:r>
+      <w:proofErr w:type="spellStart"/>
+      <w:r>
+        <w:rPr>
+          <w:b/>
+          <w:bCs/>
+          <w:i/>
+          <w:iCs/>
+        </w:rPr>
+        <w:t>expensive</w:t>
+      </w:r>
+      <w:proofErr w:type="spellEnd"/>
+      <w:r>
+        <w:rPr>
+          <w:b/>
+          <w:bCs/>
+          <w:i/>
+          <w:iCs/>
+        </w:rPr>
+        <w:t xml:space="preserve"> </w:t>
+      </w:r>
+      <w:proofErr w:type="spellStart"/>
+      <w:r>
+        <w:rPr>
+          <w:b/>
+          <w:bCs/>
+          <w:i/>
+          <w:iCs/>
+        </w:rPr>
+        <w:t>multiply-accumulate</w:t>
+      </w:r>
+      <w:proofErr w:type="spellEnd"/>
+      <w:r>
+        <w:rPr>
+          <w:b/>
+          <w:bCs/>
+          <w:i/>
+          <w:iCs/>
+        </w:rPr>
+        <w:t xml:space="preserve"> (MAC) </w:t>
+      </w:r>
+      <w:proofErr w:type="spellStart"/>
+      <w:r>
+        <w:rPr>
+          <w:b/>
+          <w:bCs/>
+          <w:i/>
+          <w:iCs/>
+        </w:rPr>
+        <w:t>resource</w:t>
+      </w:r>
+      <w:proofErr w:type="spellEnd"/>
+      <w:r>
+        <w:rPr>
+          <w:b/>
+          <w:bCs/>
+          <w:i/>
+          <w:iCs/>
+        </w:rPr>
+        <w:t xml:space="preserve">. </w:t>
+      </w:r>
+      <w:proofErr w:type="spellStart"/>
+      <w:r>
+        <w:rPr>
+          <w:b/>
+          <w:bCs/>
+          <w:i/>
+          <w:iCs/>
+        </w:rPr>
+        <w:t>The</w:t>
+      </w:r>
+      <w:proofErr w:type="spellEnd"/>
+      <w:r>
+        <w:rPr>
+          <w:b/>
+          <w:bCs/>
+          <w:i/>
+          <w:iCs/>
+        </w:rPr>
+        <w:t xml:space="preserve"> </w:t>
+      </w:r>
+      <w:proofErr w:type="spellStart"/>
+      <w:r>
+        <w:rPr>
+          <w:b/>
+          <w:bCs/>
+          <w:i/>
+          <w:iCs/>
+        </w:rPr>
+        <w:t>design</w:t>
+      </w:r>
+      <w:proofErr w:type="spellEnd"/>
+      <w:r>
+        <w:rPr>
+          <w:b/>
+          <w:bCs/>
+          <w:i/>
+          <w:iCs/>
+        </w:rPr>
+        <w:t xml:space="preserve"> </w:t>
+      </w:r>
+      <w:proofErr w:type="spellStart"/>
+      <w:r>
+        <w:rPr>
+          <w:b/>
+          <w:bCs/>
+          <w:i/>
+          <w:iCs/>
+        </w:rPr>
+        <w:t>comprises</w:t>
+      </w:r>
+      <w:proofErr w:type="spellEnd"/>
+      <w:r>
+        <w:rPr>
+          <w:b/>
+          <w:bCs/>
+          <w:i/>
+          <w:iCs/>
+        </w:rPr>
+        <w:t xml:space="preserve"> </w:t>
+      </w:r>
+      <w:proofErr w:type="spellStart"/>
+      <w:r>
+        <w:rPr>
+          <w:b/>
+          <w:bCs/>
+          <w:i/>
+          <w:iCs/>
+        </w:rPr>
+        <w:t>more</w:t>
+      </w:r>
+      <w:proofErr w:type="spellEnd"/>
+      <w:r>
+        <w:rPr>
+          <w:b/>
+          <w:bCs/>
+          <w:i/>
+          <w:iCs/>
+        </w:rPr>
+        <w:t xml:space="preserve"> </w:t>
+      </w:r>
+      <w:proofErr w:type="spellStart"/>
+      <w:r>
+        <w:rPr>
+          <w:b/>
+          <w:bCs/>
+          <w:i/>
+          <w:iCs/>
+        </w:rPr>
+        <w:t>than</w:t>
+      </w:r>
+      <w:proofErr w:type="spellEnd"/>
+      <w:r>
+        <w:rPr>
+          <w:b/>
+          <w:bCs/>
+          <w:i/>
+          <w:iCs/>
+        </w:rPr>
+        <w:t xml:space="preserve"> </w:t>
+      </w:r>
+      <w:proofErr w:type="spellStart"/>
+      <w:r>
+        <w:rPr>
+          <w:b/>
+          <w:bCs/>
+          <w:i/>
+          <w:iCs/>
+        </w:rPr>
+        <w:t>fifteen</w:t>
+      </w:r>
+      <w:proofErr w:type="spellEnd"/>
+      <w:r>
+        <w:rPr>
+          <w:b/>
+          <w:bCs/>
+          <w:i/>
+          <w:iCs/>
+        </w:rPr>
+        <w:t xml:space="preserve"> RTL </w:t>
+      </w:r>
+      <w:proofErr w:type="spellStart"/>
+      <w:r>
+        <w:rPr>
+          <w:b/>
+          <w:bCs/>
+          <w:i/>
+          <w:iCs/>
+        </w:rPr>
+        <w:t>modules</w:t>
+      </w:r>
+      <w:proofErr w:type="spellEnd"/>
+      <w:r>
+        <w:rPr>
+          <w:b/>
+          <w:bCs/>
+          <w:i/>
+          <w:iCs/>
+        </w:rPr>
+        <w:t xml:space="preserve">, </w:t>
+      </w:r>
+      <w:proofErr w:type="spellStart"/>
+      <w:r>
+        <w:rPr>
+          <w:b/>
+          <w:bCs/>
+          <w:i/>
+          <w:iCs/>
+        </w:rPr>
+        <w:t>each</w:t>
+      </w:r>
+      <w:proofErr w:type="spellEnd"/>
+      <w:r>
+        <w:rPr>
+          <w:b/>
+          <w:bCs/>
+          <w:i/>
+          <w:iCs/>
+        </w:rPr>
+        <w:t xml:space="preserve"> </w:t>
+      </w:r>
+      <w:proofErr w:type="spellStart"/>
+      <w:r>
+        <w:rPr>
+          <w:b/>
+          <w:bCs/>
+          <w:i/>
+          <w:iCs/>
+        </w:rPr>
+        <w:t>validated</w:t>
+      </w:r>
+      <w:proofErr w:type="spellEnd"/>
+      <w:r>
+        <w:rPr>
+          <w:b/>
+          <w:bCs/>
+          <w:i/>
+          <w:iCs/>
+        </w:rPr>
+        <w:t xml:space="preserve"> </w:t>
+      </w:r>
+      <w:proofErr w:type="spellStart"/>
+      <w:r>
+        <w:rPr>
+          <w:b/>
+          <w:bCs/>
+          <w:i/>
+          <w:iCs/>
+        </w:rPr>
+        <w:t>by</w:t>
+      </w:r>
+      <w:proofErr w:type="spellEnd"/>
+      <w:r>
+        <w:rPr>
+          <w:b/>
+          <w:bCs/>
+          <w:i/>
+          <w:iCs/>
+        </w:rPr>
+        <w:t xml:space="preserve"> a </w:t>
+      </w:r>
+      <w:proofErr w:type="spellStart"/>
+      <w:r>
+        <w:rPr>
+          <w:b/>
+          <w:bCs/>
+          <w:i/>
+          <w:iCs/>
+        </w:rPr>
+        <w:t>standalone</w:t>
+      </w:r>
+      <w:proofErr w:type="spellEnd"/>
+      <w:r>
+        <w:rPr>
+          <w:b/>
+          <w:bCs/>
+          <w:i/>
+          <w:iCs/>
+        </w:rPr>
+        <w:t>, self-</w:t>
+      </w:r>
+      <w:proofErr w:type="spellStart"/>
+      <w:r>
+        <w:rPr>
+          <w:b/>
+          <w:bCs/>
+          <w:i/>
+          <w:iCs/>
+        </w:rPr>
+        <w:t>checking</w:t>
+      </w:r>
+      <w:proofErr w:type="spellEnd"/>
+      <w:r>
+        <w:rPr>
+          <w:b/>
+          <w:bCs/>
+          <w:i/>
+          <w:iCs/>
+        </w:rPr>
+        <w:t xml:space="preserve"> </w:t>
+      </w:r>
+      <w:proofErr w:type="spellStart"/>
+      <w:r>
+        <w:rPr>
+          <w:b/>
+          <w:bCs/>
+          <w:i/>
+          <w:iCs/>
+        </w:rPr>
+        <w:t>testbench</w:t>
+      </w:r>
+      <w:proofErr w:type="spellEnd"/>
+      <w:r>
+        <w:rPr>
+          <w:b/>
+          <w:bCs/>
+          <w:i/>
+          <w:iCs/>
+        </w:rPr>
+        <w:t xml:space="preserve">. </w:t>
+      </w:r>
+      <w:proofErr w:type="spellStart"/>
+      <w:r>
+        <w:rPr>
+          <w:b/>
+          <w:bCs/>
+          <w:i/>
+          <w:iCs/>
+        </w:rPr>
+        <w:t>All</w:t>
+      </w:r>
+      <w:proofErr w:type="spellEnd"/>
+      <w:r>
+        <w:rPr>
+          <w:b/>
+          <w:bCs/>
+          <w:i/>
+          <w:iCs/>
+        </w:rPr>
+        <w:t xml:space="preserve"> seven </w:t>
+      </w:r>
+      <w:proofErr w:type="spellStart"/>
+      <w:r>
+        <w:rPr>
+          <w:b/>
+          <w:bCs/>
+          <w:i/>
+          <w:iCs/>
+        </w:rPr>
+        <w:t>testbenches</w:t>
+      </w:r>
+      <w:proofErr w:type="spellEnd"/>
+      <w:r>
+        <w:rPr>
+          <w:b/>
+          <w:bCs/>
+          <w:i/>
+          <w:iCs/>
+        </w:rPr>
+        <w:t xml:space="preserve"> </w:t>
+      </w:r>
+      <w:proofErr w:type="spellStart"/>
+      <w:r>
+        <w:rPr>
+          <w:b/>
+          <w:bCs/>
+          <w:i/>
+          <w:iCs/>
+        </w:rPr>
+        <w:t>pass</w:t>
+      </w:r>
+      <w:proofErr w:type="spellEnd"/>
+      <w:r>
+        <w:rPr>
+          <w:b/>
+          <w:bCs/>
+          <w:i/>
+          <w:iCs/>
+        </w:rPr>
+        <w:t xml:space="preserve">, </w:t>
+      </w:r>
+      <w:proofErr w:type="spellStart"/>
+      <w:r>
+        <w:rPr>
+          <w:b/>
+          <w:bCs/>
+          <w:i/>
+          <w:iCs/>
+        </w:rPr>
+        <w:t>and</w:t>
+      </w:r>
+      <w:proofErr w:type="spellEnd"/>
+      <w:r>
+        <w:rPr>
+          <w:b/>
+          <w:bCs/>
+          <w:i/>
+          <w:iCs/>
+        </w:rPr>
+        <w:t xml:space="preserve"> post-</w:t>
+      </w:r>
+      <w:proofErr w:type="spellStart"/>
+      <w:r>
+        <w:rPr>
+          <w:b/>
+          <w:bCs/>
+          <w:i/>
+          <w:iCs/>
+        </w:rPr>
+        <w:t>implementation</w:t>
+      </w:r>
+      <w:proofErr w:type="spellEnd"/>
+      <w:r>
+        <w:rPr>
+          <w:b/>
+          <w:bCs/>
+          <w:i/>
+          <w:iCs/>
+        </w:rPr>
+        <w:t xml:space="preserve"> </w:t>
+      </w:r>
+      <w:proofErr w:type="spellStart"/>
+      <w:r>
+        <w:rPr>
+          <w:b/>
+          <w:bCs/>
+          <w:i/>
+          <w:iCs/>
+        </w:rPr>
+        <w:t>synthesis</w:t>
+      </w:r>
+      <w:proofErr w:type="spellEnd"/>
+      <w:r>
+        <w:rPr>
+          <w:b/>
+          <w:bCs/>
+          <w:i/>
+          <w:iCs/>
+        </w:rPr>
+        <w:t xml:space="preserve"> on a </w:t>
+      </w:r>
+      <w:proofErr w:type="spellStart"/>
+      <w:r>
+        <w:rPr>
+          <w:b/>
+          <w:bCs/>
+          <w:i/>
+          <w:iCs/>
+        </w:rPr>
+        <w:t>Xilinx</w:t>
+      </w:r>
+      <w:proofErr w:type="spellEnd"/>
+      <w:r>
+        <w:rPr>
+          <w:b/>
+          <w:bCs/>
+          <w:i/>
+          <w:iCs/>
+        </w:rPr>
+        <w:t xml:space="preserve"> Artix-7 </w:t>
+      </w:r>
+      <w:proofErr w:type="spellStart"/>
+      <w:r>
+        <w:rPr>
+          <w:b/>
+          <w:bCs/>
+          <w:i/>
+          <w:iCs/>
+        </w:rPr>
+        <w:t>device</w:t>
+      </w:r>
+      <w:proofErr w:type="spellEnd"/>
+      <w:r>
+        <w:rPr>
+          <w:b/>
+          <w:bCs/>
+          <w:i/>
+          <w:iCs/>
+        </w:rPr>
+        <w:t xml:space="preserve"> </w:t>
+      </w:r>
+      <w:proofErr w:type="spellStart"/>
+      <w:r>
+        <w:rPr>
+          <w:b/>
+          <w:bCs/>
+          <w:i/>
+          <w:iCs/>
+        </w:rPr>
+        <w:t>measures</w:t>
+      </w:r>
+      <w:proofErr w:type="spellEnd"/>
+      <w:r>
+        <w:rPr>
+          <w:b/>
+          <w:bCs/>
+          <w:i/>
+          <w:iCs/>
+        </w:rPr>
+        <w:t xml:space="preserve"> 1,486 </w:t>
+      </w:r>
+      <w:proofErr w:type="spellStart"/>
+      <w:r>
+        <w:rPr>
+          <w:b/>
+          <w:bCs/>
+          <w:i/>
+          <w:iCs/>
+        </w:rPr>
+        <w:t>LUTs</w:t>
+      </w:r>
+      <w:proofErr w:type="spellEnd"/>
+      <w:r>
+        <w:rPr>
+          <w:b/>
+          <w:bCs/>
+          <w:i/>
+          <w:iCs/>
+        </w:rPr>
+        <w:t xml:space="preserve">, 510 </w:t>
+      </w:r>
+      <w:proofErr w:type="spellStart"/>
+      <w:r>
+        <w:rPr>
+          <w:b/>
+          <w:bCs/>
+          <w:i/>
+          <w:iCs/>
+        </w:rPr>
+        <w:t>flip-flops</w:t>
+      </w:r>
+      <w:proofErr w:type="spellEnd"/>
+      <w:r>
+        <w:rPr>
+          <w:b/>
+          <w:bCs/>
+          <w:i/>
+          <w:iCs/>
+        </w:rPr>
+        <w:t xml:space="preserve">, </w:t>
+      </w:r>
+      <w:proofErr w:type="spellStart"/>
+      <w:r>
+        <w:rPr>
+          <w:b/>
+          <w:bCs/>
+          <w:i/>
+          <w:iCs/>
+        </w:rPr>
+        <w:t>and</w:t>
+      </w:r>
+      <w:proofErr w:type="spellEnd"/>
+      <w:r>
+        <w:rPr>
+          <w:b/>
+          <w:bCs/>
+          <w:i/>
+          <w:iCs/>
+        </w:rPr>
+        <w:t xml:space="preserve"> </w:t>
+      </w:r>
+      <w:proofErr w:type="spellStart"/>
+      <w:r>
+        <w:rPr>
+          <w:b/>
+          <w:bCs/>
+          <w:i/>
+          <w:iCs/>
+        </w:rPr>
+        <w:t>zero</w:t>
+      </w:r>
+      <w:proofErr w:type="spellEnd"/>
+      <w:r>
+        <w:rPr>
+          <w:b/>
+          <w:bCs/>
+          <w:i/>
+          <w:iCs/>
+        </w:rPr>
+        <w:t xml:space="preserve"> DSP </w:t>
+      </w:r>
+      <w:proofErr w:type="spellStart"/>
+      <w:r>
+        <w:rPr>
+          <w:b/>
+          <w:bCs/>
+          <w:i/>
+          <w:iCs/>
+        </w:rPr>
+        <w:t>or</w:t>
+      </w:r>
+      <w:proofErr w:type="spellEnd"/>
+      <w:r>
+        <w:rPr>
+          <w:b/>
+          <w:bCs/>
+          <w:i/>
+          <w:iCs/>
+        </w:rPr>
+        <w:t xml:space="preserve"> </w:t>
+      </w:r>
+      <w:proofErr w:type="spellStart"/>
+      <w:r>
+        <w:rPr>
+          <w:b/>
+          <w:bCs/>
+          <w:i/>
+          <w:iCs/>
+        </w:rPr>
+        <w:t>Block</w:t>
+      </w:r>
+      <w:proofErr w:type="spellEnd"/>
+      <w:r>
+        <w:rPr>
+          <w:b/>
+          <w:bCs/>
+          <w:i/>
+          <w:iCs/>
+        </w:rPr>
+        <w:t xml:space="preserve"> RAM </w:t>
+      </w:r>
+      <w:proofErr w:type="spellStart"/>
+      <w:r>
+        <w:rPr>
+          <w:b/>
+          <w:bCs/>
+          <w:i/>
+          <w:iCs/>
+        </w:rPr>
+        <w:t>usage</w:t>
+      </w:r>
+      <w:proofErr w:type="spellEnd"/>
+      <w:r>
+        <w:rPr>
+          <w:b/>
+          <w:bCs/>
+          <w:i/>
+          <w:iCs/>
+        </w:rPr>
+        <w:t xml:space="preserve">. A </w:t>
+      </w:r>
+      <w:proofErr w:type="spellStart"/>
+      <w:r>
+        <w:rPr>
+          <w:b/>
+          <w:bCs/>
+          <w:i/>
+          <w:iCs/>
+        </w:rPr>
+        <w:t>full</w:t>
+      </w:r>
+      <w:proofErr w:type="spellEnd"/>
+      <w:r>
+        <w:rPr>
+          <w:b/>
+          <w:bCs/>
+          <w:i/>
+          <w:iCs/>
+        </w:rPr>
+        <w:t xml:space="preserve"> </w:t>
+      </w:r>
+      <w:proofErr w:type="spellStart"/>
+      <w:r>
+        <w:rPr>
+          <w:b/>
+          <w:bCs/>
+          <w:i/>
+          <w:iCs/>
+        </w:rPr>
+        <w:t>end-to-end</w:t>
+      </w:r>
+      <w:proofErr w:type="spellEnd"/>
+      <w:r>
+        <w:rPr>
+          <w:b/>
+          <w:bCs/>
+          <w:i/>
+          <w:iCs/>
+        </w:rPr>
+        <w:t>, top-</w:t>
+      </w:r>
+      <w:proofErr w:type="spellStart"/>
+      <w:r>
+        <w:rPr>
+          <w:b/>
+          <w:bCs/>
+          <w:i/>
+          <w:iCs/>
+        </w:rPr>
+        <w:t>level</w:t>
+      </w:r>
+      <w:proofErr w:type="spellEnd"/>
+      <w:r>
+        <w:rPr>
+          <w:b/>
+          <w:bCs/>
+          <w:i/>
+          <w:iCs/>
+        </w:rPr>
+        <w:t xml:space="preserve"> </w:t>
+      </w:r>
+      <w:proofErr w:type="spellStart"/>
+      <w:r>
+        <w:rPr>
+          <w:b/>
+          <w:bCs/>
+          <w:i/>
+          <w:iCs/>
+        </w:rPr>
+        <w:t>simulation</w:t>
+      </w:r>
+      <w:proofErr w:type="spellEnd"/>
+      <w:r>
+        <w:rPr>
+          <w:b/>
+          <w:bCs/>
+          <w:i/>
+          <w:iCs/>
+        </w:rPr>
+        <w:t xml:space="preserve"> of </w:t>
+      </w:r>
+      <w:proofErr w:type="spellStart"/>
+      <w:r>
+        <w:rPr>
+          <w:b/>
+          <w:bCs/>
+          <w:i/>
+          <w:iCs/>
+        </w:rPr>
+        <w:t>the</w:t>
+      </w:r>
+      <w:proofErr w:type="spellEnd"/>
+      <w:r>
+        <w:rPr>
+          <w:b/>
+          <w:bCs/>
+          <w:i/>
+          <w:iCs/>
+        </w:rPr>
+        <w:t xml:space="preserve"> </w:t>
+      </w:r>
+      <w:proofErr w:type="spellStart"/>
+      <w:r>
+        <w:rPr>
+          <w:b/>
+          <w:bCs/>
+          <w:i/>
+          <w:iCs/>
+        </w:rPr>
+        <w:t>assembled</w:t>
+      </w:r>
+      <w:proofErr w:type="spellEnd"/>
+      <w:r>
+        <w:rPr>
+          <w:b/>
+          <w:bCs/>
+          <w:i/>
+          <w:iCs/>
+        </w:rPr>
+        <w:t xml:space="preserve"> </w:t>
+      </w:r>
+      <w:proofErr w:type="spellStart"/>
+      <w:r>
+        <w:rPr>
+          <w:b/>
+          <w:bCs/>
+          <w:i/>
+          <w:iCs/>
+        </w:rPr>
+        <w:t>pipeline</w:t>
+      </w:r>
+      <w:proofErr w:type="spellEnd"/>
+      <w:r>
+        <w:rPr>
+          <w:b/>
+          <w:bCs/>
+          <w:i/>
+          <w:iCs/>
+        </w:rPr>
+        <w:t xml:space="preserve"> has since </w:t>
+      </w:r>
+      <w:proofErr w:type="spellStart"/>
+      <w:r>
+        <w:rPr>
+          <w:b/>
+          <w:bCs/>
+          <w:i/>
+          <w:iCs/>
+        </w:rPr>
+        <w:t>been</w:t>
+      </w:r>
+      <w:proofErr w:type="spellEnd"/>
+      <w:r>
+        <w:rPr>
+          <w:b/>
+          <w:bCs/>
+          <w:i/>
+          <w:iCs/>
+        </w:rPr>
+        <w:t xml:space="preserve"> </w:t>
+      </w:r>
+      <w:proofErr w:type="spellStart"/>
+      <w:r>
+        <w:rPr>
+          <w:b/>
+          <w:bCs/>
+          <w:i/>
+          <w:iCs/>
+        </w:rPr>
+        <w:t>run</w:t>
+      </w:r>
+      <w:proofErr w:type="spellEnd"/>
+      <w:r>
+        <w:rPr>
+          <w:b/>
+          <w:bCs/>
+          <w:i/>
+          <w:iCs/>
+        </w:rPr>
+        <w:t xml:space="preserve"> </w:t>
+      </w:r>
+      <w:proofErr w:type="spellStart"/>
+      <w:r>
+        <w:rPr>
+          <w:b/>
+          <w:bCs/>
+          <w:i/>
+          <w:iCs/>
+        </w:rPr>
+        <w:t>to</w:t>
+      </w:r>
+      <w:proofErr w:type="spellEnd"/>
+      <w:r>
+        <w:rPr>
+          <w:b/>
+          <w:bCs/>
+          <w:i/>
+          <w:iCs/>
+        </w:rPr>
+        <w:t xml:space="preserve"> </w:t>
+      </w:r>
+      <w:proofErr w:type="spellStart"/>
+      <w:r>
+        <w:rPr>
+          <w:b/>
+          <w:bCs/>
+          <w:i/>
+          <w:iCs/>
+        </w:rPr>
+        <w:t>completion</w:t>
+      </w:r>
+      <w:proofErr w:type="spellEnd"/>
+      <w:r>
+        <w:rPr>
+          <w:b/>
+          <w:bCs/>
+          <w:i/>
+          <w:iCs/>
+        </w:rPr>
+        <w:t xml:space="preserve"> </w:t>
+      </w:r>
+      <w:proofErr w:type="spellStart"/>
+      <w:r>
+        <w:rPr>
+          <w:b/>
+          <w:bCs/>
+          <w:i/>
+          <w:iCs/>
+        </w:rPr>
+        <w:t>without</w:t>
+      </w:r>
+      <w:proofErr w:type="spellEnd"/>
+      <w:r>
+        <w:rPr>
+          <w:b/>
+          <w:bCs/>
+          <w:i/>
+          <w:iCs/>
+        </w:rPr>
+        <w:t xml:space="preserve"> </w:t>
+      </w:r>
+      <w:proofErr w:type="spellStart"/>
+      <w:r>
+        <w:rPr>
+          <w:b/>
+          <w:bCs/>
+          <w:i/>
+          <w:iCs/>
+        </w:rPr>
+        <w:t>hanging</w:t>
+      </w:r>
+      <w:proofErr w:type="spellEnd"/>
+      <w:r>
+        <w:rPr>
+          <w:b/>
+          <w:bCs/>
+          <w:i/>
+          <w:iCs/>
+        </w:rPr>
+        <w:t xml:space="preserve"> </w:t>
+      </w:r>
+      <w:proofErr w:type="spellStart"/>
+      <w:r>
+        <w:rPr>
+          <w:b/>
+          <w:bCs/>
+          <w:i/>
+          <w:iCs/>
+        </w:rPr>
+        <w:t>or</w:t>
+      </w:r>
+      <w:proofErr w:type="spellEnd"/>
+      <w:r>
+        <w:rPr>
+          <w:b/>
+          <w:bCs/>
+          <w:i/>
+          <w:iCs/>
+        </w:rPr>
+        <w:t xml:space="preserve"> </w:t>
+      </w:r>
+      <w:proofErr w:type="spellStart"/>
+      <w:r>
+        <w:rPr>
+          <w:b/>
+          <w:bCs/>
+          <w:i/>
+          <w:iCs/>
+        </w:rPr>
+        <w:t>losing</w:t>
+      </w:r>
+      <w:proofErr w:type="spellEnd"/>
+      <w:r>
+        <w:rPr>
+          <w:b/>
+          <w:bCs/>
+          <w:i/>
+          <w:iCs/>
+        </w:rPr>
+        <w:t xml:space="preserve"> data, </w:t>
+      </w:r>
+      <w:proofErr w:type="spellStart"/>
+      <w:r>
+        <w:rPr>
+          <w:b/>
+          <w:bCs/>
+          <w:i/>
+          <w:iCs/>
+        </w:rPr>
+        <w:t>after</w:t>
+      </w:r>
+      <w:proofErr w:type="spellEnd"/>
+      <w:r>
+        <w:rPr>
+          <w:b/>
+          <w:bCs/>
+          <w:i/>
+          <w:iCs/>
+        </w:rPr>
+        <w:t xml:space="preserve"> </w:t>
+      </w:r>
+      <w:proofErr w:type="spellStart"/>
+      <w:r>
+        <w:rPr>
+          <w:b/>
+          <w:bCs/>
+          <w:i/>
+          <w:iCs/>
+        </w:rPr>
+        <w:t>four</w:t>
+      </w:r>
+      <w:proofErr w:type="spellEnd"/>
+      <w:r>
+        <w:rPr>
+          <w:b/>
+          <w:bCs/>
+          <w:i/>
+          <w:iCs/>
+        </w:rPr>
+        <w:t xml:space="preserve"> </w:t>
+      </w:r>
+      <w:proofErr w:type="spellStart"/>
+      <w:r>
+        <w:rPr>
+          <w:b/>
+          <w:bCs/>
+          <w:i/>
+          <w:iCs/>
+        </w:rPr>
+        <w:t>additional</w:t>
+      </w:r>
+      <w:proofErr w:type="spellEnd"/>
+      <w:r>
+        <w:rPr>
+          <w:b/>
+          <w:bCs/>
+          <w:i/>
+          <w:iCs/>
+        </w:rPr>
+        <w:t xml:space="preserve"> </w:t>
+      </w:r>
+      <w:proofErr w:type="spellStart"/>
+      <w:r>
+        <w:rPr>
+          <w:b/>
+          <w:bCs/>
+          <w:i/>
+          <w:iCs/>
+        </w:rPr>
+        <w:t>integration</w:t>
+      </w:r>
+      <w:proofErr w:type="spellEnd"/>
+      <w:r>
+        <w:rPr>
+          <w:b/>
+          <w:bCs/>
+          <w:i/>
+          <w:iCs/>
+        </w:rPr>
+        <w:t xml:space="preserve"> </w:t>
+      </w:r>
+      <w:proofErr w:type="spellStart"/>
+      <w:r>
+        <w:rPr>
+          <w:b/>
+          <w:bCs/>
+          <w:i/>
+          <w:iCs/>
+        </w:rPr>
+        <w:t>bugs</w:t>
+      </w:r>
+      <w:proofErr w:type="spellEnd"/>
+      <w:r>
+        <w:rPr>
+          <w:b/>
+          <w:bCs/>
+          <w:i/>
+          <w:iCs/>
+        </w:rPr>
+        <w:t xml:space="preserve"> </w:t>
+      </w:r>
+      <w:proofErr w:type="spellStart"/>
+      <w:r>
+        <w:rPr>
+          <w:b/>
+          <w:bCs/>
+          <w:i/>
+          <w:iCs/>
+        </w:rPr>
+        <w:t>surfaced</w:t>
+      </w:r>
+      <w:proofErr w:type="spellEnd"/>
+      <w:r>
+        <w:rPr>
+          <w:b/>
+          <w:bCs/>
+          <w:i/>
+          <w:iCs/>
+        </w:rPr>
+        <w:t xml:space="preserve"> </w:t>
+      </w:r>
+      <w:proofErr w:type="spellStart"/>
+      <w:r>
+        <w:rPr>
+          <w:b/>
+          <w:bCs/>
+          <w:i/>
+          <w:iCs/>
+        </w:rPr>
+        <w:t>and</w:t>
+      </w:r>
+      <w:proofErr w:type="spellEnd"/>
+      <w:r>
+        <w:rPr>
+          <w:b/>
+          <w:bCs/>
+          <w:i/>
+          <w:iCs/>
+        </w:rPr>
+        <w:t xml:space="preserve"> </w:t>
+      </w:r>
+      <w:proofErr w:type="spellStart"/>
+      <w:r>
+        <w:rPr>
+          <w:b/>
+          <w:bCs/>
+          <w:i/>
+          <w:iCs/>
+        </w:rPr>
+        <w:t>were</w:t>
+      </w:r>
+      <w:proofErr w:type="spellEnd"/>
+      <w:r>
+        <w:rPr>
+          <w:b/>
+          <w:bCs/>
+          <w:i/>
+          <w:iCs/>
+        </w:rPr>
+        <w:t xml:space="preserve"> </w:t>
+      </w:r>
+      <w:proofErr w:type="spellStart"/>
+      <w:r>
+        <w:rPr>
+          <w:b/>
+          <w:bCs/>
+          <w:i/>
+          <w:iCs/>
+        </w:rPr>
+        <w:t>fixed</w:t>
+      </w:r>
+      <w:proofErr w:type="spellEnd"/>
+      <w:r>
+        <w:rPr>
+          <w:b/>
+          <w:bCs/>
+          <w:i/>
+          <w:iCs/>
+        </w:rPr>
+        <w:t xml:space="preserve">. </w:t>
+      </w:r>
+      <w:proofErr w:type="spellStart"/>
+      <w:r>
+        <w:rPr>
+          <w:b/>
+          <w:bCs/>
+          <w:i/>
+          <w:iCs/>
+        </w:rPr>
+        <w:t>Remaining</w:t>
+      </w:r>
+      <w:proofErr w:type="spellEnd"/>
+      <w:r>
+        <w:rPr>
+          <w:b/>
+          <w:bCs/>
+          <w:i/>
+          <w:iCs/>
+        </w:rPr>
+        <w:t xml:space="preserve"> </w:t>
+      </w:r>
+      <w:proofErr w:type="spellStart"/>
+      <w:r>
+        <w:rPr>
+          <w:b/>
+          <w:bCs/>
+          <w:i/>
+          <w:iCs/>
+        </w:rPr>
+        <w:t>work</w:t>
+      </w:r>
+      <w:proofErr w:type="spellEnd"/>
+      <w:r>
+        <w:rPr>
+          <w:b/>
+          <w:bCs/>
+          <w:i/>
+          <w:iCs/>
+        </w:rPr>
+        <w:t xml:space="preserve"> is a golden-model </w:t>
+      </w:r>
+      <w:proofErr w:type="spellStart"/>
+      <w:r>
+        <w:rPr>
+          <w:b/>
+          <w:bCs/>
+          <w:i/>
+          <w:iCs/>
+        </w:rPr>
+        <w:t>numerical</w:t>
+      </w:r>
+      <w:proofErr w:type="spellEnd"/>
+      <w:r>
+        <w:rPr>
+          <w:b/>
+          <w:bCs/>
+          <w:i/>
+          <w:iCs/>
+        </w:rPr>
+        <w:t xml:space="preserve"> </w:t>
+      </w:r>
+      <w:proofErr w:type="spellStart"/>
+      <w:r>
+        <w:rPr>
+          <w:b/>
+          <w:bCs/>
+          <w:i/>
+          <w:iCs/>
+        </w:rPr>
+        <w:t>cross-check</w:t>
+      </w:r>
+      <w:proofErr w:type="spellEnd"/>
+      <w:r>
+        <w:rPr>
+          <w:b/>
+          <w:bCs/>
+          <w:i/>
+          <w:iCs/>
+        </w:rPr>
+        <w:t xml:space="preserve"> of </w:t>
+      </w:r>
+      <w:proofErr w:type="spellStart"/>
+      <w:r>
+        <w:rPr>
+          <w:b/>
+          <w:bCs/>
+          <w:i/>
+          <w:iCs/>
+        </w:rPr>
+        <w:t>RoPE</w:t>
+      </w:r>
+      <w:proofErr w:type="spellEnd"/>
+      <w:r>
+        <w:rPr>
+          <w:b/>
+          <w:bCs/>
+          <w:i/>
+          <w:iCs/>
+        </w:rPr>
+        <w:t xml:space="preserve">, a </w:t>
+      </w:r>
+      <w:proofErr w:type="spellStart"/>
+      <w:r>
+        <w:rPr>
+          <w:b/>
+          <w:bCs/>
+          <w:i/>
+          <w:iCs/>
+        </w:rPr>
+        <w:t>weight-loading</w:t>
+      </w:r>
+      <w:proofErr w:type="spellEnd"/>
+      <w:r>
+        <w:rPr>
+          <w:b/>
+          <w:bCs/>
+          <w:i/>
+          <w:iCs/>
+        </w:rPr>
+        <w:t xml:space="preserve"> </w:t>
+      </w:r>
+      <w:proofErr w:type="spellStart"/>
+      <w:r>
+        <w:rPr>
+          <w:b/>
+          <w:bCs/>
+          <w:i/>
+          <w:iCs/>
+        </w:rPr>
+        <w:t>handshake</w:t>
+      </w:r>
+      <w:proofErr w:type="spellEnd"/>
+      <w:r>
+        <w:rPr>
+          <w:b/>
+          <w:bCs/>
+          <w:i/>
+          <w:iCs/>
+        </w:rPr>
+        <w:t xml:space="preserve">, </w:t>
+      </w:r>
+      <w:proofErr w:type="spellStart"/>
+      <w:r>
+        <w:rPr>
+          <w:b/>
+          <w:bCs/>
+          <w:i/>
+          <w:iCs/>
+        </w:rPr>
+        <w:t>and</w:t>
+      </w:r>
+      <w:proofErr w:type="spellEnd"/>
+      <w:r>
+        <w:rPr>
+          <w:b/>
+          <w:bCs/>
+          <w:i/>
+          <w:iCs/>
+        </w:rPr>
+        <w:t xml:space="preserve"> </w:t>
+      </w:r>
+      <w:proofErr w:type="spellStart"/>
+      <w:r>
+        <w:rPr>
+          <w:b/>
+          <w:bCs/>
+          <w:i/>
+          <w:iCs/>
+        </w:rPr>
+        <w:t>correcting</w:t>
+      </w:r>
+      <w:proofErr w:type="spellEnd"/>
+      <w:r>
+        <w:rPr>
+          <w:b/>
+          <w:bCs/>
+          <w:i/>
+          <w:iCs/>
+        </w:rPr>
+        <w:t xml:space="preserve"> </w:t>
+      </w:r>
+      <w:proofErr w:type="spellStart"/>
+      <w:r>
+        <w:rPr>
+          <w:b/>
+          <w:bCs/>
+          <w:i/>
+          <w:iCs/>
+        </w:rPr>
+        <w:t>softmax's</w:t>
+      </w:r>
+      <w:proofErr w:type="spellEnd"/>
+      <w:r>
+        <w:rPr>
+          <w:b/>
+          <w:bCs/>
+          <w:i/>
+          <w:iCs/>
+        </w:rPr>
+        <w:t xml:space="preserve"> </w:t>
+      </w:r>
+      <w:proofErr w:type="spellStart"/>
+      <w:r>
+        <w:rPr>
+          <w:b/>
+          <w:bCs/>
+          <w:i/>
+          <w:iCs/>
+        </w:rPr>
+        <w:t>row-normalization</w:t>
+      </w:r>
+      <w:proofErr w:type="spellEnd"/>
+      <w:r>
+        <w:rPr>
+          <w:b/>
+          <w:bCs/>
+          <w:i/>
+          <w:iCs/>
+        </w:rPr>
+        <w:t xml:space="preserve"> </w:t>
+      </w:r>
+      <w:proofErr w:type="spellStart"/>
+      <w:r>
+        <w:rPr>
+          <w:b/>
+          <w:bCs/>
+          <w:i/>
+          <w:iCs/>
+        </w:rPr>
+        <w:t>boundary</w:t>
+      </w:r>
+      <w:proofErr w:type="spellEnd"/>
+      <w:r>
+        <w:rPr>
+          <w:b/>
+          <w:bCs/>
+          <w:i/>
+          <w:iCs/>
+        </w:rPr>
+        <w:t xml:space="preserve">, </w:t>
+      </w:r>
+      <w:proofErr w:type="spellStart"/>
+      <w:r>
+        <w:rPr>
+          <w:b/>
+          <w:bCs/>
+          <w:i/>
+          <w:iCs/>
+        </w:rPr>
+        <w:t>currently</w:t>
+      </w:r>
+      <w:proofErr w:type="spellEnd"/>
+      <w:r>
+        <w:rPr>
+          <w:b/>
+          <w:bCs/>
+          <w:i/>
+          <w:iCs/>
+        </w:rPr>
+        <w:t xml:space="preserve"> </w:t>
+      </w:r>
+      <w:proofErr w:type="spellStart"/>
+      <w:r>
+        <w:rPr>
+          <w:b/>
+          <w:bCs/>
+          <w:i/>
+          <w:iCs/>
+        </w:rPr>
+        <w:t>computed</w:t>
+      </w:r>
+      <w:proofErr w:type="spellEnd"/>
+      <w:r>
+        <w:rPr>
+          <w:b/>
+          <w:bCs/>
+          <w:i/>
+          <w:iCs/>
+        </w:rPr>
+        <w:t xml:space="preserve"> </w:t>
+      </w:r>
+      <w:proofErr w:type="spellStart"/>
+      <w:r>
+        <w:rPr>
+          <w:b/>
+          <w:bCs/>
+          <w:i/>
+          <w:iCs/>
+        </w:rPr>
+        <w:t>once</w:t>
+      </w:r>
+      <w:proofErr w:type="spellEnd"/>
+      <w:r>
+        <w:rPr>
+          <w:b/>
+          <w:bCs/>
+          <w:i/>
+          <w:iCs/>
+        </w:rPr>
+        <w:t xml:space="preserve"> </w:t>
+      </w:r>
+      <w:proofErr w:type="spellStart"/>
+      <w:r>
+        <w:rPr>
+          <w:b/>
+          <w:bCs/>
+          <w:i/>
+          <w:iCs/>
+        </w:rPr>
+        <w:t>per</w:t>
+      </w:r>
+      <w:proofErr w:type="spellEnd"/>
+      <w:r>
+        <w:rPr>
+          <w:b/>
+          <w:bCs/>
+          <w:i/>
+          <w:iCs/>
+        </w:rPr>
+        <w:t xml:space="preserve"> </w:t>
+      </w:r>
+      <w:proofErr w:type="spellStart"/>
+      <w:r>
+        <w:rPr>
+          <w:b/>
+          <w:bCs/>
+          <w:i/>
+          <w:iCs/>
+        </w:rPr>
+        <w:t>full</w:t>
+      </w:r>
+      <w:proofErr w:type="spellEnd"/>
+      <w:r>
+        <w:rPr>
+          <w:b/>
+          <w:bCs/>
+          <w:i/>
+          <w:iCs/>
+        </w:rPr>
+        <w:t xml:space="preserve"> </w:t>
+      </w:r>
+      <w:proofErr w:type="spellStart"/>
+      <w:r>
+        <w:rPr>
+          <w:b/>
+          <w:bCs/>
+          <w:i/>
+          <w:iCs/>
+        </w:rPr>
+        <w:t>score</w:t>
+      </w:r>
+      <w:proofErr w:type="spellEnd"/>
+      <w:r>
+        <w:rPr>
+          <w:b/>
+          <w:bCs/>
+          <w:i/>
+          <w:iCs/>
+        </w:rPr>
+        <w:t xml:space="preserve"> </w:t>
+      </w:r>
+      <w:proofErr w:type="spellStart"/>
+      <w:r>
+        <w:rPr>
+          <w:b/>
+          <w:bCs/>
+          <w:i/>
+          <w:iCs/>
+        </w:rPr>
+        <w:t>tile</w:t>
+      </w:r>
+      <w:proofErr w:type="spellEnd"/>
+      <w:r>
+        <w:rPr>
+          <w:b/>
+          <w:bCs/>
+          <w:i/>
+          <w:iCs/>
+        </w:rPr>
+        <w:t xml:space="preserve"> </w:t>
+      </w:r>
+      <w:proofErr w:type="spellStart"/>
+      <w:r>
+        <w:rPr>
+          <w:b/>
+          <w:bCs/>
+          <w:i/>
+          <w:iCs/>
+        </w:rPr>
+        <w:t>rather</w:t>
+      </w:r>
+      <w:proofErr w:type="spellEnd"/>
+      <w:r>
+        <w:rPr>
+          <w:b/>
+          <w:bCs/>
+          <w:i/>
+          <w:iCs/>
+        </w:rPr>
+        <w:t xml:space="preserve"> </w:t>
+      </w:r>
+      <w:proofErr w:type="spellStart"/>
+      <w:r>
+        <w:rPr>
+          <w:b/>
+          <w:bCs/>
+          <w:i/>
+          <w:iCs/>
+        </w:rPr>
+        <w:t>than</w:t>
+      </w:r>
+      <w:proofErr w:type="spellEnd"/>
+      <w:r>
+        <w:rPr>
+          <w:b/>
+          <w:bCs/>
+          <w:i/>
+          <w:iCs/>
+        </w:rPr>
+        <w:t xml:space="preserve"> </w:t>
+      </w:r>
+      <w:proofErr w:type="spellStart"/>
+      <w:r>
+        <w:rPr>
+          <w:b/>
+          <w:bCs/>
+          <w:i/>
+          <w:iCs/>
+        </w:rPr>
+        <w:t>once</w:t>
+      </w:r>
+      <w:proofErr w:type="spellEnd"/>
+      <w:r>
+        <w:rPr>
+          <w:b/>
+          <w:bCs/>
+          <w:i/>
+          <w:iCs/>
+        </w:rPr>
+        <w:t xml:space="preserve"> </w:t>
+      </w:r>
+      <w:proofErr w:type="spellStart"/>
+      <w:r>
+        <w:rPr>
+          <w:b/>
+          <w:bCs/>
+          <w:i/>
+          <w:iCs/>
+        </w:rPr>
+        <w:t>per</w:t>
+      </w:r>
+      <w:proofErr w:type="spellEnd"/>
+      <w:r>
+        <w:rPr>
+          <w:b/>
+          <w:bCs/>
+          <w:i/>
+          <w:iCs/>
+        </w:rPr>
+        <w:t xml:space="preserve"> </w:t>
+      </w:r>
+      <w:proofErr w:type="spellStart"/>
+      <w:r>
+        <w:rPr>
+          <w:b/>
+          <w:bCs/>
+          <w:i/>
+          <w:iCs/>
+        </w:rPr>
+        <w:t>row</w:t>
+      </w:r>
+      <w:proofErr w:type="spellEnd"/>
+      <w:r>
+        <w:rPr>
+          <w:b/>
+          <w:bCs/>
+          <w:i/>
+          <w:iCs/>
+        </w:rPr>
+        <w:t>.</w:t>
+      </w:r>
     </w:p>
     <w:p>
       <w:pPr>
@@ -2864,12 +5519,6 @@
         <w:gridCol w:w="4966"/>
       </w:tblGrid>
       <w:tr>
-        <w:tblPrEx>
-          <w:tblCellMar>
-            <w:top w:w="0" w:type="dxa"/>
-            <w:bottom w:w="0" w:type="dxa"/>
-          </w:tblCellMar>
-        </w:tblPrEx>
         <w:tc>
           <w:tcPr>
             <w:tcW w:w="0" w:type="auto"/>
@@ -2891,7 +5540,7 @@
                 <w:noProof/>
               </w:rPr>
               <w:drawing>
-                <wp:inline distT="0" distB="0" distL="0" distR="0" wp14:anchorId="45640F8E" wp14:editId="45640F8F">
+                <wp:inline distT="0" distB="0" distL="0" distR="0" wp14:anchorId="081042DE" wp14:editId="72E1FF29">
                   <wp:extent cx="3017520" cy="1474300"/>
                   <wp:effectExtent l="0" t="0" r="0" b="0"/>
                   <wp:docPr id="1" name="Picture 1"/>
@@ -6123,12 +8772,6 @@
         <w:gridCol w:w="4966"/>
       </w:tblGrid>
       <w:tr>
-        <w:tblPrEx>
-          <w:tblCellMar>
-            <w:top w:w="0" w:type="dxa"/>
-            <w:bottom w:w="0" w:type="dxa"/>
-          </w:tblCellMar>
-        </w:tblPrEx>
         <w:tc>
           <w:tcPr>
             <w:tcW w:w="0" w:type="auto"/>
@@ -6150,7 +8793,7 @@
                 <w:noProof/>
               </w:rPr>
               <w:drawing>
-                <wp:inline distT="0" distB="0" distL="0" distR="0" wp14:anchorId="45640F90" wp14:editId="45640F91">
+                <wp:inline distT="0" distB="0" distL="0" distR="0" wp14:anchorId="6306B0CB" wp14:editId="12B940FA">
                   <wp:extent cx="3017520" cy="2971915"/>
                   <wp:effectExtent l="0" t="0" r="0" b="0"/>
                   <wp:docPr id="2" name="Picture 2"/>
@@ -7885,7 +10528,7 @@
           <w:b/>
           <w:sz w:val="22"/>
         </w:rPr>
-        <w:t>X. V</w:t>
+        <w:t xml:space="preserve">X. </w:t>
       </w:r>
       <w:proofErr w:type="spellStart"/>
       <w:r>
@@ -7893,7 +10536,7 @@
           <w:b/>
           <w:sz w:val="22"/>
         </w:rPr>
-        <w:t>erification</w:t>
+        <w:t>Verification</w:t>
       </w:r>
       <w:proofErr w:type="spellEnd"/>
       <w:r>
@@ -8338,12 +10981,6 @@
         <w:gridCol w:w="720"/>
       </w:tblGrid>
       <w:tr>
-        <w:tblPrEx>
-          <w:tblCellMar>
-            <w:top w:w="0" w:type="dxa"/>
-            <w:bottom w:w="0" w:type="dxa"/>
-          </w:tblCellMar>
-        </w:tblPrEx>
         <w:trPr>
           <w:tblHeader/>
         </w:trPr>
@@ -8406,12 +11043,6 @@
         </w:tc>
       </w:tr>
       <w:tr>
-        <w:tblPrEx>
-          <w:tblCellMar>
-            <w:top w:w="0" w:type="dxa"/>
-            <w:bottom w:w="0" w:type="dxa"/>
-          </w:tblCellMar>
-        </w:tblPrEx>
         <w:tc>
           <w:tcPr>
             <w:tcW w:w="1584" w:type="dxa"/>
@@ -8475,12 +11106,6 @@
         </w:tc>
       </w:tr>
       <w:tr>
-        <w:tblPrEx>
-          <w:tblCellMar>
-            <w:top w:w="0" w:type="dxa"/>
-            <w:bottom w:w="0" w:type="dxa"/>
-          </w:tblCellMar>
-        </w:tblPrEx>
         <w:tc>
           <w:tcPr>
             <w:tcW w:w="1584" w:type="dxa"/>
@@ -8544,12 +11169,6 @@
         </w:tc>
       </w:tr>
       <w:tr>
-        <w:tblPrEx>
-          <w:tblCellMar>
-            <w:top w:w="0" w:type="dxa"/>
-            <w:bottom w:w="0" w:type="dxa"/>
-          </w:tblCellMar>
-        </w:tblPrEx>
         <w:tc>
           <w:tcPr>
             <w:tcW w:w="1584" w:type="dxa"/>
@@ -8647,12 +11266,6 @@
         </w:tc>
       </w:tr>
       <w:tr>
-        <w:tblPrEx>
-          <w:tblCellMar>
-            <w:top w:w="0" w:type="dxa"/>
-            <w:bottom w:w="0" w:type="dxa"/>
-          </w:tblCellMar>
-        </w:tblPrEx>
         <w:tc>
           <w:tcPr>
             <w:tcW w:w="1584" w:type="dxa"/>
@@ -8736,12 +11349,6 @@
         </w:tc>
       </w:tr>
       <w:tr>
-        <w:tblPrEx>
-          <w:tblCellMar>
-            <w:top w:w="0" w:type="dxa"/>
-            <w:bottom w:w="0" w:type="dxa"/>
-          </w:tblCellMar>
-        </w:tblPrEx>
         <w:tc>
           <w:tcPr>
             <w:tcW w:w="1584" w:type="dxa"/>
@@ -8825,12 +11432,6 @@
         </w:tc>
       </w:tr>
       <w:tr>
-        <w:tblPrEx>
-          <w:tblCellMar>
-            <w:top w:w="0" w:type="dxa"/>
-            <w:bottom w:w="0" w:type="dxa"/>
-          </w:tblCellMar>
-        </w:tblPrEx>
         <w:tc>
           <w:tcPr>
             <w:tcW w:w="1584" w:type="dxa"/>
@@ -8928,12 +11529,6 @@
         </w:tc>
       </w:tr>
       <w:tr>
-        <w:tblPrEx>
-          <w:tblCellMar>
-            <w:top w:w="0" w:type="dxa"/>
-            <w:bottom w:w="0" w:type="dxa"/>
-          </w:tblCellMar>
-        </w:tblPrEx>
         <w:tc>
           <w:tcPr>
             <w:tcW w:w="1584" w:type="dxa"/>
@@ -9695,9 +12290,11 @@
       </w:r>
     </w:p>
     <w:p>
-      <w:pPr/>
-      <w:r>
-        <w:t>A subsequent full top-level simulation, driving four tokens through the assembled pipeline end to end rather than exercising each module in isolation, surfaced four further integration bugs no module-level testbench could reach. dbuf.sv discarded every packet's final element because its bank-swap condition and its data-write condition were mutually exclusive branches of the same if/else, even though both were true on the same cycle. The URAM read controller advanced past its last requested address without confirming that address's result had been accepted downstream, silently losing it under backpressure. An arbiter's readiness signal back to softmax was wired behind a register that only became valid after softmax had already produced an output, a circular dependency that left softmax unable to produce its first result. And softmax's normalization multiplier lacked the single-element-in-flight guard already applied to the scale/mask stage, letting a later result overwrite an unconsumed earlier one. With all four fixed, the assembled design runs the full token-in to softmax-out path to completion without hanging or losing data; per-row softmax normalization remains open (Section XI).</w:t>
+      <w:r>
+        <w:t xml:space="preserve">A subsequent full top-level simulation, driving four tokens through the assembled pipeline end to end rather than exercising each module in isolation, surfaced four further integration bugs no module-level testbench could reach. dbuf.sv discarded every packet's final element because its bank-swap condition and its data-write condition were mutually exclusive branches of the same if/else, even though both were true on the same cycle. The URAM read controller advanced past its last requested address without confirming that address's result had been accepted downstream, silently losing it under backpressure. An arbiter's readiness signal back to softmax was wired behind a register that only became valid after softmax had already produced an output, a circular dependency that left softmax unable to produce its first result. And softmax's normalization multiplier lacked the single-element-in-flight guard already applied to the scale/mask stage, letting a later result overwrite an unconsumed earlier </w:t>
+      </w:r>
+      <w:r>
+        <w:t>one. With all four fixed, the assembled design runs the full token-in to softmax-out path to completion without hanging or losing data; per-row softmax normalization remains open (Section XI).</w:t>
       </w:r>
     </w:p>
     <w:tbl>
@@ -9721,12 +12318,6 @@
         <w:gridCol w:w="4966"/>
       </w:tblGrid>
       <w:tr>
-        <w:tblPrEx>
-          <w:tblCellMar>
-            <w:top w:w="0" w:type="dxa"/>
-            <w:bottom w:w="0" w:type="dxa"/>
-          </w:tblCellMar>
-        </w:tblPrEx>
         <w:tc>
           <w:tcPr>
             <w:tcW w:w="10368" w:type="dxa"/>
@@ -9741,7 +12332,7 @@
                 <w:noProof/>
               </w:rPr>
               <w:drawing>
-                <wp:inline distT="0" distB="0" distL="0" distR="0" wp14:anchorId="45640F92" wp14:editId="45640F93">
+                <wp:inline distT="0" distB="0" distL="0" distR="0" wp14:anchorId="67FE7981" wp14:editId="28883D08">
                   <wp:extent cx="3017520" cy="1925788"/>
                   <wp:effectExtent l="0" t="0" r="0" b="0"/>
                   <wp:docPr id="4" name="Picture 4"/>
@@ -10851,12 +13442,6 @@
         <w:gridCol w:w="720"/>
       </w:tblGrid>
       <w:tr>
-        <w:tblPrEx>
-          <w:tblCellMar>
-            <w:top w:w="0" w:type="dxa"/>
-            <w:bottom w:w="0" w:type="dxa"/>
-          </w:tblCellMar>
-        </w:tblPrEx>
         <w:trPr>
           <w:tblHeader/>
         </w:trPr>
@@ -10934,12 +13519,6 @@
         </w:tc>
       </w:tr>
       <w:tr>
-        <w:tblPrEx>
-          <w:tblCellMar>
-            <w:top w:w="0" w:type="dxa"/>
-            <w:bottom w:w="0" w:type="dxa"/>
-          </w:tblCellMar>
-        </w:tblPrEx>
         <w:tc>
           <w:tcPr>
             <w:tcW w:w="2016" w:type="dxa"/>
@@ -11019,12 +13598,6 @@
         </w:tc>
       </w:tr>
       <w:tr>
-        <w:tblPrEx>
-          <w:tblCellMar>
-            <w:top w:w="0" w:type="dxa"/>
-            <w:bottom w:w="0" w:type="dxa"/>
-          </w:tblCellMar>
-        </w:tblPrEx>
         <w:tc>
           <w:tcPr>
             <w:tcW w:w="2016" w:type="dxa"/>
@@ -11104,12 +13677,6 @@
         </w:tc>
       </w:tr>
       <w:tr>
-        <w:tblPrEx>
-          <w:tblCellMar>
-            <w:top w:w="0" w:type="dxa"/>
-            <w:bottom w:w="0" w:type="dxa"/>
-          </w:tblCellMar>
-        </w:tblPrEx>
         <w:tc>
           <w:tcPr>
             <w:tcW w:w="2016" w:type="dxa"/>
@@ -11173,12 +13740,6 @@
         </w:tc>
       </w:tr>
       <w:tr>
-        <w:tblPrEx>
-          <w:tblCellMar>
-            <w:top w:w="0" w:type="dxa"/>
-            <w:bottom w:w="0" w:type="dxa"/>
-          </w:tblCellMar>
-        </w:tblPrEx>
         <w:tc>
           <w:tcPr>
             <w:tcW w:w="2016" w:type="dxa"/>
@@ -11242,12 +13803,6 @@
         </w:tc>
       </w:tr>
       <w:tr>
-        <w:tblPrEx>
-          <w:tblCellMar>
-            <w:top w:w="0" w:type="dxa"/>
-            <w:bottom w:w="0" w:type="dxa"/>
-          </w:tblCellMar>
-        </w:tblPrEx>
         <w:tc>
           <w:tcPr>
             <w:tcW w:w="2016" w:type="dxa"/>
@@ -11334,7 +13889,7 @@
     </w:p>
     <w:tbl>
       <w:tblPr>
-        <w:tblW w:w="5000" w:type="pct"/>
+        <w:tblW w:w="4797" w:type="pct"/>
         <w:tblBorders>
           <w:top w:val="dashed" w:sz="6" w:space="0" w:color="888888"/>
           <w:left w:val="dashed" w:sz="6" w:space="0" w:color="888888"/>
@@ -11350,23 +13905,19 @@
         <w:tblLook w:val="04A0" w:firstRow="1" w:lastRow="0" w:firstColumn="1" w:lastColumn="0" w:noHBand="0" w:noVBand="1"/>
       </w:tblPr>
       <w:tblGrid>
-        <w:gridCol w:w="4966"/>
+        <w:gridCol w:w="4764"/>
       </w:tblGrid>
       <w:tr>
-        <w:tblPrEx>
-          <w:tblCellMar>
-            <w:top w:w="0" w:type="dxa"/>
-            <w:bottom w:w="0" w:type="dxa"/>
-          </w:tblCellMar>
-        </w:tblPrEx>
+        <w:trPr>
+          <w:trHeight w:val="6727"/>
+        </w:trPr>
         <w:tc>
           <w:tcPr>
-            <w:tcW w:w="10368" w:type="dxa"/>
+            <w:tcW w:w="4764" w:type="dxa"/>
           </w:tcPr>
           <w:p>
             <w:pPr>
               <w:spacing w:after="40"/>
-              <w:jc w:val="center"/>
             </w:pPr>
             <w:r>
               <w:rPr>
@@ -11374,9 +13925,9 @@
               </w:rPr>
               <w:lastRenderedPageBreak/>
               <w:drawing>
-                <wp:inline distT="0" distB="0" distL="0" distR="0" wp14:anchorId="45640F94" wp14:editId="45640F95">
-                  <wp:extent cx="3017520" cy="4542620"/>
-                  <wp:effectExtent l="0" t="0" r="0" b="0"/>
+                <wp:inline distT="0" distB="0" distL="0" distR="0" wp14:anchorId="0D9A165B" wp14:editId="7A5A8BFF">
+                  <wp:extent cx="2644752" cy="3981450"/>
+                  <wp:effectExtent l="0" t="0" r="3810" b="0"/>
                   <wp:docPr id="5" name="Picture 5"/>
                   <wp:cNvGraphicFramePr>
                     <a:graphicFrameLocks xmlns:a="http://schemas.openxmlformats.org/drawingml/2006/main" noChangeAspect="1"/>
@@ -11397,7 +13948,7 @@
                         <pic:spPr>
                           <a:xfrm>
                             <a:off x="0" y="0"/>
-                            <a:ext cx="3017520" cy="4542620"/>
+                            <a:ext cx="2645635" cy="3982780"/>
                           </a:xfrm>
                           <a:prstGeom prst="rect">
                             <a:avLst/>
@@ -12212,47 +14763,50 @@
         <w:spacing w:after="40"/>
       </w:pPr>
       <w:r>
-        <w:t>A full end-to-end (top.sv) simulation has now been run to completion (four tokens, Q·Kᵀ through softmax) without hanging or losing data, closing this item; multi-token throughput on real hardware, as opposed to simulation, remains unmeasured.</w:t>
-      </w:r>
-      <w:proofErr w:type="spellStart"/>
-      <w:proofErr w:type="spellEnd"/>
-      <w:proofErr w:type="spellStart"/>
-      <w:proofErr w:type="spellEnd"/>
-      <w:proofErr w:type="spellStart"/>
-      <w:proofErr w:type="spellEnd"/>
-      <w:proofErr w:type="spellStart"/>
-      <w:proofErr w:type="spellEnd"/>
-      <w:proofErr w:type="spellStart"/>
-      <w:proofErr w:type="spellEnd"/>
-      <w:proofErr w:type="spellStart"/>
-      <w:proofErr w:type="spellEnd"/>
-      <w:proofErr w:type="spellStart"/>
-      <w:proofErr w:type="spellEnd"/>
-      <w:proofErr w:type="spellStart"/>
-      <w:proofErr w:type="spellEnd"/>
-      <w:proofErr w:type="spellStart"/>
-      <w:proofErr w:type="spellEnd"/>
-      <w:proofErr w:type="spellStart"/>
-      <w:proofErr w:type="spellEnd"/>
-      <w:proofErr w:type="spellStart"/>
-      <w:proofErr w:type="spellEnd"/>
-      <w:proofErr w:type="spellStart"/>
-      <w:proofErr w:type="spellEnd"/>
-      <w:proofErr w:type="spellStart"/>
-      <w:proofErr w:type="spellEnd"/>
-      <w:proofErr w:type="spellStart"/>
-      <w:proofErr w:type="spellEnd"/>
-      <w:proofErr w:type="spellStart"/>
-      <w:proofErr w:type="spellEnd"/>
-      <w:proofErr w:type="spellStart"/>
-      <w:proofErr w:type="spellEnd"/>
+        <w:t xml:space="preserve">A full end-to-end (top.sv) simulation has now been run to completion (four tokens, Q·Kᵀ through softmax) without hanging or losing data, closing this item; multi-token throughput on real hardware, as opposed </w:t>
+      </w:r>
+      <w:proofErr w:type="spellStart"/>
+      <w:r>
+        <w:t>to</w:t>
+      </w:r>
+      <w:proofErr w:type="spellEnd"/>
+      <w:r>
+        <w:t xml:space="preserve"> </w:t>
+      </w:r>
+      <w:proofErr w:type="spellStart"/>
+      <w:r>
+        <w:t>simulation</w:t>
+      </w:r>
+      <w:proofErr w:type="spellEnd"/>
+      <w:r>
+        <w:t xml:space="preserve">, </w:t>
+      </w:r>
+      <w:proofErr w:type="spellStart"/>
+      <w:r>
+        <w:t>remains</w:t>
+      </w:r>
+      <w:proofErr w:type="spellEnd"/>
+      <w:r>
+        <w:t xml:space="preserve"> </w:t>
+      </w:r>
+      <w:proofErr w:type="spellStart"/>
+      <w:r>
+        <w:t>unmeasured</w:t>
+      </w:r>
+      <w:proofErr w:type="spellEnd"/>
+      <w:r>
+        <w:t>.</w:t>
+      </w:r>
     </w:p>
     <w:p>
       <w:pPr>
         <w:pStyle w:val="ListeParagraf"/>
       </w:pPr>
       <w:r>
-        <w:t>softmax currently normalizes the entire flattened score matrix as one row instead of one row per query, because the shared array's output drain asserts its end-of-row signal once per whole matrix rather than once per row. A one-line fix was attempted and reverted after it introduced a second, not-yet-diagnosed deadlock between softmax and the array drain.</w:t>
+        <w:t xml:space="preserve">softmax currently normalizes the entire flattened score matrix as one row instead of one row per query, because the shared array's output drain asserts its end-of-row signal once per whole matrix rather than once per row. A one-line fix was </w:t>
+      </w:r>
+      <w:r>
+        <w:t>attempted and reverted after it introduced a second, not-yet-diagnosed deadlock between softmax and the array drain.</w:t>
       </w:r>
     </w:p>
     <w:p>
@@ -12356,260 +14910,1060 @@
       </w:pPr>
       <w:proofErr w:type="spellStart"/>
       <w:r>
-        <w:t>The design presented here implements more than fifteen RTL modules covering the full self-attention pipeline, from projection through RoPE, GQA mapping, similarity computation, softmax, and output generation, with a shared systolic array reducing MAC resource duplication. Every module now has a passing standalone testbench, and the integration process that connected four independently written branches into a single working pipeline surfaced and fixed several concrete RTL bugs, most notably a port-width error that had caused the synthesizer to delete nearly the entire design (Section X). Post-implementation synthesis confirms a compact, DSP- and BRAM-free implementation at 1,486 LUTs and 510 flip-flops on a Xilinx Artix-7 device. A full end-to-end (top.sv) pipeline simulation has since been run to completion, surfacing and fixing four further integration bugs (Section X); planned next steps are correcting softmax's per-row normalization boundary (Section XI), cross-checking RoPE numerically against a golden software model, wiring GQA head selection into the URAM address path, adding a weight-loading handshake, and measuring timing closure and maximum clock frequency.</w:t>
-      </w:r>
-      <w:proofErr w:type="spellEnd"/>
-      <w:proofErr w:type="spellStart"/>
-      <w:proofErr w:type="spellEnd"/>
-      <w:proofErr w:type="spellStart"/>
-      <w:proofErr w:type="spellEnd"/>
-      <w:proofErr w:type="spellStart"/>
-      <w:proofErr w:type="spellEnd"/>
-      <w:proofErr w:type="spellStart"/>
-      <w:proofErr w:type="spellEnd"/>
-      <w:proofErr w:type="spellStart"/>
-      <w:proofErr w:type="spellEnd"/>
-      <w:proofErr w:type="spellStart"/>
-      <w:proofErr w:type="spellEnd"/>
-      <w:proofErr w:type="spellStart"/>
-      <w:proofErr w:type="spellEnd"/>
-      <w:proofErr w:type="spellStart"/>
-      <w:proofErr w:type="spellEnd"/>
-      <w:proofErr w:type="spellStart"/>
-      <w:proofErr w:type="spellEnd"/>
-      <w:proofErr w:type="spellStart"/>
-      <w:proofErr w:type="spellEnd"/>
-      <w:proofErr w:type="spellStart"/>
-      <w:proofErr w:type="spellEnd"/>
-      <w:proofErr w:type="spellStart"/>
-      <w:proofErr w:type="spellEnd"/>
-      <w:proofErr w:type="spellStart"/>
-      <w:proofErr w:type="spellEnd"/>
-      <w:proofErr w:type="spellStart"/>
-      <w:proofErr w:type="spellEnd"/>
-      <w:proofErr w:type="spellStart"/>
-      <w:proofErr w:type="spellEnd"/>
-      <w:proofErr w:type="spellStart"/>
-      <w:proofErr w:type="spellEnd"/>
-      <w:proofErr w:type="spellStart"/>
-      <w:proofErr w:type="spellEnd"/>
-      <w:proofErr w:type="spellStart"/>
-      <w:proofErr w:type="spellEnd"/>
-      <w:proofErr w:type="spellStart"/>
-      <w:proofErr w:type="spellEnd"/>
-      <w:proofErr w:type="spellStart"/>
-      <w:proofErr w:type="spellEnd"/>
-      <w:proofErr w:type="spellStart"/>
-      <w:proofErr w:type="spellEnd"/>
-      <w:proofErr w:type="spellStart"/>
-      <w:proofErr w:type="spellEnd"/>
-      <w:proofErr w:type="spellStart"/>
-      <w:proofErr w:type="spellEnd"/>
-      <w:proofErr w:type="spellStart"/>
-      <w:proofErr w:type="spellEnd"/>
-      <w:proofErr w:type="spellStart"/>
-      <w:proofErr w:type="spellEnd"/>
-      <w:proofErr w:type="spellStart"/>
-      <w:proofErr w:type="spellEnd"/>
-      <w:proofErr w:type="spellStart"/>
-      <w:proofErr w:type="spellEnd"/>
-      <w:proofErr w:type="spellStart"/>
-      <w:proofErr w:type="spellEnd"/>
-      <w:proofErr w:type="spellStart"/>
-      <w:proofErr w:type="spellEnd"/>
-      <w:proofErr w:type="spellStart"/>
-      <w:proofErr w:type="spellEnd"/>
-      <w:proofErr w:type="spellStart"/>
-      <w:proofErr w:type="spellEnd"/>
-      <w:proofErr w:type="spellStart"/>
-      <w:proofErr w:type="spellEnd"/>
-      <w:proofErr w:type="spellStart"/>
-      <w:proofErr w:type="spellEnd"/>
-      <w:proofErr w:type="spellStart"/>
-      <w:proofErr w:type="spellEnd"/>
-      <w:proofErr w:type="spellStart"/>
-      <w:proofErr w:type="spellEnd"/>
-      <w:proofErr w:type="spellStart"/>
-      <w:proofErr w:type="spellEnd"/>
-      <w:proofErr w:type="spellStart"/>
-      <w:proofErr w:type="spellEnd"/>
-      <w:proofErr w:type="spellStart"/>
-      <w:proofErr w:type="spellEnd"/>
-      <w:proofErr w:type="spellStart"/>
-      <w:proofErr w:type="spellEnd"/>
-      <w:proofErr w:type="spellStart"/>
-      <w:proofErr w:type="spellEnd"/>
-      <w:proofErr w:type="spellStart"/>
-      <w:proofErr w:type="spellEnd"/>
-      <w:proofErr w:type="spellStart"/>
-      <w:proofErr w:type="spellEnd"/>
-      <w:proofErr w:type="spellStart"/>
-      <w:proofErr w:type="spellEnd"/>
-      <w:proofErr w:type="spellStart"/>
-      <w:proofErr w:type="spellEnd"/>
-      <w:proofErr w:type="spellStart"/>
-      <w:proofErr w:type="spellEnd"/>
-      <w:proofErr w:type="spellStart"/>
-      <w:proofErr w:type="spellEnd"/>
-      <w:proofErr w:type="spellStart"/>
-      <w:proofErr w:type="spellEnd"/>
-      <w:proofErr w:type="spellStart"/>
-      <w:proofErr w:type="spellEnd"/>
-      <w:proofErr w:type="spellStart"/>
-      <w:proofErr w:type="spellEnd"/>
-      <w:proofErr w:type="spellStart"/>
-      <w:proofErr w:type="spellEnd"/>
-      <w:proofErr w:type="spellStart"/>
-      <w:proofErr w:type="spellEnd"/>
-      <w:proofErr w:type="spellStart"/>
-      <w:proofErr w:type="spellEnd"/>
-      <w:proofErr w:type="spellStart"/>
-      <w:proofErr w:type="spellEnd"/>
-      <w:proofErr w:type="spellStart"/>
-      <w:proofErr w:type="spellEnd"/>
-      <w:proofErr w:type="spellStart"/>
-      <w:proofErr w:type="spellEnd"/>
-      <w:proofErr w:type="spellStart"/>
-      <w:proofErr w:type="spellEnd"/>
-      <w:proofErr w:type="spellStart"/>
-      <w:proofErr w:type="spellEnd"/>
-      <w:proofErr w:type="spellStart"/>
-      <w:proofErr w:type="spellEnd"/>
-      <w:proofErr w:type="spellStart"/>
-      <w:proofErr w:type="spellEnd"/>
-      <w:proofErr w:type="spellStart"/>
-      <w:proofErr w:type="spellEnd"/>
-      <w:proofErr w:type="spellStart"/>
-      <w:proofErr w:type="spellEnd"/>
-      <w:proofErr w:type="spellStart"/>
-      <w:proofErr w:type="spellEnd"/>
-      <w:proofErr w:type="spellStart"/>
-      <w:proofErr w:type="spellEnd"/>
-      <w:proofErr w:type="spellStart"/>
-      <w:proofErr w:type="spellEnd"/>
-      <w:proofErr w:type="spellStart"/>
-      <w:proofErr w:type="spellEnd"/>
-      <w:proofErr w:type="spellStart"/>
-      <w:proofErr w:type="spellEnd"/>
-      <w:proofErr w:type="spellStart"/>
-      <w:proofErr w:type="spellEnd"/>
-      <w:proofErr w:type="spellStart"/>
-      <w:proofErr w:type="spellEnd"/>
-      <w:proofErr w:type="spellStart"/>
-      <w:proofErr w:type="spellEnd"/>
-      <w:proofErr w:type="spellStart"/>
-      <w:proofErr w:type="spellEnd"/>
-      <w:proofErr w:type="spellStart"/>
-      <w:proofErr w:type="spellEnd"/>
-      <w:proofErr w:type="spellStart"/>
-      <w:proofErr w:type="spellEnd"/>
-      <w:proofErr w:type="spellStart"/>
-      <w:proofErr w:type="spellEnd"/>
-      <w:proofErr w:type="spellStart"/>
-      <w:proofErr w:type="spellEnd"/>
-      <w:proofErr w:type="spellStart"/>
-      <w:proofErr w:type="spellEnd"/>
-      <w:proofErr w:type="spellStart"/>
-      <w:proofErr w:type="spellEnd"/>
-      <w:proofErr w:type="spellStart"/>
-      <w:proofErr w:type="spellEnd"/>
-      <w:proofErr w:type="spellStart"/>
-      <w:proofErr w:type="spellEnd"/>
-      <w:proofErr w:type="spellStart"/>
-      <w:proofErr w:type="spellEnd"/>
-      <w:proofErr w:type="spellStart"/>
-      <w:proofErr w:type="spellEnd"/>
-      <w:proofErr w:type="spellStart"/>
-      <w:proofErr w:type="spellEnd"/>
-      <w:proofErr w:type="spellStart"/>
-      <w:proofErr w:type="spellEnd"/>
-      <w:proofErr w:type="spellStart"/>
-      <w:proofErr w:type="spellEnd"/>
-      <w:proofErr w:type="spellStart"/>
-      <w:proofErr w:type="spellEnd"/>
-      <w:proofErr w:type="spellStart"/>
-      <w:proofErr w:type="spellEnd"/>
-      <w:proofErr w:type="spellStart"/>
-      <w:proofErr w:type="spellEnd"/>
-      <w:proofErr w:type="spellStart"/>
-      <w:proofErr w:type="spellEnd"/>
-      <w:proofErr w:type="spellStart"/>
-      <w:proofErr w:type="spellEnd"/>
-      <w:proofErr w:type="spellStart"/>
-      <w:proofErr w:type="spellEnd"/>
-      <w:proofErr w:type="spellStart"/>
-      <w:proofErr w:type="spellEnd"/>
-      <w:proofErr w:type="spellStart"/>
-      <w:proofErr w:type="spellEnd"/>
-      <w:proofErr w:type="spellStart"/>
-      <w:proofErr w:type="spellEnd"/>
-      <w:proofErr w:type="spellStart"/>
-      <w:proofErr w:type="spellEnd"/>
-      <w:proofErr w:type="spellStart"/>
-      <w:proofErr w:type="spellEnd"/>
-      <w:proofErr w:type="spellStart"/>
-      <w:proofErr w:type="spellEnd"/>
-      <w:proofErr w:type="spellStart"/>
-      <w:proofErr w:type="spellEnd"/>
-      <w:proofErr w:type="spellStart"/>
-      <w:proofErr w:type="spellEnd"/>
-      <w:proofErr w:type="spellStart"/>
-      <w:proofErr w:type="spellEnd"/>
-      <w:proofErr w:type="spellStart"/>
-      <w:proofErr w:type="spellEnd"/>
-      <w:proofErr w:type="spellStart"/>
-      <w:proofErr w:type="spellEnd"/>
-      <w:proofErr w:type="spellStart"/>
-      <w:proofErr w:type="spellEnd"/>
-      <w:proofErr w:type="spellStart"/>
-      <w:proofErr w:type="spellEnd"/>
-      <w:proofErr w:type="spellStart"/>
-      <w:proofErr w:type="spellEnd"/>
-      <w:proofErr w:type="spellStart"/>
-      <w:proofErr w:type="spellEnd"/>
-      <w:proofErr w:type="spellStart"/>
-      <w:proofErr w:type="spellEnd"/>
-      <w:proofErr w:type="spellStart"/>
-      <w:proofErr w:type="spellEnd"/>
-      <w:proofErr w:type="spellStart"/>
-      <w:proofErr w:type="spellEnd"/>
-      <w:proofErr w:type="spellStart"/>
-      <w:proofErr w:type="spellEnd"/>
-      <w:proofErr w:type="spellStart"/>
-      <w:proofErr w:type="spellEnd"/>
-      <w:proofErr w:type="spellStart"/>
-      <w:proofErr w:type="spellEnd"/>
-      <w:proofErr w:type="spellStart"/>
-      <w:proofErr w:type="spellEnd"/>
-      <w:proofErr w:type="spellStart"/>
-      <w:proofErr w:type="spellEnd"/>
-      <w:proofErr w:type="spellStart"/>
-      <w:proofErr w:type="spellEnd"/>
-      <w:proofErr w:type="spellStart"/>
-      <w:proofErr w:type="spellEnd"/>
-      <w:proofErr w:type="spellStart"/>
-      <w:proofErr w:type="spellEnd"/>
-    </w:p>
-    <w:p>
-      <w:pPr>
-        <w:spacing w:after="100" w:line="252" w:lineRule="auto"/>
-        <w:ind w:firstLine="240"/>
-        <w:jc w:val="both"/>
-      </w:pPr>
-    </w:p>
-    <w:p>
-      <w:pPr>
-        <w:spacing w:after="100" w:line="252" w:lineRule="auto"/>
-        <w:ind w:firstLine="240"/>
-        <w:jc w:val="both"/>
-      </w:pPr>
-    </w:p>
-    <w:p>
-      <w:pPr>
-        <w:spacing w:after="100" w:line="252" w:lineRule="auto"/>
-        <w:ind w:firstLine="240"/>
-        <w:jc w:val="both"/>
-      </w:pPr>
+        <w:t>The</w:t>
+      </w:r>
+      <w:proofErr w:type="spellEnd"/>
+      <w:r>
+        <w:t xml:space="preserve"> </w:t>
+      </w:r>
+      <w:proofErr w:type="spellStart"/>
+      <w:r>
+        <w:t>design</w:t>
+      </w:r>
+      <w:proofErr w:type="spellEnd"/>
+      <w:r>
+        <w:t xml:space="preserve"> </w:t>
+      </w:r>
+      <w:proofErr w:type="spellStart"/>
+      <w:r>
+        <w:t>presented</w:t>
+      </w:r>
+      <w:proofErr w:type="spellEnd"/>
+      <w:r>
+        <w:t xml:space="preserve"> here </w:t>
+      </w:r>
+      <w:proofErr w:type="spellStart"/>
+      <w:r>
+        <w:t>implements</w:t>
+      </w:r>
+      <w:proofErr w:type="spellEnd"/>
+      <w:r>
+        <w:t xml:space="preserve"> </w:t>
+      </w:r>
+      <w:proofErr w:type="spellStart"/>
+      <w:r>
+        <w:t>more</w:t>
+      </w:r>
+      <w:proofErr w:type="spellEnd"/>
+      <w:r>
+        <w:t xml:space="preserve"> </w:t>
+      </w:r>
+      <w:proofErr w:type="spellStart"/>
+      <w:r>
+        <w:t>than</w:t>
+      </w:r>
+      <w:proofErr w:type="spellEnd"/>
+      <w:r>
+        <w:t xml:space="preserve"> </w:t>
+      </w:r>
+      <w:proofErr w:type="spellStart"/>
+      <w:r>
+        <w:t>fifteen</w:t>
+      </w:r>
+      <w:proofErr w:type="spellEnd"/>
+      <w:r>
+        <w:t xml:space="preserve"> RTL </w:t>
+      </w:r>
+      <w:proofErr w:type="spellStart"/>
+      <w:r>
+        <w:t>modules</w:t>
+      </w:r>
+      <w:proofErr w:type="spellEnd"/>
+      <w:r>
+        <w:t xml:space="preserve"> </w:t>
+      </w:r>
+      <w:proofErr w:type="spellStart"/>
+      <w:r>
+        <w:t>covering</w:t>
+      </w:r>
+      <w:proofErr w:type="spellEnd"/>
+      <w:r>
+        <w:t xml:space="preserve"> </w:t>
+      </w:r>
+      <w:proofErr w:type="spellStart"/>
+      <w:r>
+        <w:t>the</w:t>
+      </w:r>
+      <w:proofErr w:type="spellEnd"/>
+      <w:r>
+        <w:t xml:space="preserve"> </w:t>
+      </w:r>
+      <w:proofErr w:type="spellStart"/>
+      <w:r>
+        <w:t>full</w:t>
+      </w:r>
+      <w:proofErr w:type="spellEnd"/>
+      <w:r>
+        <w:t xml:space="preserve"> self-</w:t>
+      </w:r>
+      <w:proofErr w:type="spellStart"/>
+      <w:r>
+        <w:t>attention</w:t>
+      </w:r>
+      <w:proofErr w:type="spellEnd"/>
+      <w:r>
+        <w:t xml:space="preserve"> </w:t>
+      </w:r>
+      <w:proofErr w:type="spellStart"/>
+      <w:r>
+        <w:t>pipeline</w:t>
+      </w:r>
+      <w:proofErr w:type="spellEnd"/>
+      <w:r>
+        <w:t xml:space="preserve">, </w:t>
+      </w:r>
+      <w:proofErr w:type="spellStart"/>
+      <w:r>
+        <w:t>from</w:t>
+      </w:r>
+      <w:proofErr w:type="spellEnd"/>
+      <w:r>
+        <w:t xml:space="preserve"> </w:t>
+      </w:r>
+      <w:proofErr w:type="spellStart"/>
+      <w:r>
+        <w:t>projection</w:t>
+      </w:r>
+      <w:proofErr w:type="spellEnd"/>
+      <w:r>
+        <w:t xml:space="preserve"> </w:t>
+      </w:r>
+      <w:proofErr w:type="spellStart"/>
+      <w:r>
+        <w:t>through</w:t>
+      </w:r>
+      <w:proofErr w:type="spellEnd"/>
+      <w:r>
+        <w:t xml:space="preserve"> </w:t>
+      </w:r>
+      <w:proofErr w:type="spellStart"/>
+      <w:r>
+        <w:t>RoPE</w:t>
+      </w:r>
+      <w:proofErr w:type="spellEnd"/>
+      <w:r>
+        <w:t xml:space="preserve">, GQA </w:t>
+      </w:r>
+      <w:proofErr w:type="spellStart"/>
+      <w:r>
+        <w:t>mapping</w:t>
+      </w:r>
+      <w:proofErr w:type="spellEnd"/>
+      <w:r>
+        <w:t xml:space="preserve">, </w:t>
+      </w:r>
+      <w:proofErr w:type="spellStart"/>
+      <w:r>
+        <w:t>similarity</w:t>
+      </w:r>
+      <w:proofErr w:type="spellEnd"/>
+      <w:r>
+        <w:t xml:space="preserve"> </w:t>
+      </w:r>
+      <w:proofErr w:type="spellStart"/>
+      <w:r>
+        <w:t>computation</w:t>
+      </w:r>
+      <w:proofErr w:type="spellEnd"/>
+      <w:r>
+        <w:t xml:space="preserve">, </w:t>
+      </w:r>
+      <w:proofErr w:type="spellStart"/>
+      <w:r>
+        <w:t>softmax</w:t>
+      </w:r>
+      <w:proofErr w:type="spellEnd"/>
+      <w:r>
+        <w:t xml:space="preserve">, </w:t>
+      </w:r>
+      <w:proofErr w:type="spellStart"/>
+      <w:r>
+        <w:t>and</w:t>
+      </w:r>
+      <w:proofErr w:type="spellEnd"/>
+      <w:r>
+        <w:t xml:space="preserve"> </w:t>
+      </w:r>
+      <w:proofErr w:type="spellStart"/>
+      <w:r>
+        <w:t>output</w:t>
+      </w:r>
+      <w:proofErr w:type="spellEnd"/>
+      <w:r>
+        <w:t xml:space="preserve"> </w:t>
+      </w:r>
+      <w:proofErr w:type="spellStart"/>
+      <w:r>
+        <w:t>generation</w:t>
+      </w:r>
+      <w:proofErr w:type="spellEnd"/>
+      <w:r>
+        <w:t xml:space="preserve">, </w:t>
+      </w:r>
+      <w:proofErr w:type="spellStart"/>
+      <w:r>
+        <w:t>with</w:t>
+      </w:r>
+      <w:proofErr w:type="spellEnd"/>
+      <w:r>
+        <w:t xml:space="preserve"> a </w:t>
+      </w:r>
+      <w:proofErr w:type="spellStart"/>
+      <w:r>
+        <w:t>shared</w:t>
+      </w:r>
+      <w:proofErr w:type="spellEnd"/>
+      <w:r>
+        <w:t xml:space="preserve"> </w:t>
+      </w:r>
+      <w:proofErr w:type="spellStart"/>
+      <w:r>
+        <w:t>systolic</w:t>
+      </w:r>
+      <w:proofErr w:type="spellEnd"/>
+      <w:r>
+        <w:t xml:space="preserve"> </w:t>
+      </w:r>
+      <w:proofErr w:type="spellStart"/>
+      <w:r>
+        <w:t>array</w:t>
+      </w:r>
+      <w:proofErr w:type="spellEnd"/>
+      <w:r>
+        <w:t xml:space="preserve"> </w:t>
+      </w:r>
+      <w:proofErr w:type="spellStart"/>
+      <w:r>
+        <w:t>reducing</w:t>
+      </w:r>
+      <w:proofErr w:type="spellEnd"/>
+      <w:r>
+        <w:t xml:space="preserve"> MAC </w:t>
+      </w:r>
+      <w:proofErr w:type="spellStart"/>
+      <w:r>
+        <w:t>resource</w:t>
+      </w:r>
+      <w:proofErr w:type="spellEnd"/>
+      <w:r>
+        <w:t xml:space="preserve"> </w:t>
+      </w:r>
+      <w:proofErr w:type="spellStart"/>
+      <w:r>
+        <w:t>duplication</w:t>
+      </w:r>
+      <w:proofErr w:type="spellEnd"/>
+      <w:r>
+        <w:t xml:space="preserve">. </w:t>
+      </w:r>
+      <w:proofErr w:type="spellStart"/>
+      <w:r>
+        <w:t>Every</w:t>
+      </w:r>
+      <w:proofErr w:type="spellEnd"/>
+      <w:r>
+        <w:t xml:space="preserve"> </w:t>
+      </w:r>
+      <w:proofErr w:type="spellStart"/>
+      <w:r>
+        <w:t>module</w:t>
+      </w:r>
+      <w:proofErr w:type="spellEnd"/>
+      <w:r>
+        <w:t xml:space="preserve"> </w:t>
+      </w:r>
+      <w:proofErr w:type="spellStart"/>
+      <w:r>
+        <w:t>now</w:t>
+      </w:r>
+      <w:proofErr w:type="spellEnd"/>
+      <w:r>
+        <w:t xml:space="preserve"> has a </w:t>
+      </w:r>
+      <w:proofErr w:type="spellStart"/>
+      <w:r>
+        <w:t>passing</w:t>
+      </w:r>
+      <w:proofErr w:type="spellEnd"/>
+      <w:r>
+        <w:t xml:space="preserve"> </w:t>
+      </w:r>
+      <w:proofErr w:type="spellStart"/>
+      <w:r>
+        <w:t>standalone</w:t>
+      </w:r>
+      <w:proofErr w:type="spellEnd"/>
+      <w:r>
+        <w:t xml:space="preserve"> </w:t>
+      </w:r>
+      <w:proofErr w:type="spellStart"/>
+      <w:r>
+        <w:t>testbench</w:t>
+      </w:r>
+      <w:proofErr w:type="spellEnd"/>
+      <w:r>
+        <w:t xml:space="preserve">, </w:t>
+      </w:r>
+      <w:proofErr w:type="spellStart"/>
+      <w:r>
+        <w:t>and</w:t>
+      </w:r>
+      <w:proofErr w:type="spellEnd"/>
+      <w:r>
+        <w:t xml:space="preserve"> </w:t>
+      </w:r>
+      <w:proofErr w:type="spellStart"/>
+      <w:r>
+        <w:t>the</w:t>
+      </w:r>
+      <w:proofErr w:type="spellEnd"/>
+      <w:r>
+        <w:t xml:space="preserve"> </w:t>
+      </w:r>
+      <w:proofErr w:type="spellStart"/>
+      <w:r>
+        <w:t>integration</w:t>
+      </w:r>
+      <w:proofErr w:type="spellEnd"/>
+      <w:r>
+        <w:t xml:space="preserve"> </w:t>
+      </w:r>
+      <w:proofErr w:type="spellStart"/>
+      <w:r>
+        <w:t>process</w:t>
+      </w:r>
+      <w:proofErr w:type="spellEnd"/>
+      <w:r>
+        <w:t xml:space="preserve"> </w:t>
+      </w:r>
+      <w:proofErr w:type="spellStart"/>
+      <w:r>
+        <w:t>that</w:t>
+      </w:r>
+      <w:proofErr w:type="spellEnd"/>
+      <w:r>
+        <w:t xml:space="preserve"> </w:t>
+      </w:r>
+      <w:proofErr w:type="spellStart"/>
+      <w:r>
+        <w:t>connected</w:t>
+      </w:r>
+      <w:proofErr w:type="spellEnd"/>
+      <w:r>
+        <w:t xml:space="preserve"> </w:t>
+      </w:r>
+      <w:proofErr w:type="spellStart"/>
+      <w:r>
+        <w:t>four</w:t>
+      </w:r>
+      <w:proofErr w:type="spellEnd"/>
+      <w:r>
+        <w:t xml:space="preserve"> </w:t>
+      </w:r>
+      <w:proofErr w:type="spellStart"/>
+      <w:r>
+        <w:t>independently</w:t>
+      </w:r>
+      <w:proofErr w:type="spellEnd"/>
+      <w:r>
+        <w:t xml:space="preserve"> </w:t>
+      </w:r>
+      <w:proofErr w:type="spellStart"/>
+      <w:r>
+        <w:t>written</w:t>
+      </w:r>
+      <w:proofErr w:type="spellEnd"/>
+      <w:r>
+        <w:t xml:space="preserve"> </w:t>
+      </w:r>
+      <w:proofErr w:type="spellStart"/>
+      <w:r>
+        <w:t>branches</w:t>
+      </w:r>
+      <w:proofErr w:type="spellEnd"/>
+      <w:r>
+        <w:t xml:space="preserve"> </w:t>
+      </w:r>
+      <w:proofErr w:type="spellStart"/>
+      <w:r>
+        <w:t>into</w:t>
+      </w:r>
+      <w:proofErr w:type="spellEnd"/>
+      <w:r>
+        <w:t xml:space="preserve"> a </w:t>
+      </w:r>
+      <w:proofErr w:type="spellStart"/>
+      <w:r>
+        <w:t>single</w:t>
+      </w:r>
+      <w:proofErr w:type="spellEnd"/>
+      <w:r>
+        <w:t xml:space="preserve"> </w:t>
+      </w:r>
+      <w:proofErr w:type="spellStart"/>
+      <w:r>
+        <w:t>working</w:t>
+      </w:r>
+      <w:proofErr w:type="spellEnd"/>
+      <w:r>
+        <w:t xml:space="preserve"> </w:t>
+      </w:r>
+      <w:proofErr w:type="spellStart"/>
+      <w:r>
+        <w:t>pipeline</w:t>
+      </w:r>
+      <w:proofErr w:type="spellEnd"/>
+      <w:r>
+        <w:t xml:space="preserve"> </w:t>
+      </w:r>
+      <w:proofErr w:type="spellStart"/>
+      <w:r>
+        <w:t>surfaced</w:t>
+      </w:r>
+      <w:proofErr w:type="spellEnd"/>
+      <w:r>
+        <w:t xml:space="preserve"> </w:t>
+      </w:r>
+      <w:proofErr w:type="spellStart"/>
+      <w:r>
+        <w:t>and</w:t>
+      </w:r>
+      <w:proofErr w:type="spellEnd"/>
+      <w:r>
+        <w:t xml:space="preserve"> </w:t>
+      </w:r>
+      <w:proofErr w:type="spellStart"/>
+      <w:r>
+        <w:t>fixed</w:t>
+      </w:r>
+      <w:proofErr w:type="spellEnd"/>
+      <w:r>
+        <w:t xml:space="preserve"> </w:t>
+      </w:r>
+      <w:proofErr w:type="spellStart"/>
+      <w:r>
+        <w:t>several</w:t>
+      </w:r>
+      <w:proofErr w:type="spellEnd"/>
+      <w:r>
+        <w:t xml:space="preserve"> </w:t>
+      </w:r>
+      <w:proofErr w:type="spellStart"/>
+      <w:r>
+        <w:t>concrete</w:t>
+      </w:r>
+      <w:proofErr w:type="spellEnd"/>
+      <w:r>
+        <w:t xml:space="preserve"> RTL </w:t>
+      </w:r>
+      <w:proofErr w:type="spellStart"/>
+      <w:r>
+        <w:t>bugs</w:t>
+      </w:r>
+      <w:proofErr w:type="spellEnd"/>
+      <w:r>
+        <w:t xml:space="preserve">, </w:t>
+      </w:r>
+      <w:proofErr w:type="spellStart"/>
+      <w:r>
+        <w:t>most</w:t>
+      </w:r>
+      <w:proofErr w:type="spellEnd"/>
+      <w:r>
+        <w:t xml:space="preserve"> </w:t>
+      </w:r>
+      <w:proofErr w:type="spellStart"/>
+      <w:r>
+        <w:t>notably</w:t>
+      </w:r>
+      <w:proofErr w:type="spellEnd"/>
+      <w:r>
+        <w:t xml:space="preserve"> a port-</w:t>
+      </w:r>
+      <w:proofErr w:type="spellStart"/>
+      <w:r>
+        <w:t>width</w:t>
+      </w:r>
+      <w:proofErr w:type="spellEnd"/>
+      <w:r>
+        <w:t xml:space="preserve"> </w:t>
+      </w:r>
+      <w:proofErr w:type="spellStart"/>
+      <w:r>
+        <w:t>error</w:t>
+      </w:r>
+      <w:proofErr w:type="spellEnd"/>
+      <w:r>
+        <w:t xml:space="preserve"> </w:t>
+      </w:r>
+      <w:proofErr w:type="spellStart"/>
+      <w:r>
+        <w:t>that</w:t>
+      </w:r>
+      <w:proofErr w:type="spellEnd"/>
+      <w:r>
+        <w:t xml:space="preserve"> had </w:t>
+      </w:r>
+      <w:proofErr w:type="spellStart"/>
+      <w:r>
+        <w:t>caused</w:t>
+      </w:r>
+      <w:proofErr w:type="spellEnd"/>
+      <w:r>
+        <w:t xml:space="preserve"> </w:t>
+      </w:r>
+      <w:proofErr w:type="spellStart"/>
+      <w:r>
+        <w:t>the</w:t>
+      </w:r>
+      <w:proofErr w:type="spellEnd"/>
+      <w:r>
+        <w:t xml:space="preserve"> </w:t>
+      </w:r>
+      <w:proofErr w:type="spellStart"/>
+      <w:r>
+        <w:t>synthesizer</w:t>
+      </w:r>
+      <w:proofErr w:type="spellEnd"/>
+      <w:r>
+        <w:t xml:space="preserve"> </w:t>
+      </w:r>
+      <w:proofErr w:type="spellStart"/>
+      <w:r>
+        <w:t>to</w:t>
+      </w:r>
+      <w:proofErr w:type="spellEnd"/>
+      <w:r>
+        <w:t xml:space="preserve"> </w:t>
+      </w:r>
+      <w:proofErr w:type="spellStart"/>
+      <w:r>
+        <w:t>delete</w:t>
+      </w:r>
+      <w:proofErr w:type="spellEnd"/>
+      <w:r>
+        <w:t xml:space="preserve"> </w:t>
+      </w:r>
+      <w:proofErr w:type="spellStart"/>
+      <w:r>
+        <w:t>nearly</w:t>
+      </w:r>
+      <w:proofErr w:type="spellEnd"/>
+      <w:r>
+        <w:t xml:space="preserve"> </w:t>
+      </w:r>
+      <w:proofErr w:type="spellStart"/>
+      <w:r>
+        <w:t>the</w:t>
+      </w:r>
+      <w:proofErr w:type="spellEnd"/>
+      <w:r>
+        <w:t xml:space="preserve"> </w:t>
+      </w:r>
+      <w:proofErr w:type="spellStart"/>
+      <w:r>
+        <w:t>entire</w:t>
+      </w:r>
+      <w:proofErr w:type="spellEnd"/>
+      <w:r>
+        <w:t xml:space="preserve"> </w:t>
+      </w:r>
+      <w:proofErr w:type="spellStart"/>
+      <w:r>
+        <w:t>design</w:t>
+      </w:r>
+      <w:proofErr w:type="spellEnd"/>
+      <w:r>
+        <w:t xml:space="preserve"> (</w:t>
+      </w:r>
+      <w:proofErr w:type="spellStart"/>
+      <w:r>
+        <w:t>Section</w:t>
+      </w:r>
+      <w:proofErr w:type="spellEnd"/>
+      <w:r>
+        <w:t xml:space="preserve"> X). Post-</w:t>
+      </w:r>
+      <w:proofErr w:type="spellStart"/>
+      <w:r>
+        <w:t>implementation</w:t>
+      </w:r>
+      <w:proofErr w:type="spellEnd"/>
+      <w:r>
+        <w:t xml:space="preserve"> </w:t>
+      </w:r>
+      <w:proofErr w:type="spellStart"/>
+      <w:r>
+        <w:t>synthesis</w:t>
+      </w:r>
+      <w:proofErr w:type="spellEnd"/>
+      <w:r>
+        <w:t xml:space="preserve"> </w:t>
+      </w:r>
+      <w:proofErr w:type="spellStart"/>
+      <w:r>
+        <w:t>confirms</w:t>
+      </w:r>
+      <w:proofErr w:type="spellEnd"/>
+      <w:r>
+        <w:t xml:space="preserve"> a </w:t>
+      </w:r>
+      <w:proofErr w:type="spellStart"/>
+      <w:r>
+        <w:t>compact</w:t>
+      </w:r>
+      <w:proofErr w:type="spellEnd"/>
+      <w:r>
+        <w:t xml:space="preserve">, DSP- </w:t>
+      </w:r>
+      <w:proofErr w:type="spellStart"/>
+      <w:r>
+        <w:t>and</w:t>
+      </w:r>
+      <w:proofErr w:type="spellEnd"/>
+      <w:r>
+        <w:t xml:space="preserve"> BRAM-</w:t>
+      </w:r>
+      <w:proofErr w:type="spellStart"/>
+      <w:r>
+        <w:t>free</w:t>
+      </w:r>
+      <w:proofErr w:type="spellEnd"/>
+      <w:r>
+        <w:t xml:space="preserve"> </w:t>
+      </w:r>
+      <w:proofErr w:type="spellStart"/>
+      <w:r>
+        <w:t>implementation</w:t>
+      </w:r>
+      <w:proofErr w:type="spellEnd"/>
+      <w:r>
+        <w:t xml:space="preserve"> at 1,486 </w:t>
+      </w:r>
+      <w:proofErr w:type="spellStart"/>
+      <w:r>
+        <w:t>LUTs</w:t>
+      </w:r>
+      <w:proofErr w:type="spellEnd"/>
+      <w:r>
+        <w:t xml:space="preserve"> </w:t>
+      </w:r>
+      <w:proofErr w:type="spellStart"/>
+      <w:r>
+        <w:t>and</w:t>
+      </w:r>
+      <w:proofErr w:type="spellEnd"/>
+      <w:r>
+        <w:t xml:space="preserve"> 510 </w:t>
+      </w:r>
+      <w:proofErr w:type="spellStart"/>
+      <w:r>
+        <w:t>flip-flops</w:t>
+      </w:r>
+      <w:proofErr w:type="spellEnd"/>
+      <w:r>
+        <w:t xml:space="preserve"> on a </w:t>
+      </w:r>
+      <w:proofErr w:type="spellStart"/>
+      <w:r>
+        <w:t>Xilinx</w:t>
+      </w:r>
+      <w:proofErr w:type="spellEnd"/>
+      <w:r>
+        <w:t xml:space="preserve"> Artix-7 </w:t>
+      </w:r>
+      <w:proofErr w:type="spellStart"/>
+      <w:r>
+        <w:t>device</w:t>
+      </w:r>
+      <w:proofErr w:type="spellEnd"/>
+      <w:r>
+        <w:t xml:space="preserve">. A </w:t>
+      </w:r>
+      <w:proofErr w:type="spellStart"/>
+      <w:r>
+        <w:t>full</w:t>
+      </w:r>
+      <w:proofErr w:type="spellEnd"/>
+      <w:r>
+        <w:t xml:space="preserve"> </w:t>
+      </w:r>
+      <w:proofErr w:type="spellStart"/>
+      <w:r>
+        <w:t>end-to-end</w:t>
+      </w:r>
+      <w:proofErr w:type="spellEnd"/>
+      <w:r>
+        <w:t xml:space="preserve"> (top.sv) </w:t>
+      </w:r>
+      <w:proofErr w:type="spellStart"/>
+      <w:r>
+        <w:t>pipeline</w:t>
+      </w:r>
+      <w:proofErr w:type="spellEnd"/>
+      <w:r>
+        <w:t xml:space="preserve"> </w:t>
+      </w:r>
+      <w:proofErr w:type="spellStart"/>
+      <w:r>
+        <w:t>simulation</w:t>
+      </w:r>
+      <w:proofErr w:type="spellEnd"/>
+      <w:r>
+        <w:t xml:space="preserve"> has since </w:t>
+      </w:r>
+      <w:proofErr w:type="spellStart"/>
+      <w:r>
+        <w:t>been</w:t>
+      </w:r>
+      <w:proofErr w:type="spellEnd"/>
+      <w:r>
+        <w:t xml:space="preserve"> </w:t>
+      </w:r>
+      <w:proofErr w:type="spellStart"/>
+      <w:r>
+        <w:t>run</w:t>
+      </w:r>
+      <w:proofErr w:type="spellEnd"/>
+      <w:r>
+        <w:t xml:space="preserve"> </w:t>
+      </w:r>
+      <w:proofErr w:type="spellStart"/>
+      <w:r>
+        <w:t>to</w:t>
+      </w:r>
+      <w:proofErr w:type="spellEnd"/>
+      <w:r>
+        <w:t xml:space="preserve"> </w:t>
+      </w:r>
+      <w:proofErr w:type="spellStart"/>
+      <w:r>
+        <w:t>completion</w:t>
+      </w:r>
+      <w:proofErr w:type="spellEnd"/>
+      <w:r>
+        <w:t xml:space="preserve">, </w:t>
+      </w:r>
+      <w:proofErr w:type="spellStart"/>
+      <w:r>
+        <w:t>surfacing</w:t>
+      </w:r>
+      <w:proofErr w:type="spellEnd"/>
+      <w:r>
+        <w:t xml:space="preserve"> </w:t>
+      </w:r>
+      <w:proofErr w:type="spellStart"/>
+      <w:r>
+        <w:t>and</w:t>
+      </w:r>
+      <w:proofErr w:type="spellEnd"/>
+      <w:r>
+        <w:t xml:space="preserve"> </w:t>
+      </w:r>
+      <w:proofErr w:type="spellStart"/>
+      <w:r>
+        <w:t>fixing</w:t>
+      </w:r>
+      <w:proofErr w:type="spellEnd"/>
+      <w:r>
+        <w:t xml:space="preserve"> </w:t>
+      </w:r>
+      <w:proofErr w:type="spellStart"/>
+      <w:r>
+        <w:t>four</w:t>
+      </w:r>
+      <w:proofErr w:type="spellEnd"/>
+      <w:r>
+        <w:t xml:space="preserve"> </w:t>
+      </w:r>
+      <w:proofErr w:type="spellStart"/>
+      <w:r>
+        <w:t>further</w:t>
+      </w:r>
+      <w:proofErr w:type="spellEnd"/>
+      <w:r>
+        <w:t xml:space="preserve"> </w:t>
+      </w:r>
+      <w:proofErr w:type="spellStart"/>
+      <w:r>
+        <w:t>integration</w:t>
+      </w:r>
+      <w:proofErr w:type="spellEnd"/>
+      <w:r>
+        <w:t xml:space="preserve"> </w:t>
+      </w:r>
+      <w:proofErr w:type="spellStart"/>
+      <w:r>
+        <w:t>bugs</w:t>
+      </w:r>
+      <w:proofErr w:type="spellEnd"/>
+      <w:r>
+        <w:t xml:space="preserve"> (</w:t>
+      </w:r>
+      <w:proofErr w:type="spellStart"/>
+      <w:r>
+        <w:t>Section</w:t>
+      </w:r>
+      <w:proofErr w:type="spellEnd"/>
+      <w:r>
+        <w:t xml:space="preserve"> X); </w:t>
+      </w:r>
+      <w:proofErr w:type="spellStart"/>
+      <w:r>
+        <w:t>planned</w:t>
+      </w:r>
+      <w:proofErr w:type="spellEnd"/>
+      <w:r>
+        <w:t xml:space="preserve"> </w:t>
+      </w:r>
+      <w:proofErr w:type="spellStart"/>
+      <w:r>
+        <w:t>next</w:t>
+      </w:r>
+      <w:proofErr w:type="spellEnd"/>
+      <w:r>
+        <w:t xml:space="preserve"> </w:t>
+      </w:r>
+      <w:proofErr w:type="spellStart"/>
+      <w:r>
+        <w:t>steps</w:t>
+      </w:r>
+      <w:proofErr w:type="spellEnd"/>
+      <w:r>
+        <w:t xml:space="preserve"> </w:t>
+      </w:r>
+      <w:proofErr w:type="spellStart"/>
+      <w:r>
+        <w:t>are</w:t>
+      </w:r>
+      <w:proofErr w:type="spellEnd"/>
+      <w:r>
+        <w:t xml:space="preserve"> </w:t>
+      </w:r>
+      <w:proofErr w:type="spellStart"/>
+      <w:r>
+        <w:t>correcting</w:t>
+      </w:r>
+      <w:proofErr w:type="spellEnd"/>
+      <w:r>
+        <w:t xml:space="preserve"> </w:t>
+      </w:r>
+      <w:proofErr w:type="spellStart"/>
+      <w:r>
+        <w:t>softmax's</w:t>
+      </w:r>
+      <w:proofErr w:type="spellEnd"/>
+      <w:r>
+        <w:t xml:space="preserve"> </w:t>
+      </w:r>
+      <w:proofErr w:type="spellStart"/>
+      <w:r>
+        <w:t>per-row</w:t>
+      </w:r>
+      <w:proofErr w:type="spellEnd"/>
+      <w:r>
+        <w:t xml:space="preserve"> </w:t>
+      </w:r>
+      <w:proofErr w:type="spellStart"/>
+      <w:r>
+        <w:t>normalization</w:t>
+      </w:r>
+      <w:proofErr w:type="spellEnd"/>
+      <w:r>
+        <w:t xml:space="preserve"> </w:t>
+      </w:r>
+      <w:proofErr w:type="spellStart"/>
+      <w:r>
+        <w:t>boundary</w:t>
+      </w:r>
+      <w:proofErr w:type="spellEnd"/>
+      <w:r>
+        <w:t xml:space="preserve"> (</w:t>
+      </w:r>
+      <w:proofErr w:type="spellStart"/>
+      <w:r>
+        <w:t>Section</w:t>
+      </w:r>
+      <w:proofErr w:type="spellEnd"/>
+      <w:r>
+        <w:t xml:space="preserve"> XI), </w:t>
+      </w:r>
+      <w:proofErr w:type="spellStart"/>
+      <w:r>
+        <w:t>cross-checking</w:t>
+      </w:r>
+      <w:proofErr w:type="spellEnd"/>
+      <w:r>
+        <w:t xml:space="preserve"> </w:t>
+      </w:r>
+      <w:proofErr w:type="spellStart"/>
+      <w:r>
+        <w:t>RoPE</w:t>
+      </w:r>
+      <w:proofErr w:type="spellEnd"/>
+      <w:r>
+        <w:t xml:space="preserve"> </w:t>
+      </w:r>
+      <w:proofErr w:type="spellStart"/>
+      <w:r>
+        <w:t>numerically</w:t>
+      </w:r>
+      <w:proofErr w:type="spellEnd"/>
+      <w:r>
+        <w:t xml:space="preserve"> </w:t>
+      </w:r>
+      <w:proofErr w:type="spellStart"/>
+      <w:r>
+        <w:t>against</w:t>
+      </w:r>
+      <w:proofErr w:type="spellEnd"/>
+      <w:r>
+        <w:t xml:space="preserve"> a golden software model, </w:t>
+      </w:r>
+      <w:proofErr w:type="spellStart"/>
+      <w:r>
+        <w:t>wiring</w:t>
+      </w:r>
+      <w:proofErr w:type="spellEnd"/>
+      <w:r>
+        <w:t xml:space="preserve"> GQA </w:t>
+      </w:r>
+      <w:proofErr w:type="spellStart"/>
+      <w:r>
+        <w:t>head</w:t>
+      </w:r>
+      <w:proofErr w:type="spellEnd"/>
+      <w:r>
+        <w:t xml:space="preserve"> </w:t>
+      </w:r>
+      <w:proofErr w:type="spellStart"/>
+      <w:r>
+        <w:t>selection</w:t>
+      </w:r>
+      <w:proofErr w:type="spellEnd"/>
+      <w:r>
+        <w:t xml:space="preserve"> </w:t>
+      </w:r>
+      <w:proofErr w:type="spellStart"/>
+      <w:r>
+        <w:t>into</w:t>
+      </w:r>
+      <w:proofErr w:type="spellEnd"/>
+      <w:r>
+        <w:t xml:space="preserve"> </w:t>
+      </w:r>
+      <w:proofErr w:type="spellStart"/>
+      <w:r>
+        <w:t>the</w:t>
+      </w:r>
+      <w:proofErr w:type="spellEnd"/>
+      <w:r>
+        <w:t xml:space="preserve"> URAM </w:t>
+      </w:r>
+      <w:proofErr w:type="spellStart"/>
+      <w:r>
+        <w:t>address</w:t>
+      </w:r>
+      <w:proofErr w:type="spellEnd"/>
+      <w:r>
+        <w:t xml:space="preserve"> </w:t>
+      </w:r>
+      <w:proofErr w:type="spellStart"/>
+      <w:r>
+        <w:t>path</w:t>
+      </w:r>
+      <w:proofErr w:type="spellEnd"/>
+      <w:r>
+        <w:t xml:space="preserve">, </w:t>
+      </w:r>
+      <w:proofErr w:type="spellStart"/>
+      <w:r>
+        <w:t>adding</w:t>
+      </w:r>
+      <w:proofErr w:type="spellEnd"/>
+      <w:r>
+        <w:t xml:space="preserve"> a </w:t>
+      </w:r>
+      <w:proofErr w:type="spellStart"/>
+      <w:r>
+        <w:t>weight-loading</w:t>
+      </w:r>
+      <w:proofErr w:type="spellEnd"/>
+      <w:r>
+        <w:t xml:space="preserve"> </w:t>
+      </w:r>
+      <w:proofErr w:type="spellStart"/>
+      <w:r>
+        <w:t>handshake</w:t>
+      </w:r>
+      <w:proofErr w:type="spellEnd"/>
+      <w:r>
+        <w:t xml:space="preserve">, </w:t>
+      </w:r>
+      <w:proofErr w:type="spellStart"/>
+      <w:r>
+        <w:t>and</w:t>
+      </w:r>
+      <w:proofErr w:type="spellEnd"/>
+      <w:r>
+        <w:t xml:space="preserve"> </w:t>
+      </w:r>
+      <w:proofErr w:type="spellStart"/>
+      <w:r>
+        <w:t>measuring</w:t>
+      </w:r>
+      <w:proofErr w:type="spellEnd"/>
+      <w:r>
+        <w:t xml:space="preserve"> </w:t>
+      </w:r>
+      <w:proofErr w:type="spellStart"/>
+      <w:r>
+        <w:t>timing</w:t>
+      </w:r>
+      <w:proofErr w:type="spellEnd"/>
+      <w:r>
+        <w:t xml:space="preserve"> </w:t>
+      </w:r>
+      <w:proofErr w:type="spellStart"/>
+      <w:r>
+        <w:t>closure</w:t>
+      </w:r>
+      <w:proofErr w:type="spellEnd"/>
+      <w:r>
+        <w:t xml:space="preserve"> </w:t>
+      </w:r>
+      <w:proofErr w:type="spellStart"/>
+      <w:r>
+        <w:t>and</w:t>
+      </w:r>
+      <w:proofErr w:type="spellEnd"/>
+      <w:r>
+        <w:t xml:space="preserve"> </w:t>
+      </w:r>
+      <w:proofErr w:type="spellStart"/>
+      <w:r>
+        <w:t>maximum</w:t>
+      </w:r>
+      <w:proofErr w:type="spellEnd"/>
+      <w:r>
+        <w:t xml:space="preserve"> </w:t>
+      </w:r>
+      <w:proofErr w:type="spellStart"/>
+      <w:r>
+        <w:t>clock</w:t>
+      </w:r>
+      <w:proofErr w:type="spellEnd"/>
+      <w:r>
+        <w:t xml:space="preserve"> </w:t>
+      </w:r>
+      <w:proofErr w:type="spellStart"/>
+      <w:r>
+        <w:t>frequency</w:t>
+      </w:r>
+      <w:proofErr w:type="spellEnd"/>
+      <w:r>
+        <w:t>.</w:t>
+      </w:r>
     </w:p>
     <w:p>
       <w:pPr>
@@ -12639,12 +15993,6 @@
         <w:gridCol w:w="4966"/>
       </w:tblGrid>
       <w:tr>
-        <w:tblPrEx>
-          <w:tblCellMar>
-            <w:top w:w="0" w:type="dxa"/>
-            <w:bottom w:w="0" w:type="dxa"/>
-          </w:tblCellMar>
-        </w:tblPrEx>
         <w:tc>
           <w:tcPr>
             <w:tcW w:w="0" w:type="auto"/>
@@ -12666,7 +16014,7 @@
                 <w:noProof/>
               </w:rPr>
               <w:drawing>
-                <wp:inline distT="0" distB="0" distL="0" distR="0" wp14:anchorId="45640F96" wp14:editId="45640F97">
+                <wp:inline distT="0" distB="0" distL="0" distR="0" wp14:anchorId="34D872A7" wp14:editId="6EB33B85">
                   <wp:extent cx="3108960" cy="1061123"/>
                   <wp:effectExtent l="0" t="0" r="0" b="0"/>
                   <wp:docPr id="3" name="Picture 3"/>
@@ -13969,6 +17317,7 @@
     </w:p>
     <w:p>
       <w:pPr>
+        <w:spacing w:after="40"/>
         <w:ind w:left="240" w:hanging="240"/>
       </w:pPr>
       <w:r>
@@ -14103,7 +17452,7 @@
 </file>
 
 <file path=word/numbering.xml><?xml version="1.0" encoding="utf-8"?>
-<w:numbering xmlns:wpc="http://schemas.microsoft.com/office/word/2010/wordprocessingCanvas" xmlns:cx="http://schemas.microsoft.com/office/drawing/2014/chartex" xmlns:cx1="http://schemas.microsoft.com/office/drawing/2015/9/8/chartex" xmlns:cx2="http://schemas.microsoft.com/office/drawing/2015/10/21/chartex" xmlns:cx3="http://schemas.microsoft.com/office/drawing/2016/5/9/chartex" xmlns:cx4="http://schemas.microsoft.com/office/drawing/2016/5/10/chartex" xmlns:cx5="http://schemas.microsoft.com/office/drawing/2016/5/11/chartex" xmlns:cx6="http://schemas.microsoft.com/office/drawing/2016/5/12/chartex" xmlns:cx7="http://schemas.microsoft.com/office/drawing/2016/5/13/chartex" xmlns:cx8="http://schemas.microsoft.com/office/drawing/2016/5/14/chartex" xmlns:mc="http://schemas.openxmlformats.org/markup-compatibility/2006" xmlns:aink="http://schemas.microsoft.com/office/drawing/2016/ink" xmlns:am3d="http://schemas.microsoft.com/office/drawing/2017/model3d" xmlns:o="urn:schemas-microsoft-com:office:office" xmlns:oel="http://schemas.microsoft.com/office/2019/extlst" xmlns:r="http://schemas.openxmlformats.org/officeDocument/2006/relationships" xmlns:m="http://schemas.openxmlformats.org/officeDocument/2006/math" xmlns:v="urn:schemas-microsoft-com:vml" xmlns:wp14="http://schemas.microsoft.com/office/word/2010/wordprocessingDrawing" xmlns:wp="http://schemas.openxmlformats.org/drawingml/2006/wordprocessingDrawing" xmlns:w10="urn:schemas-microsoft-com:office:word" xmlns:w="http://schemas.openxmlformats.org/wordprocessingml/2006/main" xmlns:w14="http://schemas.microsoft.com/office/word/2010/wordml" xmlns:w15="http://schemas.microsoft.com/office/word/2012/wordml" xmlns:w16cei="http://schemas.microsoft.com/office/word/2026/wordml/cei" xmlns:w16cex="http://schemas.microsoft.com/office/word/2018/wordml/cex" xmlns:w16cid="http://schemas.microsoft.com/office/word/2016/wordml/cid" xmlns:w16="http://schemas.microsoft.com/office/word/2018/wordml" xmlns:w16du="http://schemas.microsoft.com/office/word/2023/wordml/word16du" xmlns:w16sdtdh="http://schemas.microsoft.com/office/word/2020/wordml/sdtdatahash" xmlns:w16sdtfl="http://schemas.microsoft.com/office/word/2024/wordml/sdtformatlock" xmlns:w16se="http://schemas.microsoft.com/office/word/2015/wordml/symex" xmlns:wpg="http://schemas.microsoft.com/office/word/2010/wordprocessingGroup" xmlns:wpi="http://schemas.microsoft.com/office/word/2010/wordprocessingInk" xmlns:wne="http://schemas.microsoft.com/office/word/2006/wordml" xmlns:wps="http://schemas.microsoft.com/office/word/2010/wordprocessingShape" mc:Ignorable="w14 w15 w16se w16cid w16 w16cex w16sdtdh w16sdtfl w16du wp14">
+<w:numbering xmlns:wpc="http://schemas.microsoft.com/office/word/2010/wordprocessingCanvas" xmlns:cx="http://schemas.microsoft.com/office/drawing/2014/chartex" xmlns:cx1="http://schemas.microsoft.com/office/drawing/2015/9/8/chartex" xmlns:cx2="http://schemas.microsoft.com/office/drawing/2015/10/21/chartex" xmlns:cx3="http://schemas.microsoft.com/office/drawing/2016/5/9/chartex" xmlns:cx4="http://schemas.microsoft.com/office/drawing/2016/5/10/chartex" xmlns:cx5="http://schemas.microsoft.com/office/drawing/2016/5/11/chartex" xmlns:cx6="http://schemas.microsoft.com/office/drawing/2016/5/12/chartex" xmlns:cx7="http://schemas.microsoft.com/office/drawing/2016/5/13/chartex" xmlns:cx8="http://schemas.microsoft.com/office/drawing/2016/5/14/chartex" xmlns:mc="http://schemas.openxmlformats.org/markup-compatibility/2006" xmlns:aink="http://schemas.microsoft.com/office/drawing/2016/ink" xmlns:am3d="http://schemas.microsoft.com/office/drawing/2017/model3d" xmlns:o="urn:schemas-microsoft-com:office:office" xmlns:oel="http://schemas.microsoft.com/office/2019/extlst" xmlns:r="http://schemas.openxmlformats.org/officeDocument/2006/relationships" xmlns:m="http://schemas.openxmlformats.org/officeDocument/2006/math" xmlns:v="urn:schemas-microsoft-com:vml" xmlns:wp14="http://schemas.microsoft.com/office/word/2010/wordprocessingDrawing" xmlns:wp="http://schemas.openxmlformats.org/drawingml/2006/wordprocessingDrawing" xmlns:w10="urn:schemas-microsoft-com:office:word" xmlns:w="http://schemas.openxmlformats.org/wordprocessingml/2006/main" xmlns:w14="http://schemas.microsoft.com/office/word/2010/wordml" xmlns:w15="http://schemas.microsoft.com/office/word/2012/wordml" xmlns:w16cex="http://schemas.microsoft.com/office/word/2018/wordml/cex" xmlns:w16cid="http://schemas.microsoft.com/office/word/2016/wordml/cid" xmlns:w16="http://schemas.microsoft.com/office/word/2018/wordml" xmlns:w16sdtdh="http://schemas.microsoft.com/office/word/2020/wordml/sdtdatahash" xmlns:w16se="http://schemas.microsoft.com/office/word/2015/wordml/symex" xmlns:wpg="http://schemas.microsoft.com/office/word/2010/wordprocessingGroup" xmlns:wpi="http://schemas.microsoft.com/office/word/2010/wordprocessingInk" xmlns:wne="http://schemas.microsoft.com/office/word/2006/wordml" xmlns:wps="http://schemas.microsoft.com/office/word/2010/wordprocessingShape" mc:Ignorable="w14 w15 w16se w16cid w16 w16cex w16sdtdh wp14">
   <w:abstractNum w:abstractNumId="0" w15:restartNumberingAfterBreak="0">
     <w:nsid w:val="2AA230B4"/>
     <w:multiLevelType w:val="hybridMultilevel"/>
@@ -14200,7 +17549,7 @@
 </file>
 
 <file path=word/styles.xml><?xml version="1.0" encoding="utf-8"?>
-<w:styles xmlns:mc="http://schemas.openxmlformats.org/markup-compatibility/2006" xmlns:r="http://schemas.openxmlformats.org/officeDocument/2006/relationships" xmlns:w="http://schemas.openxmlformats.org/wordprocessingml/2006/main" xmlns:w14="http://schemas.microsoft.com/office/word/2010/wordml" xmlns:w15="http://schemas.microsoft.com/office/word/2012/wordml" xmlns:w16cex="http://schemas.microsoft.com/office/word/2018/wordml/cex" xmlns:w16cid="http://schemas.microsoft.com/office/word/2016/wordml/cid" xmlns:w16="http://schemas.microsoft.com/office/word/2018/wordml" xmlns:w16du="http://schemas.microsoft.com/office/word/2023/wordml/word16du" xmlns:w16sdtdh="http://schemas.microsoft.com/office/word/2020/wordml/sdtdatahash" xmlns:w16sdtfl="http://schemas.microsoft.com/office/word/2024/wordml/sdtformatlock" xmlns:w16se="http://schemas.microsoft.com/office/word/2015/wordml/symex" mc:Ignorable="w14 w15 w16se w16cid w16 w16cex w16sdtdh w16sdtfl w16du">
+<w:styles xmlns:mc="http://schemas.openxmlformats.org/markup-compatibility/2006" xmlns:r="http://schemas.openxmlformats.org/officeDocument/2006/relationships" xmlns:w="http://schemas.openxmlformats.org/wordprocessingml/2006/main" xmlns:w14="http://schemas.microsoft.com/office/word/2010/wordml" xmlns:w15="http://schemas.microsoft.com/office/word/2012/wordml" xmlns:w16cex="http://schemas.microsoft.com/office/word/2018/wordml/cex" xmlns:w16cid="http://schemas.microsoft.com/office/word/2016/wordml/cid" xmlns:w16="http://schemas.microsoft.com/office/word/2018/wordml" xmlns:w16sdtdh="http://schemas.microsoft.com/office/word/2020/wordml/sdtdatahash" xmlns:w16se="http://schemas.microsoft.com/office/word/2015/wordml/symex" mc:Ignorable="w14 w15 w16se w16cid w16 w16cex w16sdtdh">
   <w:docDefaults>
     <w:rPrDefault>
       <w:rPr>

</xml_diff>